<commit_message>
Actualizar especificación técnica con los datos revisados de Nadia
Reescribe las secciones 1-4 con la hoja de ruta, casos de uso, delimitación ERP y sección crítica tal como los dejó en su última revisión, y convierte la hoja de ruta y los riesgos en tablas visuales por fase.

Co-Authored-By: Claude Sonnet 5 <noreply@anthropic.com>
Claude-Session: https://claude.ai/code/session_012BwrUiCYr6ApYk5hmXyh4o
</commit_message>
<xml_diff>
--- a/docs/especificacion-tecnica.docx
+++ b/docs/especificacion-tecnica.docx
@@ -167,7 +167,7 @@
                 <w:sz w:val="20"/>
                 <w:szCs w:val="20"/>
               </w:rPr>
-              <w:t xml:space="preserve">La lista de la compra se genera sola a partir de lo que hay en tu nevera — sin apuntar nada a mano, y sin la fricción de las apps que ya existen.</w:t>
+              <w:t xml:space="preserve">La lista de la compra se genera sola a partir de una foto del ticket de la compra; a partir de ahí los productos se reponen o se añaden, de forma manual o automática. Sin fricción.</w:t>
             </w:r>
           </w:p>
         </w:tc>
@@ -217,57 +217,655 @@
                 <w:sz w:val="20"/>
                 <w:szCs w:val="20"/>
               </w:rPr>
-              <w:t xml:space="preserve">Lo usa cualquier miembro de un hogar en España. Lo paga el hogar como unidad (no cada persona), de forma opcional. Mercado: 19,7M hogares en España, 13M accesibles (cadenas cuyo ticket lee Larder), 6,1M objetivo (ya compran online).</w:t>
-            </w:r>
-          </w:p>
-        </w:tc>
-      </w:tr>
+              <w:t xml:space="preserve">Quién paga: el hogar (por hogar). Quién lo usa: los miembros del hogar.</w:t>
+            </w:r>
+          </w:p>
+        </w:tc>
+      </w:tr>
+    </w:tbl>
+    <w:p>
+      <w:pPr>
+        <w:spacing w:after="120"/>
+      </w:pPr>
+      <w:r>
+        <w:rPr>
+          <w:color w:val="1F2A1F"/>
+          <w:sz w:val="21"/>
+          <w:szCs w:val="21"/>
+        </w:rPr>
+        <w:t xml:space="preserve"/>
+      </w:r>
+    </w:p>
+    <w:p>
+      <w:pPr>
+        <w:pStyle w:val="Heading2"/>
+        <w:spacing w:after="150" w:before="300"/>
+      </w:pPr>
+      <w:r>
+        <w:t xml:space="preserve">Hoja de ruta</w:t>
+      </w:r>
+    </w:p>
+    <w:tbl>
+      <w:tblPr>
+        <w:tblW w:type="dxa" w:w="9020"/>
+        <w:tblBorders>
+          <w:top w:val="single" w:color="auto" w:sz="4"/>
+          <w:left w:val="single" w:color="auto" w:sz="4"/>
+          <w:bottom w:val="single" w:color="auto" w:sz="4"/>
+          <w:right w:val="single" w:color="auto" w:sz="4"/>
+          <w:insideH w:val="single" w:color="auto" w:sz="4"/>
+          <w:insideV w:val="single" w:color="auto" w:sz="4"/>
+        </w:tblBorders>
+      </w:tblPr>
+      <w:tblGrid>
+        <w:gridCol w:w="2000"/>
+        <w:gridCol w:w="2340"/>
+        <w:gridCol w:w="2340"/>
+        <w:gridCol w:w="2340"/>
+      </w:tblGrid>
+      <w:tr>
+        <w:tc>
+          <w:tcPr>
+            <w:tcW w:type="dxa" w:w="2000"/>
+            <w:shd w:fill="26402C" w:val="clear"/>
+            <w:tcMar>
+              <w:top w:type="dxa" w:w="100"/>
+              <w:left w:type="dxa" w:w="120"/>
+              <w:bottom w:type="dxa" w:w="100"/>
+              <w:right w:type="dxa" w:w="120"/>
+            </w:tcMar>
+            <w:vAlign w:val="top"/>
+          </w:tcPr>
+          <w:p>
+            <w:r>
+              <w:rPr>
+                <w:b/>
+                <w:bCs/>
+                <w:color w:val="FFFFFF"/>
+                <w:sz w:val="20"/>
+                <w:szCs w:val="20"/>
+              </w:rPr>
+              <w:t xml:space="preserve"/>
+            </w:r>
+          </w:p>
+        </w:tc>
+        <w:tc>
+          <w:tcPr>
+            <w:tcW w:type="dxa" w:w="2340"/>
+            <w:shd w:fill="2E7D4F" w:val="clear"/>
+            <w:tcMar>
+              <w:top w:type="dxa" w:w="100"/>
+              <w:left w:type="dxa" w:w="120"/>
+              <w:bottom w:type="dxa" w:w="100"/>
+              <w:right w:type="dxa" w:w="120"/>
+            </w:tcMar>
+            <w:vAlign w:val="top"/>
+          </w:tcPr>
+          <w:p>
+            <w:r>
+              <w:rPr>
+                <w:b/>
+                <w:bCs/>
+                <w:color w:val="FFFFFF"/>
+                <w:sz w:val="20"/>
+                <w:szCs w:val="20"/>
+              </w:rPr>
+              <w:t xml:space="preserve">P1 · 20.11.26</w:t>
+            </w:r>
+          </w:p>
+        </w:tc>
+        <w:tc>
+          <w:tcPr>
+            <w:tcW w:type="dxa" w:w="2340"/>
+            <w:shd w:fill="C6821E" w:val="clear"/>
+            <w:tcMar>
+              <w:top w:type="dxa" w:w="100"/>
+              <w:left w:type="dxa" w:w="120"/>
+              <w:bottom w:type="dxa" w:w="100"/>
+              <w:right w:type="dxa" w:w="120"/>
+            </w:tcMar>
+            <w:vAlign w:val="top"/>
+          </w:tcPr>
+          <w:p>
+            <w:r>
+              <w:rPr>
+                <w:b/>
+                <w:bCs/>
+                <w:color w:val="FFFFFF"/>
+                <w:sz w:val="20"/>
+                <w:szCs w:val="20"/>
+              </w:rPr>
+              <w:t xml:space="preserve">P2 · 22.1.27</w:t>
+            </w:r>
+          </w:p>
+        </w:tc>
+        <w:tc>
+          <w:tcPr>
+            <w:tcW w:type="dxa" w:w="2340"/>
+            <w:shd w:fill="1D4E89" w:val="clear"/>
+            <w:tcMar>
+              <w:top w:type="dxa" w:w="100"/>
+              <w:left w:type="dxa" w:w="120"/>
+              <w:bottom w:type="dxa" w:w="100"/>
+              <w:right w:type="dxa" w:w="120"/>
+            </w:tcMar>
+            <w:vAlign w:val="top"/>
+          </w:tcPr>
+          <w:p>
+            <w:r>
+              <w:rPr>
+                <w:b/>
+                <w:bCs/>
+                <w:color w:val="FFFFFF"/>
+                <w:sz w:val="20"/>
+                <w:szCs w:val="20"/>
+              </w:rPr>
+              <w:t xml:space="preserve">P3 · 26.2.27</w:t>
+            </w:r>
+          </w:p>
+        </w:tc>
+      </w:tr>
+      <w:tr>
+        <w:tc>
+          <w:tcPr>
+            <w:tcW w:type="dxa" w:w="2000"/>
+            <w:tcMar>
+              <w:top w:type="dxa" w:w="100"/>
+              <w:left w:type="dxa" w:w="120"/>
+              <w:bottom w:type="dxa" w:w="100"/>
+              <w:right w:type="dxa" w:w="120"/>
+            </w:tcMar>
+            <w:vAlign w:val="top"/>
+          </w:tcPr>
+          <w:p>
+            <w:r>
+              <w:rPr>
+                <w:b/>
+                <w:bCs/>
+                <w:color w:val="1F2A1F"/>
+                <w:sz w:val="20"/>
+                <w:szCs w:val="20"/>
+              </w:rPr>
+              <w:t xml:space="preserve">Qué se lanza</w:t>
+            </w:r>
+          </w:p>
+        </w:tc>
+        <w:tc>
+          <w:tcPr>
+            <w:tcW w:type="dxa" w:w="2340"/>
+            <w:tcMar>
+              <w:top w:type="dxa" w:w="100"/>
+              <w:left w:type="dxa" w:w="120"/>
+              <w:bottom w:type="dxa" w:w="100"/>
+              <w:right w:type="dxa" w:w="120"/>
+            </w:tcMar>
+            <w:vAlign w:val="top"/>
+          </w:tcPr>
+          <w:p>
+            <w:r>
+              <w:rPr>
+                <w:b w:val="false"/>
+                <w:bCs w:val="false"/>
+                <w:color w:val="1F2A1F"/>
+                <w:sz w:val="20"/>
+                <w:szCs w:val="20"/>
+              </w:rPr>
+              <w:t xml:space="preserve">Larder + Backend + List, en React. Gratis.</w:t>
+            </w:r>
+          </w:p>
+        </w:tc>
+        <w:tc>
+          <w:tcPr>
+            <w:tcW w:type="dxa" w:w="2340"/>
+            <w:tcMar>
+              <w:top w:type="dxa" w:w="100"/>
+              <w:left w:type="dxa" w:w="120"/>
+              <w:bottom w:type="dxa" w:w="100"/>
+              <w:right w:type="dxa" w:w="120"/>
+            </w:tcMar>
+            <w:vAlign w:val="top"/>
+          </w:tcPr>
+          <w:p>
+            <w:r>
+              <w:rPr>
+                <w:b w:val="false"/>
+                <w:bCs w:val="false"/>
+                <w:color w:val="1F2A1F"/>
+                <w:sz w:val="20"/>
+                <w:szCs w:val="20"/>
+              </w:rPr>
+              <w:t xml:space="preserve">Track (módulo a medida sobre Odoo) + pantalla en React Native. Empieza el cobro (14,99€/año).</w:t>
+            </w:r>
+          </w:p>
+        </w:tc>
+        <w:tc>
+          <w:tcPr>
+            <w:tcW w:type="dxa" w:w="2340"/>
+            <w:tcMar>
+              <w:top w:type="dxa" w:w="100"/>
+              <w:left w:type="dxa" w:w="120"/>
+              <w:bottom w:type="dxa" w:w="100"/>
+              <w:right w:type="dxa" w:w="120"/>
+            </w:tcMar>
+            <w:vAlign w:val="top"/>
+          </w:tcPr>
+          <w:p>
+            <w:r>
+              <w:rPr>
+                <w:b w:val="false"/>
+                <w:bCs w:val="false"/>
+                <w:color w:val="1F2A1F"/>
+                <w:sz w:val="20"/>
+                <w:szCs w:val="20"/>
+              </w:rPr>
+              <w:t xml:space="preserve">Compare + comisión por afiliación con supermercados.</w:t>
+            </w:r>
+          </w:p>
+        </w:tc>
+      </w:tr>
+      <w:tr>
+        <w:tc>
+          <w:tcPr>
+            <w:tcW w:type="dxa" w:w="2000"/>
+            <w:tcMar>
+              <w:top w:type="dxa" w:w="100"/>
+              <w:left w:type="dxa" w:w="120"/>
+              <w:bottom w:type="dxa" w:w="100"/>
+              <w:right w:type="dxa" w:w="120"/>
+            </w:tcMar>
+            <w:vAlign w:val="top"/>
+          </w:tcPr>
+          <w:p>
+            <w:r>
+              <w:rPr>
+                <w:b/>
+                <w:bCs/>
+                <w:color w:val="1F2A1F"/>
+                <w:sz w:val="20"/>
+                <w:szCs w:val="20"/>
+              </w:rPr>
+              <w:t xml:space="preserve">Horas</w:t>
+            </w:r>
+          </w:p>
+        </w:tc>
+        <w:tc>
+          <w:tcPr>
+            <w:tcW w:type="dxa" w:w="2340"/>
+            <w:tcMar>
+              <w:top w:type="dxa" w:w="100"/>
+              <w:left w:type="dxa" w:w="120"/>
+              <w:bottom w:type="dxa" w:w="100"/>
+              <w:right w:type="dxa" w:w="120"/>
+            </w:tcMar>
+            <w:vAlign w:val="top"/>
+          </w:tcPr>
+          <w:p>
+            <w:r>
+              <w:rPr>
+                <w:b w:val="false"/>
+                <w:bCs w:val="false"/>
+                <w:color w:val="1F2A1F"/>
+                <w:sz w:val="20"/>
+                <w:szCs w:val="20"/>
+              </w:rPr>
+              <w:t xml:space="preserve">Larder — 17h</w:t>
+            </w:r>
+          </w:p>
+          <w:p>
+            <w:r>
+              <w:rPr>
+                <w:b w:val="false"/>
+                <w:bCs w:val="false"/>
+                <w:color w:val="1F2A1F"/>
+                <w:sz w:val="20"/>
+                <w:szCs w:val="20"/>
+              </w:rPr>
+              <w:t xml:space="preserve">Backend — 10h</w:t>
+            </w:r>
+          </w:p>
+          <w:p>
+            <w:r>
+              <w:rPr>
+                <w:b w:val="false"/>
+                <w:bCs w:val="false"/>
+                <w:color w:val="1F2A1F"/>
+                <w:sz w:val="20"/>
+                <w:szCs w:val="20"/>
+              </w:rPr>
+              <w:t xml:space="preserve">List — 30h</w:t>
+            </w:r>
+          </w:p>
+        </w:tc>
+        <w:tc>
+          <w:tcPr>
+            <w:tcW w:type="dxa" w:w="2340"/>
+            <w:tcMar>
+              <w:top w:type="dxa" w:w="100"/>
+              <w:left w:type="dxa" w:w="120"/>
+              <w:bottom w:type="dxa" w:w="100"/>
+              <w:right w:type="dxa" w:w="120"/>
+            </w:tcMar>
+            <w:vAlign w:val="top"/>
+          </w:tcPr>
+          <w:p>
+            <w:r>
+              <w:rPr>
+                <w:b w:val="false"/>
+                <w:bCs w:val="false"/>
+                <w:color w:val="1F2A1F"/>
+                <w:sz w:val="20"/>
+                <w:szCs w:val="20"/>
+              </w:rPr>
+              <w:t xml:space="preserve">Track — 20h</w:t>
+            </w:r>
+          </w:p>
+          <w:p>
+            <w:r>
+              <w:rPr>
+                <w:b w:val="false"/>
+                <w:bCs w:val="false"/>
+                <w:color w:val="1F2A1F"/>
+                <w:sz w:val="20"/>
+                <w:szCs w:val="20"/>
+              </w:rPr>
+              <w:t xml:space="preserve">React Native — 10h</w:t>
+            </w:r>
+          </w:p>
+        </w:tc>
+        <w:tc>
+          <w:tcPr>
+            <w:tcW w:type="dxa" w:w="2340"/>
+            <w:tcMar>
+              <w:top w:type="dxa" w:w="100"/>
+              <w:left w:type="dxa" w:w="120"/>
+              <w:bottom w:type="dxa" w:w="100"/>
+              <w:right w:type="dxa" w:w="120"/>
+            </w:tcMar>
+            <w:vAlign w:val="top"/>
+          </w:tcPr>
+          <w:p>
+            <w:r>
+              <w:rPr>
+                <w:b w:val="false"/>
+                <w:bCs w:val="false"/>
+                <w:color w:val="1F2A1F"/>
+                <w:sz w:val="20"/>
+                <w:szCs w:val="20"/>
+              </w:rPr>
+              <w:t xml:space="preserve">Compare — 13h</w:t>
+            </w:r>
+          </w:p>
+          <w:p>
+            <w:r>
+              <w:rPr>
+                <w:b w:val="false"/>
+                <w:bCs w:val="false"/>
+                <w:color w:val="1F2A1F"/>
+                <w:sz w:val="20"/>
+                <w:szCs w:val="20"/>
+              </w:rPr>
+              <w:t xml:space="preserve">Comisión — 10h (?)</w:t>
+            </w:r>
+          </w:p>
+        </w:tc>
+      </w:tr>
+      <w:tr>
+        <w:tc>
+          <w:tcPr>
+            <w:tcW w:type="dxa" w:w="2000"/>
+            <w:tcMar>
+              <w:top w:type="dxa" w:w="100"/>
+              <w:left w:type="dxa" w:w="120"/>
+              <w:bottom w:type="dxa" w:w="100"/>
+              <w:right w:type="dxa" w:w="120"/>
+            </w:tcMar>
+            <w:vAlign w:val="top"/>
+          </w:tcPr>
+          <w:p>
+            <w:r>
+              <w:rPr>
+                <w:b/>
+                <w:bCs/>
+                <w:color w:val="1F2A1F"/>
+                <w:sz w:val="20"/>
+                <w:szCs w:val="20"/>
+              </w:rPr>
+              <w:t xml:space="preserve">Criterio de salida</w:t>
+            </w:r>
+          </w:p>
+        </w:tc>
+        <w:tc>
+          <w:tcPr>
+            <w:tcW w:type="dxa" w:w="2340"/>
+            <w:tcMar>
+              <w:top w:type="dxa" w:w="100"/>
+              <w:left w:type="dxa" w:w="120"/>
+              <w:bottom w:type="dxa" w:w="100"/>
+              <w:right w:type="dxa" w:w="120"/>
+            </w:tcMar>
+            <w:vAlign w:val="top"/>
+          </w:tcPr>
+          <w:p>
+            <w:r>
+              <w:rPr>
+                <w:b w:val="false"/>
+                <w:bCs w:val="false"/>
+                <w:color w:val="1F2A1F"/>
+                <w:sz w:val="20"/>
+                <w:szCs w:val="20"/>
+              </w:rPr>
+              <w:t xml:space="preserve">Items se loggean correctamente</w:t>
+            </w:r>
+          </w:p>
+          <w:p>
+            <w:r>
+              <w:rPr>
+                <w:b w:val="false"/>
+                <w:bCs w:val="false"/>
+                <w:color w:val="1F2A1F"/>
+                <w:sz w:val="20"/>
+                <w:szCs w:val="20"/>
+              </w:rPr>
+              <w:t xml:space="preserve">API calls correctas</w:t>
+            </w:r>
+          </w:p>
+          <w:p>
+            <w:r>
+              <w:rPr>
+                <w:b w:val="false"/>
+                <w:bCs w:val="false"/>
+                <w:color w:val="1F2A1F"/>
+                <w:sz w:val="20"/>
+                <w:szCs w:val="20"/>
+              </w:rPr>
+              <w:t xml:space="preserve">Reconocimiento de ticket</w:t>
+            </w:r>
+          </w:p>
+          <w:p>
+            <w:r>
+              <w:rPr>
+                <w:b w:val="false"/>
+                <w:bCs w:val="false"/>
+                <w:color w:val="1F2A1F"/>
+                <w:sz w:val="20"/>
+                <w:szCs w:val="20"/>
+              </w:rPr>
+              <w:t xml:space="preserve">Automatización Lista ↔ Larder</w:t>
+            </w:r>
+          </w:p>
+        </w:tc>
+        <w:tc>
+          <w:tcPr>
+            <w:tcW w:type="dxa" w:w="2340"/>
+            <w:tcMar>
+              <w:top w:type="dxa" w:w="100"/>
+              <w:left w:type="dxa" w:w="120"/>
+              <w:bottom w:type="dxa" w:w="100"/>
+              <w:right w:type="dxa" w:w="120"/>
+            </w:tcMar>
+            <w:vAlign w:val="top"/>
+          </w:tcPr>
+          <w:p>
+            <w:r>
+              <w:rPr>
+                <w:b w:val="false"/>
+                <w:bCs w:val="false"/>
+                <w:color w:val="1F2A1F"/>
+                <w:sz w:val="20"/>
+                <w:szCs w:val="20"/>
+              </w:rPr>
+              <w:t xml:space="preserve">Cálculo correcto de deudas entre usuarios</w:t>
+            </w:r>
+          </w:p>
+          <w:p>
+            <w:r>
+              <w:rPr>
+                <w:b w:val="false"/>
+                <w:bCs w:val="false"/>
+                <w:color w:val="1F2A1F"/>
+                <w:sz w:val="20"/>
+                <w:szCs w:val="20"/>
+              </w:rPr>
+              <w:t xml:space="preserve">Lectura correcta de items comprados</w:t>
+            </w:r>
+          </w:p>
+          <w:p>
+            <w:r>
+              <w:rPr>
+                <w:b w:val="false"/>
+                <w:bCs w:val="false"/>
+                <w:color w:val="1F2A1F"/>
+                <w:sz w:val="20"/>
+                <w:szCs w:val="20"/>
+              </w:rPr>
+              <w:t xml:space="preserve">Export exitoso de app móvil</w:t>
+            </w:r>
+          </w:p>
+        </w:tc>
+        <w:tc>
+          <w:tcPr>
+            <w:tcW w:type="dxa" w:w="2340"/>
+            <w:tcMar>
+              <w:top w:type="dxa" w:w="100"/>
+              <w:left w:type="dxa" w:w="120"/>
+              <w:bottom w:type="dxa" w:w="100"/>
+              <w:right w:type="dxa" w:w="120"/>
+            </w:tcMar>
+            <w:vAlign w:val="top"/>
+          </w:tcPr>
+          <w:p>
+            <w:r>
+              <w:rPr>
+                <w:b w:val="false"/>
+                <w:bCs w:val="false"/>
+                <w:color w:val="1F2A1F"/>
+                <w:sz w:val="20"/>
+                <w:szCs w:val="20"/>
+              </w:rPr>
+              <w:t xml:space="preserve">Log correcto de tiendas</w:t>
+            </w:r>
+          </w:p>
+          <w:p>
+            <w:r>
+              <w:rPr>
+                <w:b w:val="false"/>
+                <w:bCs w:val="false"/>
+                <w:color w:val="1F2A1F"/>
+                <w:sz w:val="20"/>
+                <w:szCs w:val="20"/>
+              </w:rPr>
+              <w:t xml:space="preserve">Comparación correcta de precios</w:t>
+            </w:r>
+          </w:p>
+        </w:tc>
+      </w:tr>
+    </w:tbl>
+    <w:p>
+      <w:pPr>
+        <w:spacing w:after="120"/>
+      </w:pPr>
+      <w:r>
+        <w:rPr>
+          <w:color w:val="1F2A1F"/>
+          <w:sz w:val="21"/>
+          <w:szCs w:val="21"/>
+        </w:rPr>
+        <w:t xml:space="preserve"/>
+      </w:r>
+    </w:p>
+    <w:p>
+      <w:pPr>
+        <w:pStyle w:val="Heading2"/>
+        <w:spacing w:after="150" w:before="300"/>
+      </w:pPr>
+      <w:r>
+        <w:t xml:space="preserve">Inversión</w:t>
+      </w:r>
+    </w:p>
+    <w:tbl>
+      <w:tblPr>
+        <w:tblW w:type="dxa" w:w="9020"/>
+        <w:tblBorders>
+          <w:top w:val="single" w:color="auto" w:sz="4"/>
+          <w:left w:val="single" w:color="auto" w:sz="4"/>
+          <w:bottom w:val="single" w:color="auto" w:sz="4"/>
+          <w:right w:val="single" w:color="auto" w:sz="4"/>
+          <w:insideH w:val="single" w:color="auto" w:sz="4"/>
+          <w:insideV w:val="single" w:color="auto" w:sz="4"/>
+        </w:tblBorders>
+      </w:tblPr>
+      <w:tblGrid>
+        <w:gridCol w:w="2400"/>
+        <w:gridCol w:w="6620"/>
+      </w:tblGrid>
       <w:tr>
         <w:tc>
           <w:tcPr>
             <w:tcW w:type="dxa" w:w="2400"/>
-            <w:tcMar>
-              <w:top w:type="dxa" w:w="100"/>
-              <w:left w:type="dxa" w:w="120"/>
-              <w:bottom w:type="dxa" w:w="100"/>
-              <w:right w:type="dxa" w:w="120"/>
-            </w:tcMar>
-            <w:vAlign w:val="top"/>
-          </w:tcPr>
-          <w:p>
-            <w:r>
-              <w:rPr>
-                <w:b/>
-                <w:bCs/>
-                <w:color w:val="1F2A1F"/>
-                <w:sz w:val="20"/>
-                <w:szCs w:val="20"/>
-              </w:rPr>
-              <w:t xml:space="preserve">Hoja de ruta</w:t>
+            <w:shd w:fill="26402C" w:val="clear"/>
+            <w:tcMar>
+              <w:top w:type="dxa" w:w="100"/>
+              <w:left w:type="dxa" w:w="120"/>
+              <w:bottom w:type="dxa" w:w="100"/>
+              <w:right w:type="dxa" w:w="120"/>
+            </w:tcMar>
+            <w:vAlign w:val="top"/>
+          </w:tcPr>
+          <w:p>
+            <w:r>
+              <w:rPr>
+                <w:b/>
+                <w:bCs/>
+                <w:color w:val="FFFFFF"/>
+                <w:sz w:val="20"/>
+                <w:szCs w:val="20"/>
+              </w:rPr>
+              <w:t xml:space="preserve">Apartado</w:t>
             </w:r>
           </w:p>
         </w:tc>
         <w:tc>
           <w:tcPr>
             <w:tcW w:type="dxa" w:w="6620"/>
-            <w:tcMar>
-              <w:top w:type="dxa" w:w="100"/>
-              <w:left w:type="dxa" w:w="120"/>
-              <w:bottom w:type="dxa" w:w="100"/>
-              <w:right w:type="dxa" w:w="120"/>
-            </w:tcMar>
-            <w:vAlign w:val="top"/>
-          </w:tcPr>
-          <w:p>
-            <w:r>
-              <w:rPr>
-                <w:b w:val="false"/>
-                <w:bCs w:val="false"/>
-                <w:color w:val="1F2A1F"/>
-                <w:sz w:val="20"/>
-                <w:szCs w:val="20"/>
-              </w:rPr>
-              <w:t xml:space="preserve">P1 · 20 nov: Larder + Backend + List, en React. Gratis. P2 · 22 ene: Track (módulo a medida sobre Odoo) + pantalla en React Native. Empieza el cobro (14,99€/año). P3 · 26 feb: Compare + comisión por afiliación con supermercados.</w:t>
+            <w:shd w:fill="26402C" w:val="clear"/>
+            <w:tcMar>
+              <w:top w:type="dxa" w:w="100"/>
+              <w:left w:type="dxa" w:w="120"/>
+              <w:bottom w:type="dxa" w:w="100"/>
+              <w:right w:type="dxa" w:w="120"/>
+            </w:tcMar>
+            <w:vAlign w:val="top"/>
+          </w:tcPr>
+          <w:p>
+            <w:r>
+              <w:rPr>
+                <w:b/>
+                <w:bCs/>
+                <w:color w:val="FFFFFF"/>
+                <w:sz w:val="20"/>
+                <w:szCs w:val="20"/>
+              </w:rPr>
+              <w:t xml:space="preserve">Contenido</w:t>
             </w:r>
           </w:p>
         </w:tc>
@@ -293,7 +891,7 @@
                 <w:sz w:val="20"/>
                 <w:szCs w:val="20"/>
               </w:rPr>
-              <w:t xml:space="preserve">Inversión en tiempo</w:t>
+              <w:t xml:space="preserve">En dinero</w:t>
             </w:r>
           </w:p>
         </w:tc>
@@ -317,7 +915,7 @@
                 <w:sz w:val="20"/>
                 <w:szCs w:val="20"/>
               </w:rPr>
-              <w:t xml:space="preserve">110h totales. P1 (57h): Larder ~15h · Backend ~20h · List con concurrencia ~22h. P2 (30h): Track ~15h · pantalla React Native ~15h. P3 (23h): Compare ~13h · Afiliación ~10h.</w:t>
+              <w:t xml:space="preserve">Dominio: 10€ · Google Play: 25€ · IA / servidores: según demanda.</w:t>
             </w:r>
           </w:p>
         </w:tc>
@@ -343,7 +941,7 @@
                 <w:sz w:val="20"/>
                 <w:szCs w:val="20"/>
               </w:rPr>
-              <w:t xml:space="preserve">Inversión en dinero</w:t>
+              <w:t xml:space="preserve">Cómo se gana dinero</w:t>
             </w:r>
           </w:p>
         </w:tc>
@@ -367,157 +965,248 @@
                 <w:sz w:val="20"/>
                 <w:szCs w:val="20"/>
               </w:rPr>
-              <w:t xml:space="preserve">Dominio .es: 14,95€/año. Cuenta de desarrollador Google Play: 25$ pago único (solo Android, no hace falta cuenta Apple). Alojamiento y servicios (Render, Supabase, Groq, Odoo self-hosted): 0€ mientras se mantengan en niveles gratuitos.</w:t>
-            </w:r>
-          </w:p>
-        </w:tc>
-      </w:tr>
-      <w:tr>
-        <w:tc>
-          <w:tcPr>
-            <w:tcW w:type="dxa" w:w="2400"/>
-            <w:tcMar>
-              <w:top w:type="dxa" w:w="100"/>
-              <w:left w:type="dxa" w:w="120"/>
-              <w:bottom w:type="dxa" w:w="100"/>
-              <w:right w:type="dxa" w:w="120"/>
-            </w:tcMar>
-            <w:vAlign w:val="top"/>
-          </w:tcPr>
-          <w:p>
-            <w:r>
-              <w:rPr>
-                <w:b/>
-                <w:bCs/>
-                <w:color w:val="1F2A1F"/>
-                <w:sz w:val="20"/>
-                <w:szCs w:val="20"/>
-              </w:rPr>
-              <w:t xml:space="preserve">Criterio de salida</w:t>
-            </w:r>
-          </w:p>
-        </w:tc>
-        <w:tc>
-          <w:tcPr>
-            <w:tcW w:type="dxa" w:w="6620"/>
-            <w:tcMar>
-              <w:top w:type="dxa" w:w="100"/>
-              <w:left w:type="dxa" w:w="120"/>
-              <w:bottom w:type="dxa" w:w="100"/>
-              <w:right w:type="dxa" w:w="120"/>
-            </w:tcMar>
-            <w:vAlign w:val="top"/>
-          </w:tcPr>
-          <w:p>
-            <w:r>
-              <w:rPr>
-                <w:b w:val="false"/>
-                <w:bCs w:val="false"/>
-                <w:color w:val="1F2A1F"/>
-                <w:sz w:val="20"/>
-                <w:szCs w:val="20"/>
-              </w:rPr>
-              <w:t xml:space="preserve">Los dos casos de uso funcionan de principio a fin (pantalla → dato → Odoo cuando aplica), con los 3 estados de pantalla (cargando/vacía/error), concurrencia probada con dos usuarios reales sin duplicar ni perder datos, desplegado en una URL pública.</w:t>
-            </w:r>
-          </w:p>
-        </w:tc>
-      </w:tr>
-      <w:tr>
-        <w:tc>
-          <w:tcPr>
-            <w:tcW w:type="dxa" w:w="2400"/>
-            <w:tcMar>
-              <w:top w:type="dxa" w:w="100"/>
-              <w:left w:type="dxa" w:w="120"/>
-              <w:bottom w:type="dxa" w:w="100"/>
-              <w:right w:type="dxa" w:w="120"/>
-            </w:tcMar>
-            <w:vAlign w:val="top"/>
-          </w:tcPr>
-          <w:p>
-            <w:r>
-              <w:rPr>
-                <w:b/>
-                <w:bCs/>
-                <w:color w:val="1F2A1F"/>
-                <w:sz w:val="20"/>
-                <w:szCs w:val="20"/>
-              </w:rPr>
-              <w:t xml:space="preserve">Cómo se gana dinero</w:t>
-            </w:r>
-          </w:p>
-        </w:tc>
-        <w:tc>
-          <w:tcPr>
-            <w:tcW w:type="dxa" w:w="6620"/>
-            <w:tcMar>
-              <w:top w:type="dxa" w:w="100"/>
-              <w:left w:type="dxa" w:w="120"/>
-              <w:bottom w:type="dxa" w:w="100"/>
-              <w:right w:type="dxa" w:w="120"/>
-            </w:tcMar>
-            <w:vAlign w:val="top"/>
-          </w:tcPr>
-          <w:p>
-            <w:r>
-              <w:rPr>
-                <w:b w:val="false"/>
-                <w:bCs w:val="false"/>
-                <w:color w:val="1F2A1F"/>
-                <w:sz w:val="20"/>
-                <w:szCs w:val="20"/>
-              </w:rPr>
-              <w:t xml:space="preserve">Freemium: Larder + List gratis siempre. 14,99€/año por hogar desde P2 (Track). Comisión de afiliación con supermercados desde P3.</w:t>
-            </w:r>
-          </w:p>
-        </w:tc>
-      </w:tr>
-      <w:tr>
-        <w:tc>
-          <w:tcPr>
-            <w:tcW w:type="dxa" w:w="2400"/>
-            <w:tcMar>
-              <w:top w:type="dxa" w:w="100"/>
-              <w:left w:type="dxa" w:w="120"/>
-              <w:bottom w:type="dxa" w:w="100"/>
-              <w:right w:type="dxa" w:w="120"/>
-            </w:tcMar>
-            <w:vAlign w:val="top"/>
-          </w:tcPr>
-          <w:p>
-            <w:r>
-              <w:rPr>
-                <w:b/>
-                <w:bCs/>
-                <w:color w:val="1F2A1F"/>
-                <w:sz w:val="20"/>
-                <w:szCs w:val="20"/>
-              </w:rPr>
-              <w:t xml:space="preserve">Riesgos</w:t>
-            </w:r>
-          </w:p>
-        </w:tc>
-        <w:tc>
-          <w:tcPr>
-            <w:tcW w:type="dxa" w:w="6620"/>
-            <w:tcMar>
-              <w:top w:type="dxa" w:w="100"/>
-              <w:left w:type="dxa" w:w="120"/>
-              <w:bottom w:type="dxa" w:w="100"/>
-              <w:right w:type="dxa" w:w="120"/>
-            </w:tcMar>
-            <w:vAlign w:val="top"/>
-          </w:tcPr>
-          <w:p>
-            <w:r>
-              <w:rPr>
-                <w:b w:val="false"/>
-                <w:bCs w:val="false"/>
-                <w:color w:val="1F2A1F"/>
-                <w:sz w:val="20"/>
-                <w:szCs w:val="20"/>
-              </w:rPr>
-              <w:t xml:space="preserve">1) Cada supermercado imprime su ticket distinto → empezar solo con 2-3 cadenas (Mercadona, Lidl, Carrefour). 2) Los niveles gratuitos (Groq, Render, Supabase) pueden cambiar sus límites → vigilar uso, tener alternativa de respaldo. 3) Que el hogar de prueba abandone tras la novedad (como pasó con Bring! en la encuesta) → medir uso real semana a semana.</w:t>
+              <w:t xml:space="preserve">Freemium: con plataformas como Stripe se implementa una subscripción para desbloquear funciones con IA (14,99€/año).</w:t>
+            </w:r>
+          </w:p>
+        </w:tc>
+      </w:tr>
+    </w:tbl>
+    <w:p>
+      <w:pPr>
+        <w:spacing w:after="120"/>
+      </w:pPr>
+      <w:r>
+        <w:rPr>
+          <w:color w:val="1F2A1F"/>
+          <w:sz w:val="21"/>
+          <w:szCs w:val="21"/>
+        </w:rPr>
+        <w:t xml:space="preserve"/>
+      </w:r>
+    </w:p>
+    <w:p>
+      <w:pPr>
+        <w:pStyle w:val="Heading2"/>
+        <w:spacing w:after="150" w:before="300"/>
+      </w:pPr>
+      <w:r>
+        <w:t xml:space="preserve">Riesgos</w:t>
+      </w:r>
+    </w:p>
+    <w:tbl>
+      <w:tblPr>
+        <w:tblW w:type="dxa" w:w="9020"/>
+        <w:tblBorders>
+          <w:top w:val="single" w:color="auto" w:sz="4"/>
+          <w:left w:val="single" w:color="auto" w:sz="4"/>
+          <w:bottom w:val="single" w:color="auto" w:sz="4"/>
+          <w:right w:val="single" w:color="auto" w:sz="4"/>
+          <w:insideH w:val="single" w:color="auto" w:sz="4"/>
+          <w:insideV w:val="single" w:color="auto" w:sz="4"/>
+        </w:tblBorders>
+      </w:tblPr>
+      <w:tblGrid>
+        <w:gridCol w:w="4510"/>
+        <w:gridCol w:w="4510"/>
+      </w:tblGrid>
+      <w:tr>
+        <w:tc>
+          <w:tcPr>
+            <w:tcW w:type="dxa" w:w="4510"/>
+            <w:shd w:fill="26402C" w:val="clear"/>
+            <w:tcMar>
+              <w:top w:type="dxa" w:w="100"/>
+              <w:left w:type="dxa" w:w="120"/>
+              <w:bottom w:type="dxa" w:w="100"/>
+              <w:right w:type="dxa" w:w="120"/>
+            </w:tcMar>
+            <w:vAlign w:val="top"/>
+          </w:tcPr>
+          <w:p>
+            <w:r>
+              <w:rPr>
+                <w:b/>
+                <w:bCs/>
+                <w:color w:val="FFFFFF"/>
+                <w:sz w:val="20"/>
+                <w:szCs w:val="20"/>
+              </w:rPr>
+              <w:t xml:space="preserve">Riesgo</w:t>
+            </w:r>
+          </w:p>
+        </w:tc>
+        <w:tc>
+          <w:tcPr>
+            <w:tcW w:type="dxa" w:w="4510"/>
+            <w:shd w:fill="26402C" w:val="clear"/>
+            <w:tcMar>
+              <w:top w:type="dxa" w:w="100"/>
+              <w:left w:type="dxa" w:w="120"/>
+              <w:bottom w:type="dxa" w:w="100"/>
+              <w:right w:type="dxa" w:w="120"/>
+            </w:tcMar>
+            <w:vAlign w:val="top"/>
+          </w:tcPr>
+          <w:p>
+            <w:r>
+              <w:rPr>
+                <w:b/>
+                <w:bCs/>
+                <w:color w:val="FFFFFF"/>
+                <w:sz w:val="20"/>
+                <w:szCs w:val="20"/>
+              </w:rPr>
+              <w:t xml:space="preserve">Solución</w:t>
+            </w:r>
+          </w:p>
+        </w:tc>
+      </w:tr>
+      <w:tr>
+        <w:tc>
+          <w:tcPr>
+            <w:tcW w:type="dxa" w:w="4510"/>
+            <w:tcMar>
+              <w:top w:type="dxa" w:w="100"/>
+              <w:left w:type="dxa" w:w="120"/>
+              <w:bottom w:type="dxa" w:w="100"/>
+              <w:right w:type="dxa" w:w="120"/>
+            </w:tcMar>
+            <w:vAlign w:val="top"/>
+          </w:tcPr>
+          <w:p>
+            <w:r>
+              <w:rPr>
+                <w:b w:val="false"/>
+                <w:bCs w:val="false"/>
+                <w:color w:val="1F2A1F"/>
+                <w:sz w:val="20"/>
+                <w:szCs w:val="20"/>
+              </w:rPr>
+              <w:t xml:space="preserve">Colaboración</w:t>
+            </w:r>
+          </w:p>
+        </w:tc>
+        <w:tc>
+          <w:tcPr>
+            <w:tcW w:type="dxa" w:w="4510"/>
+            <w:tcMar>
+              <w:top w:type="dxa" w:w="100"/>
+              <w:left w:type="dxa" w:w="120"/>
+              <w:bottom w:type="dxa" w:w="100"/>
+              <w:right w:type="dxa" w:w="120"/>
+            </w:tcMar>
+            <w:vAlign w:val="top"/>
+          </w:tcPr>
+          <w:p>
+            <w:r>
+              <w:rPr>
+                <w:b w:val="false"/>
+                <w:bCs w:val="false"/>
+                <w:color w:val="1F2A1F"/>
+                <w:sz w:val="20"/>
+                <w:szCs w:val="20"/>
+              </w:rPr>
+              <w:t xml:space="preserve">Pruebas exhaustivas.</w:t>
+            </w:r>
+          </w:p>
+        </w:tc>
+      </w:tr>
+      <w:tr>
+        <w:tc>
+          <w:tcPr>
+            <w:tcW w:type="dxa" w:w="4510"/>
+            <w:tcMar>
+              <w:top w:type="dxa" w:w="100"/>
+              <w:left w:type="dxa" w:w="120"/>
+              <w:bottom w:type="dxa" w:w="100"/>
+              <w:right w:type="dxa" w:w="120"/>
+            </w:tcMar>
+            <w:vAlign w:val="top"/>
+          </w:tcPr>
+          <w:p>
+            <w:r>
+              <w:rPr>
+                <w:b w:val="false"/>
+                <w:bCs w:val="false"/>
+                <w:color w:val="1F2A1F"/>
+                <w:sz w:val="20"/>
+                <w:szCs w:val="20"/>
+              </w:rPr>
+              <w:t xml:space="preserve">Reconocimiento ticket – tienda</w:t>
+            </w:r>
+          </w:p>
+        </w:tc>
+        <w:tc>
+          <w:tcPr>
+            <w:tcW w:type="dxa" w:w="4510"/>
+            <w:tcMar>
+              <w:top w:type="dxa" w:w="100"/>
+              <w:left w:type="dxa" w:w="120"/>
+              <w:bottom w:type="dxa" w:w="100"/>
+              <w:right w:type="dxa" w:w="120"/>
+            </w:tcMar>
+            <w:vAlign w:val="top"/>
+          </w:tcPr>
+          <w:p>
+            <w:r>
+              <w:rPr>
+                <w:b w:val="false"/>
+                <w:bCs w:val="false"/>
+                <w:color w:val="1F2A1F"/>
+                <w:sz w:val="20"/>
+                <w:szCs w:val="20"/>
+              </w:rPr>
+              <w:t xml:space="preserve">Tener varias opciones en cuenta.</w:t>
+            </w:r>
+          </w:p>
+        </w:tc>
+      </w:tr>
+      <w:tr>
+        <w:tc>
+          <w:tcPr>
+            <w:tcW w:type="dxa" w:w="4510"/>
+            <w:tcMar>
+              <w:top w:type="dxa" w:w="100"/>
+              <w:left w:type="dxa" w:w="120"/>
+              <w:bottom w:type="dxa" w:w="100"/>
+              <w:right w:type="dxa" w:w="120"/>
+            </w:tcMar>
+            <w:vAlign w:val="top"/>
+          </w:tcPr>
+          <w:p>
+            <w:r>
+              <w:rPr>
+                <w:b w:val="false"/>
+                <w:bCs w:val="false"/>
+                <w:color w:val="1F2A1F"/>
+                <w:sz w:val="20"/>
+                <w:szCs w:val="20"/>
+              </w:rPr>
+              <w:t xml:space="preserve">Demasiadas funciones</w:t>
+            </w:r>
+          </w:p>
+        </w:tc>
+        <w:tc>
+          <w:tcPr>
+            <w:tcW w:type="dxa" w:w="4510"/>
+            <w:tcMar>
+              <w:top w:type="dxa" w:w="100"/>
+              <w:left w:type="dxa" w:w="120"/>
+              <w:bottom w:type="dxa" w:w="100"/>
+              <w:right w:type="dxa" w:w="120"/>
+            </w:tcMar>
+            <w:vAlign w:val="top"/>
+          </w:tcPr>
+          <w:p>
+            <w:r>
+              <w:rPr>
+                <w:b w:val="false"/>
+                <w:bCs w:val="false"/>
+                <w:color w:val="1F2A1F"/>
+                <w:sz w:val="20"/>
+                <w:szCs w:val="20"/>
+              </w:rPr>
+              <w:t xml:space="preserve">Feedback objetivo.</w:t>
             </w:r>
           </w:p>
         </w:tc>
@@ -529,7 +1218,7 @@
         <w:spacing w:after="200" w:before="400"/>
       </w:pPr>
       <w:r>
-        <w:t xml:space="preserve">2 · Los dos casos de uso de P1</w:t>
+        <w:t xml:space="preserve">2 · Los dos casos de uso</w:t>
       </w:r>
     </w:p>
     <w:p>
@@ -538,7 +1227,7 @@
         <w:spacing w:after="150" w:before="300"/>
       </w:pPr>
       <w:r>
-        <w:t xml:space="preserve">Caso de uso 1 — Marcar un producto en Larder</w:t>
+        <w:t xml:space="preserve">Caso de uso 1 — Marcar un item como "out" en Larder</w:t>
       </w:r>
     </w:p>
     <w:tbl>
@@ -704,7 +1393,43 @@
                 <w:sz w:val="20"/>
                 <w:szCs w:val="20"/>
               </w:rPr>
-              <w:t xml:space="preserve">1) Abre la pantalla Larder. 2) Ve los productos del hogar con su estado (bien / queda poco / se acabó). 3) Toca un producto para cambiar su estado. 4) La app guarda el cambio en el backend. 5) El cambio se refleja al instante para el resto del hogar. 6) Si pasa a "se acabó", se añade solo a List.</w:t>
+              <w:t xml:space="preserve">1. Ver productos con sus estados.</w:t>
+            </w:r>
+          </w:p>
+          <w:p>
+            <w:r>
+              <w:rPr>
+                <w:b w:val="false"/>
+                <w:bCs w:val="false"/>
+                <w:color w:val="1F2A1F"/>
+                <w:sz w:val="20"/>
+                <w:szCs w:val="20"/>
+              </w:rPr>
+              <w:t xml:space="preserve">2. Click en "out".</w:t>
+            </w:r>
+          </w:p>
+          <w:p>
+            <w:r>
+              <w:rPr>
+                <w:b w:val="false"/>
+                <w:bCs w:val="false"/>
+                <w:color w:val="1F2A1F"/>
+                <w:sz w:val="20"/>
+                <w:szCs w:val="20"/>
+              </w:rPr>
+              <w:t xml:space="preserve">3. La app guarda el cambio y lo refleja.</w:t>
+            </w:r>
+          </w:p>
+          <w:p>
+            <w:r>
+              <w:rPr>
+                <w:b w:val="false"/>
+                <w:bCs w:val="false"/>
+                <w:color w:val="1F2A1F"/>
+                <w:sz w:val="20"/>
+                <w:szCs w:val="20"/>
+              </w:rPr>
+              <w:t xml:space="preserve">4. Se añade a la lista de la compra.</w:t>
             </w:r>
           </w:p>
         </w:tc>
@@ -754,7 +1479,7 @@
                 <w:sz w:val="20"/>
                 <w:szCs w:val="20"/>
               </w:rPr>
-              <w:t xml:space="preserve">El estado del producto queda actualizado en la base de datos; si llegó a "se acabó", aparece en List sin que nadie lo escriba.</w:t>
+              <w:t xml:space="preserve">El estado del producto queda actualizado en la base de datos y aparece en la pantalla List sin que nadie lo anote manualmente.</w:t>
             </w:r>
           </w:p>
         </w:tc>
@@ -804,38 +1529,31 @@
                 <w:sz w:val="20"/>
                 <w:szCs w:val="20"/>
               </w:rPr>
-              <w:t xml:space="preserve">Sin conexión al guardar → se muestra el cambio localmente y se reintenta; si falla del todo, se avisa. Dos personas cambian el mismo producto casi a la vez → gana el último cambio confirmado por el servidor, y el otro ve el estado real, no uno viejo.</w:t>
+              <w:t xml:space="preserve">Falta de conexión.</w:t>
+            </w:r>
+          </w:p>
+          <w:p>
+            <w:r>
+              <w:rPr>
+                <w:b w:val="false"/>
+                <w:bCs w:val="false"/>
+                <w:color w:val="1F2A1F"/>
+                <w:sz w:val="20"/>
+                <w:szCs w:val="20"/>
+              </w:rPr>
+              <w:t xml:space="preserve">Dos personas cambian el mismo producto a la vez.</w:t>
             </w:r>
           </w:p>
         </w:tc>
       </w:tr>
     </w:tbl>
-    <w:p>
-      <w:pPr>
-        <w:pBdr>
-          <w:left w:val="single" w:color="C6821E" w:sz="18" w:space="8"/>
-        </w:pBdr>
-        <w:spacing w:after="200" w:before="100"/>
-        <w:ind w:left="200"/>
-      </w:pPr>
-      <w:r>
-        <w:rPr>
-          <w:i/>
-          <w:iCs/>
-          <w:color w:val="5B6559"/>
-          <w:sz w:val="20"/>
-          <w:szCs w:val="20"/>
-        </w:rPr>
-        <w:t xml:space="preserve">No entra en P1: dar de alta productos nuevos a mano, fotos/iconos por producto, historial visible de cambios de estado.</w:t>
-      </w:r>
-    </w:p>
     <w:p>
       <w:pPr>
         <w:pStyle w:val="Heading2"/>
         <w:spacing w:after="150" w:before="300"/>
       </w:pPr>
       <w:r>
-        <w:t xml:space="preserve">Caso de uso 2 — Consultar la lista</w:t>
+        <w:t xml:space="preserve">Caso de uso 2 — Marcar como comprado un item dentro de List</w:t>
       </w:r>
     </w:p>
     <w:tbl>
@@ -1001,7 +1719,19 @@
                 <w:sz w:val="20"/>
                 <w:szCs w:val="20"/>
               </w:rPr>
-              <w:t xml:space="preserve">1) Abre List. 2) Ve lo que está en "queda poco" o "se acabó". 3) Marca un producto como comprado. 4) Eso lo devuelve a Larder en estado "bien". 5) La lista se actualiza en tiempo real para todos. 6) Si no queda nada, ve un estado vacío claro.</w:t>
+              <w:t xml:space="preserve">1. Sacar foto al ticket.</w:t>
+            </w:r>
+          </w:p>
+          <w:p>
+            <w:r>
+              <w:rPr>
+                <w:b w:val="false"/>
+                <w:bCs w:val="false"/>
+                <w:color w:val="1F2A1F"/>
+                <w:sz w:val="20"/>
+                <w:szCs w:val="20"/>
+              </w:rPr>
+              <w:t xml:space="preserve">2. El item se repone automáticamente y se borra de la lista de la compra.</w:t>
             </w:r>
           </w:p>
         </w:tc>
@@ -1051,7 +1781,7 @@
                 <w:sz w:val="20"/>
                 <w:szCs w:val="20"/>
               </w:rPr>
-              <w:t xml:space="preserve">List siempre refleja el estado real de Larder; marcar como comprado actualiza Larder y retira el ítem de la lista.</w:t>
+              <w:t xml:space="preserve">List siempre refleja el estado real de Larder.</w:t>
             </w:r>
           </w:p>
         </w:tc>
@@ -1101,31 +1831,12 @@
                 <w:sz w:val="20"/>
                 <w:szCs w:val="20"/>
               </w:rPr>
-              <w:t xml:space="preserve">Dos personas marcan el mismo producto como comprado a la vez → solo se aplica una vez, la segunda ve que ya estaba hecho, sin duplicar. Se pierde la conexión al marcarlo → la interfaz dice "sincronizando" y no da el cambio por bueno hasta que el servidor confirma.</w:t>
+              <w:t xml:space="preserve">Falta de conexión.</w:t>
             </w:r>
           </w:p>
         </w:tc>
       </w:tr>
     </w:tbl>
-    <w:p>
-      <w:pPr>
-        <w:pBdr>
-          <w:left w:val="single" w:color="C6821E" w:sz="18" w:space="8"/>
-        </w:pBdr>
-        <w:spacing w:after="200" w:before="100"/>
-        <w:ind w:left="200"/>
-      </w:pPr>
-      <w:r>
-        <w:rPr>
-          <w:i/>
-          <w:iCs/>
-          <w:color w:val="5B6559"/>
-          <w:sz w:val="20"/>
-          <w:szCs w:val="20"/>
-        </w:rPr>
-        <w:t xml:space="preserve">No entra en P1: ordenar por pasillo/categoría, añadir productos a mano sin pasar por Larder, cantidades o notas por ítem.</w:t>
-      </w:r>
-    </w:p>
     <w:p>
       <w:pPr>
         <w:pStyle w:val="Heading1"/>
@@ -1152,6 +1863,15 @@
           <w:szCs w:val="20"/>
         </w:rPr>
         <w:t xml:space="preserve">Esta es la sección más importante del documento — la decisión más evaluada, y la que sale directamente del estado del arte.</w:t>
+      </w:r>
+    </w:p>
+    <w:p>
+      <w:pPr>
+        <w:pStyle w:val="Heading2"/>
+        <w:spacing w:after="150" w:before="300"/>
+      </w:pPr>
+      <w:r>
+        <w:t xml:space="preserve">Con Odoo</w:t>
       </w:r>
     </w:p>
     <w:tbl>
@@ -1167,61 +1887,10 @@
         </w:tblBorders>
       </w:tblPr>
       <w:tblGrid>
-        <w:gridCol w:w="3010"/>
-        <w:gridCol w:w="3010"/>
         <w:gridCol w:w="3000"/>
+        <w:gridCol w:w="6020"/>
       </w:tblGrid>
       <w:tr>
-        <w:tc>
-          <w:tcPr>
-            <w:tcW w:type="dxa" w:w="3010"/>
-            <w:shd w:fill="26402C" w:val="clear"/>
-            <w:tcMar>
-              <w:top w:type="dxa" w:w="100"/>
-              <w:left w:type="dxa" w:w="120"/>
-              <w:bottom w:type="dxa" w:w="100"/>
-              <w:right w:type="dxa" w:w="120"/>
-            </w:tcMar>
-            <w:vAlign w:val="top"/>
-          </w:tcPr>
-          <w:p>
-            <w:r>
-              <w:rPr>
-                <w:b/>
-                <w:bCs/>
-                <w:color w:val="FFFFFF"/>
-                <w:sz w:val="20"/>
-                <w:szCs w:val="20"/>
-              </w:rPr>
-              <w:t xml:space="preserve">Lo construís vosotros</w:t>
-            </w:r>
-          </w:p>
-        </w:tc>
-        <w:tc>
-          <w:tcPr>
-            <w:tcW w:type="dxa" w:w="3010"/>
-            <w:shd w:fill="26402C" w:val="clear"/>
-            <w:tcMar>
-              <w:top w:type="dxa" w:w="100"/>
-              <w:left w:type="dxa" w:w="120"/>
-              <w:bottom w:type="dxa" w:w="100"/>
-              <w:right w:type="dxa" w:w="120"/>
-            </w:tcMar>
-            <w:vAlign w:val="top"/>
-          </w:tcPr>
-          <w:p>
-            <w:r>
-              <w:rPr>
-                <w:b/>
-                <w:bCs/>
-                <w:color w:val="FFFFFF"/>
-                <w:sz w:val="20"/>
-                <w:szCs w:val="20"/>
-              </w:rPr>
-              <w:t xml:space="preserve">Lo hace Odoo</w:t>
-            </w:r>
-          </w:p>
-        </w:tc>
         <w:tc>
           <w:tcPr>
             <w:tcW w:type="dxa" w:w="3000"/>
@@ -1243,60 +1912,37 @@
                 <w:sz w:val="20"/>
                 <w:szCs w:val="20"/>
               </w:rPr>
-              <w:t xml:space="preserve">No se hace (en P1)</w:t>
-            </w:r>
-          </w:p>
-        </w:tc>
-      </w:tr>
-      <w:tr>
-        <w:tc>
-          <w:tcPr>
-            <w:tcW w:type="dxa" w:w="3010"/>
-            <w:tcMar>
-              <w:top w:type="dxa" w:w="100"/>
-              <w:left w:type="dxa" w:w="120"/>
-              <w:bottom w:type="dxa" w:w="100"/>
-              <w:right w:type="dxa" w:w="120"/>
-            </w:tcMar>
-            <w:vAlign w:val="top"/>
-          </w:tcPr>
-          <w:p>
-            <w:r>
-              <w:rPr>
-                <w:b w:val="false"/>
-                <w:bCs w:val="false"/>
-                <w:color w:val="1F2A1F"/>
-                <w:sz w:val="20"/>
-                <w:szCs w:val="20"/>
-              </w:rPr>
-              <w:t xml:space="preserve">Larder (despensa, 3 estados, sin cantidades)</w:t>
-            </w:r>
-          </w:p>
-        </w:tc>
-        <w:tc>
-          <w:tcPr>
-            <w:tcW w:type="dxa" w:w="3010"/>
-            <w:tcMar>
-              <w:top w:type="dxa" w:w="100"/>
-              <w:left w:type="dxa" w:w="120"/>
-              <w:bottom w:type="dxa" w:w="100"/>
-              <w:right w:type="dxa" w:w="120"/>
-            </w:tcMar>
-            <w:vAlign w:val="top"/>
-          </w:tcPr>
-          <w:p>
-            <w:r>
-              <w:rPr>
-                <w:b w:val="false"/>
-                <w:bCs w:val="false"/>
-                <w:color w:val="1F2A1F"/>
-                <w:sz w:val="20"/>
-                <w:szCs w:val="20"/>
-              </w:rPr>
-              <w:t xml:space="preserve">Catálogo de productos (Inventario)</w:t>
-            </w:r>
-          </w:p>
-        </w:tc>
+              <w:t xml:space="preserve">Apartado</w:t>
+            </w:r>
+          </w:p>
+        </w:tc>
+        <w:tc>
+          <w:tcPr>
+            <w:tcW w:type="dxa" w:w="6020"/>
+            <w:shd w:fill="26402C" w:val="clear"/>
+            <w:tcMar>
+              <w:top w:type="dxa" w:w="100"/>
+              <w:left w:type="dxa" w:w="120"/>
+              <w:bottom w:type="dxa" w:w="100"/>
+              <w:right w:type="dxa" w:w="120"/>
+            </w:tcMar>
+            <w:vAlign w:val="top"/>
+          </w:tcPr>
+          <w:p>
+            <w:r>
+              <w:rPr>
+                <w:b/>
+                <w:bCs/>
+                <w:color w:val="FFFFFF"/>
+                <w:sz w:val="20"/>
+                <w:szCs w:val="20"/>
+              </w:rPr>
+              <w:t xml:space="preserve">Contenido</w:t>
+            </w:r>
+          </w:p>
+        </w:tc>
+      </w:tr>
+      <w:tr>
         <w:tc>
           <w:tcPr>
             <w:tcW w:type="dxa" w:w="3000"/>
@@ -1311,66 +1957,54 @@
           <w:p>
             <w:r>
               <w:rPr>
-                <w:b w:val="false"/>
-                <w:bCs w:val="false"/>
-                <w:color w:val="1F2A1F"/>
-                <w:sz w:val="20"/>
-                <w:szCs w:val="20"/>
-              </w:rPr>
-              <w:t xml:space="preserve">Track — reparto de gastos (P2, módulo a medida)</w:t>
-            </w:r>
-          </w:p>
-        </w:tc>
-      </w:tr>
-      <w:tr>
-        <w:tc>
-          <w:tcPr>
-            <w:tcW w:type="dxa" w:w="3010"/>
-            <w:tcMar>
-              <w:top w:type="dxa" w:w="100"/>
-              <w:left w:type="dxa" w:w="120"/>
-              <w:bottom w:type="dxa" w:w="100"/>
-              <w:right w:type="dxa" w:w="120"/>
-            </w:tcMar>
-            <w:vAlign w:val="top"/>
-          </w:tcPr>
-          <w:p>
-            <w:r>
-              <w:rPr>
-                <w:b w:val="false"/>
-                <w:bCs w:val="false"/>
-                <w:color w:val="1F2A1F"/>
-                <w:sz w:val="20"/>
-                <w:szCs w:val="20"/>
-              </w:rPr>
-              <w:t xml:space="preserve">List (lista automática, con concurrencia)</w:t>
-            </w:r>
-          </w:p>
-        </w:tc>
-        <w:tc>
-          <w:tcPr>
-            <w:tcW w:type="dxa" w:w="3010"/>
-            <w:tcMar>
-              <w:top w:type="dxa" w:w="100"/>
-              <w:left w:type="dxa" w:w="120"/>
-              <w:bottom w:type="dxa" w:w="100"/>
-              <w:right w:type="dxa" w:w="120"/>
-            </w:tcMar>
-            <w:vAlign w:val="top"/>
-          </w:tcPr>
-          <w:p>
-            <w:r>
-              <w:rPr>
-                <w:b w:val="false"/>
-                <w:bCs w:val="false"/>
-                <w:color w:val="1F2A1F"/>
-                <w:sz w:val="20"/>
-                <w:szCs w:val="20"/>
-              </w:rPr>
-              <w:t xml:space="preserve"/>
-            </w:r>
-          </w:p>
-        </w:tc>
+                <w:b/>
+                <w:bCs/>
+                <w:color w:val="1F2A1F"/>
+                <w:sz w:val="20"/>
+                <w:szCs w:val="20"/>
+              </w:rPr>
+              <w:t xml:space="preserve">1. Inventario — pantalla Larder</w:t>
+            </w:r>
+          </w:p>
+        </w:tc>
+        <w:tc>
+          <w:tcPr>
+            <w:tcW w:type="dxa" w:w="6020"/>
+            <w:tcMar>
+              <w:top w:type="dxa" w:w="100"/>
+              <w:left w:type="dxa" w:w="120"/>
+              <w:bottom w:type="dxa" w:w="100"/>
+              <w:right w:type="dxa" w:w="120"/>
+            </w:tcMar>
+            <w:vAlign w:val="top"/>
+          </w:tcPr>
+          <w:p>
+            <w:r>
+              <w:rPr>
+                <w:b w:val="false"/>
+                <w:bCs w:val="false"/>
+                <w:color w:val="1F2A1F"/>
+                <w:sz w:val="20"/>
+                <w:szCs w:val="20"/>
+              </w:rPr>
+              <w:t xml:space="preserve">Datos maestros: nombre, categoría, unidad, fecha de caducidad.</w:t>
+            </w:r>
+          </w:p>
+          <w:p>
+            <w:r>
+              <w:rPr>
+                <w:b w:val="false"/>
+                <w:bCs w:val="false"/>
+                <w:color w:val="1F2A1F"/>
+                <w:sz w:val="20"/>
+                <w:szCs w:val="20"/>
+              </w:rPr>
+              <w:t xml:space="preserve">Base de datos de productos existente, con alta automática.</w:t>
+            </w:r>
+          </w:p>
+        </w:tc>
+      </w:tr>
+      <w:tr>
         <w:tc>
           <w:tcPr>
             <w:tcW w:type="dxa" w:w="3000"/>
@@ -1385,13 +2019,37 @@
           <w:p>
             <w:r>
               <w:rPr>
-                <w:b w:val="false"/>
-                <w:bCs w:val="false"/>
-                <w:color w:val="1F2A1F"/>
-                <w:sz w:val="20"/>
-                <w:szCs w:val="20"/>
-              </w:rPr>
-              <w:t xml:space="preserve">Facturación de la suscripción y de la comisión de afiliación (P2/P3)</w:t>
+                <w:b/>
+                <w:bCs/>
+                <w:color w:val="1F2A1F"/>
+                <w:sz w:val="20"/>
+                <w:szCs w:val="20"/>
+              </w:rPr>
+              <w:t xml:space="preserve">2. Reparto de gastos — pantalla Track</w:t>
+            </w:r>
+          </w:p>
+        </w:tc>
+        <w:tc>
+          <w:tcPr>
+            <w:tcW w:type="dxa" w:w="6020"/>
+            <w:tcMar>
+              <w:top w:type="dxa" w:w="100"/>
+              <w:left w:type="dxa" w:w="120"/>
+              <w:bottom w:type="dxa" w:w="100"/>
+              <w:right w:type="dxa" w:w="120"/>
+            </w:tcMar>
+            <w:vAlign w:val="top"/>
+          </w:tcPr>
+          <w:p>
+            <w:r>
+              <w:rPr>
+                <w:b w:val="false"/>
+                <w:bCs w:val="false"/>
+                <w:color w:val="1F2A1F"/>
+                <w:sz w:val="20"/>
+                <w:szCs w:val="20"/>
+              </w:rPr>
+              <w:t xml:space="preserve">Datos maestros: hogar, miembro/usuario, precio.</w:t>
             </w:r>
           </w:p>
         </w:tc>
@@ -1399,80 +2057,45 @@
     </w:tbl>
     <w:p>
       <w:pPr>
+        <w:pBdr>
+          <w:left w:val="single" w:color="C6821E" w:sz="18" w:space="8"/>
+        </w:pBdr>
+        <w:spacing w:after="200" w:before="100"/>
+        <w:ind w:left="200"/>
+      </w:pPr>
+      <w:r>
+        <w:rPr>
+          <w:i/>
+          <w:iCs/>
+          <w:color w:val="5B6559"/>
+          <w:sz w:val="20"/>
+          <w:szCs w:val="20"/>
+        </w:rPr>
+        <w:t xml:space="preserve">Dudas: monetización con Stripe o con Odoo.</w:t>
+      </w:r>
+    </w:p>
+    <w:p>
+      <w:pPr>
         <w:spacing w:after="120"/>
       </w:pPr>
       <w:r>
         <w:rPr>
-          <w:color w:val="1F2A1F"/>
+          <w:i/>
+          <w:iCs/>
+          <w:color w:val="5B6559"/>
           <w:sz w:val="21"/>
           <w:szCs w:val="21"/>
         </w:rPr>
-        <w:t xml:space="preserve"/>
-      </w:r>
-    </w:p>
-    <w:p>
-      <w:pPr>
-        <w:spacing w:after="120"/>
-      </w:pPr>
-      <w:r>
-        <w:rPr>
-          <w:b/>
-          <w:bCs/>
-          <w:color w:val="1F2A1F"/>
-          <w:sz w:val="21"/>
-          <w:szCs w:val="21"/>
-        </w:rPr>
-        <w:t xml:space="preserve">Por qué Larder y List no van a Odoo:</w:t>
-      </w:r>
-    </w:p>
-    <w:p>
-      <w:pPr>
-        <w:spacing w:after="120"/>
-      </w:pPr>
-      <w:r>
-        <w:rPr>
-          <w:color w:val="1F2A1F"/>
-          <w:sz w:val="21"/>
-          <w:szCs w:val="21"/>
-        </w:rPr>
-        <w:t xml:space="preserve">El concepto general (control de inventario, reordenación automática) sí existe en un ERP — no es que "no exista en ningún sitio". Pero el modelo de datos de Odoo exige cantidades exactas y un almacén, y Larder decide explícitamente no llevar cantidades (es un toque: bien / queda poco / se acabó, no un número). Adaptar Odoo a ese modelo costaría más programación que construirlo aparte — y eso contradice la propia idea de un ERP ("parametrización = configurar sin programar").</w:t>
-      </w:r>
-    </w:p>
-    <w:p>
-      <w:pPr>
-        <w:spacing w:after="120"/>
-      </w:pPr>
-      <w:r>
-        <w:rPr>
-          <w:b/>
-          <w:bCs/>
-          <w:color w:val="1F2A1F"/>
-          <w:sz w:val="21"/>
-          <w:szCs w:val="21"/>
-        </w:rPr>
-        <w:t xml:space="preserve">Por qué el catálogo sí va a Odoo:</w:t>
-      </w:r>
-    </w:p>
-    <w:p>
-      <w:pPr>
-        <w:spacing w:after="120"/>
-      </w:pPr>
-      <w:r>
-        <w:rPr>
-          <w:color w:val="1F2A1F"/>
-          <w:sz w:val="21"/>
-          <w:szCs w:val="21"/>
-        </w:rPr>
-        <w:t xml:space="preserve">Un catálogo de productos (nombre, categoría, código de barras) es dato maestro genérico — exactamente lo que un ERP horizontal ya resuelve de serie. Nadie os valoraría por reinventar una tabla de productos.</w:t>
-      </w:r>
-    </w:p>
-    <w:p>
-      <w:pPr>
-        <w:pStyle w:val="Heading2"/>
-        <w:spacing w:after="150" w:before="300"/>
-      </w:pPr>
-      <w:r>
-        <w:t xml:space="preserve">Qué va en Odoo</w:t>
+        <w:t xml:space="preserve">Lo corrige: Delimitación con el ERP (CE3.1) · Instalación y parametrización (CE2.2, CE2.5, CE2.7) · Datos maestros (CE2.6).</w:t>
+      </w:r>
+    </w:p>
+    <w:p>
+      <w:pPr>
+        <w:pStyle w:val="Heading1"/>
+        <w:spacing w:after="200" w:before="400"/>
+      </w:pPr>
+      <w:r>
+        <w:t xml:space="preserve">4 · La sección crítica  (Servicios y Procesos)</w:t>
       </w:r>
     </w:p>
     <w:tbl>
@@ -1564,7 +2187,7 @@
                 <w:sz w:val="20"/>
                 <w:szCs w:val="20"/>
               </w:rPr>
-              <w:t xml:space="preserve">Aplicaciones a instalar</w:t>
+              <w:t xml:space="preserve">El recurso compartido</w:t>
             </w:r>
           </w:p>
         </w:tc>
@@ -1588,7 +2211,7 @@
                 <w:sz w:val="20"/>
                 <w:szCs w:val="20"/>
               </w:rPr>
-              <w:t xml:space="preserve">Odoo Inventario, únicamente. No se instala Compras, Ventas, RRHH ni CRM en P1 — ninguna encaja con los dos casos de uso de esta fase.</w:t>
+              <w:t xml:space="preserve">Interactuar a la vez con el mismo item.</w:t>
             </w:r>
           </w:p>
         </w:tc>
@@ -1614,7 +2237,7 @@
                 <w:sz w:val="20"/>
                 <w:szCs w:val="20"/>
               </w:rPr>
-              <w:t xml:space="preserve">Datos maestros</w:t>
+              <w:t xml:space="preserve">La operación en conflicto</w:t>
             </w:r>
           </w:p>
         </w:tc>
@@ -1638,7 +2261,19 @@
                 <w:sz w:val="20"/>
                 <w:szCs w:val="20"/>
               </w:rPr>
-              <w:t xml:space="preserve">Ficha de producto (product.template): nombre, categoría, código de barras si lo tiene, unidad. Origen: carga inicial desde una base abierta de productos, y alta automática cuando aparece un producto que no existe todavía en el catálogo. Volumen: miles de fichas.</w:t>
+              <w:t xml:space="preserve">Larder: marcar el mismo item como "out" dos veces en la lista — imposible.</w:t>
+            </w:r>
+          </w:p>
+          <w:p>
+            <w:r>
+              <w:rPr>
+                <w:b w:val="false"/>
+                <w:bCs w:val="false"/>
+                <w:color w:val="1F2A1F"/>
+                <w:sz w:val="20"/>
+                <w:szCs w:val="20"/>
+              </w:rPr>
+              <w:t xml:space="preserve">List: comprar dos veces es imposible porque habría que ir a la tienda a la vez.</w:t>
             </w:r>
           </w:p>
         </w:tc>
@@ -1664,7 +2299,7 @@
                 <w:sz w:val="20"/>
                 <w:szCs w:val="20"/>
               </w:rPr>
-              <w:t xml:space="preserve">Informe / decisión de negocio</w:t>
+              <w:t xml:space="preserve">Qué pasa hoy</w:t>
             </w:r>
           </w:p>
         </w:tc>
@@ -1682,306 +2317,63 @@
           <w:p>
             <w:r>
               <w:rPr>
-                <w:b w:val="false"/>
-                <w:bCs w:val="false"/>
-                <w:color w:val="1F2A1F"/>
-                <w:sz w:val="20"/>
-                <w:szCs w:val="20"/>
-              </w:rPr>
-              <w:t xml:space="preserve">Informe de productos por categoría sin fecha de frescura típica definida (dato que usa el aviso de caducidad de Larder). La decisión que ayuda a tomar: qué categorías completar primero en el catálogo para que el aviso de caducidad funcione en el mayor número de productos posible desde el lanzamiento.</w:t>
-            </w:r>
-          </w:p>
-        </w:tc>
-      </w:tr>
-    </w:tbl>
-    <w:p>
-      <w:pPr>
-        <w:spacing w:after="120"/>
-      </w:pPr>
-      <w:r>
-        <w:rPr>
-          <w:i/>
-          <w:iCs/>
-          <w:color w:val="5B6559"/>
-          <w:sz w:val="21"/>
-          <w:szCs w:val="21"/>
-        </w:rPr>
-        <w:t xml:space="preserve">Lo corrige: Delimitación con el ERP (CE3.1) · Instalación y parametrización (CE2.2, CE2.5, CE2.7) · Datos maestros (CE2.6) · Explotación (CE3.4, CE3.8).</w:t>
-      </w:r>
-    </w:p>
-    <w:p>
-      <w:pPr>
-        <w:pStyle w:val="Heading1"/>
-        <w:spacing w:after="200" w:before="400"/>
-      </w:pPr>
-      <w:r>
-        <w:t xml:space="preserve">4 · La sección crítica  (Servicios y Procesos)</w:t>
-      </w:r>
-    </w:p>
-    <w:tbl>
-      <w:tblPr>
-        <w:tblW w:type="dxa" w:w="9020"/>
-        <w:tblBorders>
-          <w:top w:val="single" w:color="auto" w:sz="4"/>
-          <w:left w:val="single" w:color="auto" w:sz="4"/>
-          <w:bottom w:val="single" w:color="auto" w:sz="4"/>
-          <w:right w:val="single" w:color="auto" w:sz="4"/>
-          <w:insideH w:val="single" w:color="auto" w:sz="4"/>
-          <w:insideV w:val="single" w:color="auto" w:sz="4"/>
-        </w:tblBorders>
-      </w:tblPr>
-      <w:tblGrid>
-        <w:gridCol w:w="2400"/>
-        <w:gridCol w:w="6620"/>
-      </w:tblGrid>
+                <w:i/>
+                <w:iCs/>
+                <w:color w:val="5B6559"/>
+                <w:sz w:val="20"/>
+                <w:szCs w:val="20"/>
+              </w:rPr>
+              <w:t xml:space="preserve">Pendiente de definir.</w:t>
+            </w:r>
+          </w:p>
+        </w:tc>
+      </w:tr>
       <w:tr>
         <w:tc>
           <w:tcPr>
             <w:tcW w:type="dxa" w:w="2400"/>
-            <w:shd w:fill="26402C" w:val="clear"/>
-            <w:tcMar>
-              <w:top w:type="dxa" w:w="100"/>
-              <w:left w:type="dxa" w:w="120"/>
-              <w:bottom w:type="dxa" w:w="100"/>
-              <w:right w:type="dxa" w:w="120"/>
-            </w:tcMar>
-            <w:vAlign w:val="top"/>
-          </w:tcPr>
-          <w:p>
-            <w:r>
-              <w:rPr>
-                <w:b/>
-                <w:bCs/>
-                <w:color w:val="FFFFFF"/>
-                <w:sz w:val="20"/>
-                <w:szCs w:val="20"/>
-              </w:rPr>
-              <w:t xml:space="preserve">Apartado</w:t>
+            <w:tcMar>
+              <w:top w:type="dxa" w:w="100"/>
+              <w:left w:type="dxa" w:w="120"/>
+              <w:bottom w:type="dxa" w:w="100"/>
+              <w:right w:type="dxa" w:w="120"/>
+            </w:tcMar>
+            <w:vAlign w:val="top"/>
+          </w:tcPr>
+          <w:p>
+            <w:r>
+              <w:rPr>
+                <w:b/>
+                <w:bCs/>
+                <w:color w:val="1F2A1F"/>
+                <w:sz w:val="20"/>
+                <w:szCs w:val="20"/>
+              </w:rPr>
+              <w:t xml:space="preserve">Qué debería pasar</w:t>
             </w:r>
           </w:p>
         </w:tc>
         <w:tc>
           <w:tcPr>
             <w:tcW w:type="dxa" w:w="6620"/>
-            <w:shd w:fill="26402C" w:val="clear"/>
-            <w:tcMar>
-              <w:top w:type="dxa" w:w="100"/>
-              <w:left w:type="dxa" w:w="120"/>
-              <w:bottom w:type="dxa" w:w="100"/>
-              <w:right w:type="dxa" w:w="120"/>
-            </w:tcMar>
-            <w:vAlign w:val="top"/>
-          </w:tcPr>
-          <w:p>
-            <w:r>
-              <w:rPr>
-                <w:b/>
-                <w:bCs/>
-                <w:color w:val="FFFFFF"/>
-                <w:sz w:val="20"/>
-                <w:szCs w:val="20"/>
-              </w:rPr>
-              <w:t xml:space="preserve">Contenido</w:t>
-            </w:r>
-          </w:p>
-        </w:tc>
-      </w:tr>
-      <w:tr>
-        <w:tc>
-          <w:tcPr>
-            <w:tcW w:type="dxa" w:w="2400"/>
-            <w:tcMar>
-              <w:top w:type="dxa" w:w="100"/>
-              <w:left w:type="dxa" w:w="120"/>
-              <w:bottom w:type="dxa" w:w="100"/>
-              <w:right w:type="dxa" w:w="120"/>
-            </w:tcMar>
-            <w:vAlign w:val="top"/>
-          </w:tcPr>
-          <w:p>
-            <w:r>
-              <w:rPr>
-                <w:b/>
-                <w:bCs/>
-                <w:color w:val="1F2A1F"/>
-                <w:sz w:val="20"/>
-                <w:szCs w:val="20"/>
-              </w:rPr>
-              <w:t xml:space="preserve">El recurso compartido</w:t>
-            </w:r>
-          </w:p>
-        </w:tc>
-        <w:tc>
-          <w:tcPr>
-            <w:tcW w:type="dxa" w:w="6620"/>
-            <w:tcMar>
-              <w:top w:type="dxa" w:w="100"/>
-              <w:left w:type="dxa" w:w="120"/>
-              <w:bottom w:type="dxa" w:w="100"/>
-              <w:right w:type="dxa" w:w="120"/>
-            </w:tcMar>
-            <w:vAlign w:val="top"/>
-          </w:tcPr>
-          <w:p>
-            <w:r>
-              <w:rPr>
-                <w:b w:val="false"/>
-                <w:bCs w:val="false"/>
-                <w:color w:val="1F2A1F"/>
-                <w:sz w:val="20"/>
-                <w:szCs w:val="20"/>
-              </w:rPr>
-              <w:t xml:space="preserve">Un ítem de List: el mismo producto pendiente de comprar, que dos miembros del hogar pueden marcar como "comprado" a la vez.</w:t>
-            </w:r>
-          </w:p>
-        </w:tc>
-      </w:tr>
-      <w:tr>
-        <w:tc>
-          <w:tcPr>
-            <w:tcW w:type="dxa" w:w="2400"/>
-            <w:tcMar>
-              <w:top w:type="dxa" w:w="100"/>
-              <w:left w:type="dxa" w:w="120"/>
-              <w:bottom w:type="dxa" w:w="100"/>
-              <w:right w:type="dxa" w:w="120"/>
-            </w:tcMar>
-            <w:vAlign w:val="top"/>
-          </w:tcPr>
-          <w:p>
-            <w:r>
-              <w:rPr>
-                <w:b/>
-                <w:bCs/>
-                <w:color w:val="1F2A1F"/>
-                <w:sz w:val="20"/>
-                <w:szCs w:val="20"/>
-              </w:rPr>
-              <w:t xml:space="preserve">La operación en conflicto</w:t>
-            </w:r>
-          </w:p>
-        </w:tc>
-        <w:tc>
-          <w:tcPr>
-            <w:tcW w:type="dxa" w:w="6620"/>
-            <w:tcMar>
-              <w:top w:type="dxa" w:w="100"/>
-              <w:left w:type="dxa" w:w="120"/>
-              <w:bottom w:type="dxa" w:w="100"/>
-              <w:right w:type="dxa" w:w="120"/>
-            </w:tcMar>
-            <w:vAlign w:val="top"/>
-          </w:tcPr>
-          <w:p>
-            <w:r>
-              <w:rPr>
-                <w:b w:val="false"/>
-                <w:bCs w:val="false"/>
-                <w:color w:val="1F2A1F"/>
-                <w:sz w:val="20"/>
-                <w:szCs w:val="20"/>
-              </w:rPr>
-              <w:t xml:space="preserve">Dos personas están comprando en el mismo supermercado (o distinto) y ambas tocan "comprado" sobre el mismo producto casi en el mismo instante, antes de que la pantalla de ninguna de las dos se haya refrescado.</w:t>
-            </w:r>
-          </w:p>
-        </w:tc>
-      </w:tr>
-      <w:tr>
-        <w:tc>
-          <w:tcPr>
-            <w:tcW w:type="dxa" w:w="2400"/>
-            <w:tcMar>
-              <w:top w:type="dxa" w:w="100"/>
-              <w:left w:type="dxa" w:w="120"/>
-              <w:bottom w:type="dxa" w:w="100"/>
-              <w:right w:type="dxa" w:w="120"/>
-            </w:tcMar>
-            <w:vAlign w:val="top"/>
-          </w:tcPr>
-          <w:p>
-            <w:r>
-              <w:rPr>
-                <w:b/>
-                <w:bCs/>
-                <w:color w:val="1F2A1F"/>
-                <w:sz w:val="20"/>
-                <w:szCs w:val="20"/>
-              </w:rPr>
-              <w:t xml:space="preserve">Qué pasa hoy (sin control)</w:t>
-            </w:r>
-          </w:p>
-        </w:tc>
-        <w:tc>
-          <w:tcPr>
-            <w:tcW w:type="dxa" w:w="6620"/>
-            <w:tcMar>
-              <w:top w:type="dxa" w:w="100"/>
-              <w:left w:type="dxa" w:w="120"/>
-              <w:bottom w:type="dxa" w:w="100"/>
-              <w:right w:type="dxa" w:w="120"/>
-            </w:tcMar>
-            <w:vAlign w:val="top"/>
-          </w:tcPr>
-          <w:p>
-            <w:r>
-              <w:rPr>
-                <w:b w:val="false"/>
-                <w:bCs w:val="false"/>
-                <w:color w:val="1F2A1F"/>
-                <w:sz w:val="20"/>
-                <w:szCs w:val="20"/>
-              </w:rPr>
-              <w:t xml:space="preserve">Usuario A ve "leche" pendiente y la marca como comprada: el backend actualiza Larder a "bien" y quita leche de List. Un segundo después, Usuario B, con la pantalla desactualizada, también marca "leche" como comprada. Sin control de concurrencia, esa segunda petición se procesa igual: puede duplicar el registro de compra o dejar el estado inconsistente, y B no se entera de que ya estaba resuelto.</w:t>
-            </w:r>
-          </w:p>
-        </w:tc>
-      </w:tr>
-      <w:tr>
-        <w:tc>
-          <w:tcPr>
-            <w:tcW w:type="dxa" w:w="2400"/>
-            <w:tcMar>
-              <w:top w:type="dxa" w:w="100"/>
-              <w:left w:type="dxa" w:w="120"/>
-              <w:bottom w:type="dxa" w:w="100"/>
-              <w:right w:type="dxa" w:w="120"/>
-            </w:tcMar>
-            <w:vAlign w:val="top"/>
-          </w:tcPr>
-          <w:p>
-            <w:r>
-              <w:rPr>
-                <w:b/>
-                <w:bCs/>
-                <w:color w:val="1F2A1F"/>
-                <w:sz w:val="20"/>
-                <w:szCs w:val="20"/>
-              </w:rPr>
-              <w:t xml:space="preserve">Qué debería pasar</w:t>
-            </w:r>
-          </w:p>
-        </w:tc>
-        <w:tc>
-          <w:tcPr>
-            <w:tcW w:type="dxa" w:w="6620"/>
-            <w:tcMar>
-              <w:top w:type="dxa" w:w="100"/>
-              <w:left w:type="dxa" w:w="120"/>
-              <w:bottom w:type="dxa" w:w="100"/>
-              <w:right w:type="dxa" w:w="120"/>
-            </w:tcMar>
-            <w:vAlign w:val="top"/>
-          </w:tcPr>
-          <w:p>
-            <w:r>
-              <w:rPr>
-                <w:b w:val="false"/>
-                <w:bCs w:val="false"/>
-                <w:color w:val="1F2A1F"/>
-                <w:sz w:val="20"/>
-                <w:szCs w:val="20"/>
-              </w:rPr>
-              <w:t xml:space="preserve">La primera petición que llega al servidor gana y se procesa con normalidad. La segunda recibe una respuesta clara ("ya se marcó como comprado hace unos segundos"), no un error genérico, y la pantalla de B se actualiza sola para reflejar el estado real.</w:t>
+            <w:tcMar>
+              <w:top w:type="dxa" w:w="100"/>
+              <w:left w:type="dxa" w:w="120"/>
+              <w:bottom w:type="dxa" w:w="100"/>
+              <w:right w:type="dxa" w:w="120"/>
+            </w:tcMar>
+            <w:vAlign w:val="top"/>
+          </w:tcPr>
+          <w:p>
+            <w:r>
+              <w:rPr>
+                <w:i/>
+                <w:iCs/>
+                <w:color w:val="5B6559"/>
+                <w:sz w:val="20"/>
+                <w:szCs w:val="20"/>
+              </w:rPr>
+              <w:t xml:space="preserve">Pendiente de definir.</w:t>
             </w:r>
           </w:p>
         </w:tc>
@@ -1998,7 +2390,8 @@
     </w:p>
     <w:p>
       <w:pPr>
-        <w:spacing w:after="120"/>
+        <w:spacing w:after="60"/>
+        <w:ind w:left="300"/>
       </w:pPr>
       <w:r>
         <w:rPr>
@@ -2006,7 +2399,49 @@
           <w:sz w:val="21"/>
           <w:szCs w:val="21"/>
         </w:rPr>
-        <w:t xml:space="preserve">Cada noche, un proceso revisa el historial de eventos de Larder (cuándo se marcó cada producto como "se acabó" la última vez) y recalcula la predicción de reposición de cada producto — sin que nadie lo pida ni tenga que esperar.</w:t>
+        <w:t xml:space="preserve">– Restock automático de Larder.</w:t>
+      </w:r>
+    </w:p>
+    <w:p>
+      <w:pPr>
+        <w:spacing w:after="60"/>
+        <w:ind w:left="300"/>
+      </w:pPr>
+      <w:r>
+        <w:rPr>
+          <w:color w:val="1F2A1F"/>
+          <w:sz w:val="21"/>
+          <w:szCs w:val="21"/>
+        </w:rPr>
+        <w:t xml:space="preserve">– Marcado de "comprado" automático.</w:t>
+      </w:r>
+    </w:p>
+    <w:p>
+      <w:pPr>
+        <w:spacing w:after="60"/>
+        <w:ind w:left="300"/>
+      </w:pPr>
+      <w:r>
+        <w:rPr>
+          <w:color w:val="1F2A1F"/>
+          <w:sz w:val="21"/>
+          <w:szCs w:val="21"/>
+        </w:rPr>
+        <w:t xml:space="preserve">– Recuento de deudas automático.</w:t>
+      </w:r>
+    </w:p>
+    <w:p>
+      <w:pPr>
+        <w:spacing w:after="60"/>
+        <w:ind w:left="300"/>
+      </w:pPr>
+      <w:r>
+        <w:rPr>
+          <w:color w:val="1F2A1F"/>
+          <w:sz w:val="21"/>
+          <w:szCs w:val="21"/>
+        </w:rPr>
+        <w:t xml:space="preserve">– Evento: compra automática.</w:t>
       </w:r>
     </w:p>
     <w:p>

</xml_diff>

<commit_message>
Aplicar la estética papel/lápiz del estado del arte al documento
Reutiliza la paleta (tinta, bolígrafo azul, resaltador amarillo, rojo y ámbar de los clips) y la tipografía del sitio en cabeceras, tablas y notas del documento de especificación técnica.

Co-Authored-By: Claude Sonnet 5 <noreply@anthropic.com>
Claude-Session: https://claude.ai/code/session_012BwrUiCYr6ApYk5hmXyh4o
</commit_message>
<xml_diff>
--- a/docs/especificacion-tecnica.docx
+++ b/docs/especificacion-tecnica.docx
@@ -1,29 +1,32 @@
 
 <file path=word/document.xml><?xml version="1.0" encoding="utf-8"?>
 <w:document xmlns:wpc="http://schemas.microsoft.com/office/word/2010/wordprocessingCanvas" xmlns:mc="http://schemas.openxmlformats.org/markup-compatibility/2006" xmlns:o="urn:schemas-microsoft-com:office:office" xmlns:r="http://schemas.openxmlformats.org/officeDocument/2006/relationships" xmlns:m="http://schemas.openxmlformats.org/officeDocument/2006/math" xmlns:v="urn:schemas-microsoft-com:vml" xmlns:wp14="http://schemas.microsoft.com/office/word/2010/wordprocessingDrawing" xmlns:wp="http://schemas.openxmlformats.org/drawingml/2006/wordprocessingDrawing" xmlns:w10="urn:schemas-microsoft-com:office:word" xmlns:w="http://schemas.openxmlformats.org/wordprocessingml/2006/main" xmlns:w14="http://schemas.microsoft.com/office/word/2010/wordml" xmlns:w15="http://schemas.microsoft.com/office/word/2012/wordml" xmlns:wpg="http://schemas.microsoft.com/office/word/2010/wordprocessingGroup" xmlns:wpi="http://schemas.microsoft.com/office/word/2010/wordprocessingInk" xmlns:wne="http://schemas.microsoft.com/office/word/2006/wordml" xmlns:wps="http://schemas.microsoft.com/office/word/2010/wordprocessingShape" xmlns:cx="http://schemas.microsoft.com/office/drawing/2014/chartex" xmlns:cx1="http://schemas.microsoft.com/office/drawing/2015/9/8/chartex" xmlns:cx2="http://schemas.microsoft.com/office/drawing/2015/10/21/chartex" xmlns:cx3="http://schemas.microsoft.com/office/drawing/2016/5/9/chartex" xmlns:cx4="http://schemas.microsoft.com/office/drawing/2016/5/10/chartex" xmlns:cx5="http://schemas.microsoft.com/office/drawing/2016/5/11/chartex" xmlns:cx6="http://schemas.microsoft.com/office/drawing/2016/5/12/chartex" xmlns:cx7="http://schemas.microsoft.com/office/drawing/2016/5/13/chartex" xmlns:cx8="http://schemas.microsoft.com/office/drawing/2016/5/14/chartex" xmlns:aink="http://schemas.microsoft.com/office/drawing/2016/ink" xmlns:am3d="http://schemas.microsoft.com/office/drawing/2017/model3d" xmlns:w16cex="http://schemas.microsoft.com/office/word/2018/wordml/cex" xmlns:w16cid="http://schemas.microsoft.com/office/word/2016/wordml/cid" xmlns:w16="http://schemas.microsoft.com/office/word/2018/wordml" xmlns:w16sdtdh="http://schemas.microsoft.com/office/word/2020/wordml/sdtdatahash" xmlns:w16se="http://schemas.microsoft.com/office/word/2015/wordml/symex" mc:Ignorable="w14 w15 wp14">
+  <w:background w:color="EEECE7"/>
   <w:body>
     <w:p>
       <w:pPr>
-        <w:spacing w:after="60"/>
-      </w:pPr>
-      <w:r>
-        <w:rPr>
+        <w:spacing w:after="40"/>
+      </w:pPr>
+      <w:r>
+        <w:rPr>
+          <w:rFonts w:ascii="Covered By Your Grace" w:cs="Covered By Your Grace" w:eastAsia="Covered By Your Grace" w:hAnsi="Covered By Your Grace"/>
           <w:b/>
           <w:bCs/>
-          <w:color w:val="26402C"/>
-          <w:sz w:val="56"/>
-          <w:szCs w:val="56"/>
+          <w:color w:val="1D2B8F"/>
+          <w:sz w:val="72"/>
+          <w:szCs w:val="72"/>
         </w:rPr>
         <w:t xml:space="preserve">LARDER</w:t>
       </w:r>
     </w:p>
     <w:p>
       <w:pPr>
-        <w:spacing w:after="40"/>
-      </w:pPr>
-      <w:r>
-        <w:rPr>
-          <w:color w:val="5B6559"/>
+        <w:spacing w:after="120"/>
+      </w:pPr>
+      <w:r>
+        <w:rPr>
+          <w:rFonts w:ascii="Archivo" w:cs="Archivo" w:eastAsia="Archivo" w:hAnsi="Archivo"/>
+          <w:color w:val="141414"/>
           <w:sz w:val="28"/>
           <w:szCs w:val="28"/>
         </w:rPr>
@@ -36,21 +39,34 @@
       </w:pPr>
       <w:r>
         <w:rPr>
-          <w:i/>
-          <w:iCs/>
-          <w:color w:val="5B6559"/>
-          <w:sz w:val="20"/>
-          <w:szCs w:val="20"/>
-        </w:rPr>
-        <w:t xml:space="preserve">Punto de Control 1 · 2 de octubre de 2026</w:t>
+          <w:rFonts w:ascii="Archivo" w:cs="Archivo" w:eastAsia="Archivo" w:hAnsi="Archivo"/>
+          <w:b/>
+          <w:bCs/>
+          <w:color w:val="141414"/>
+          <w:sz w:val="18"/>
+          <w:szCs w:val="18"/>
+          <w:shd w:fill="F6D649" w:val="clear"/>
+        </w:rPr>
+        <w:t xml:space="preserve">  PUNTO DE CONTROL 1  </w:t>
       </w:r>
     </w:p>
     <w:p>
       <w:pPr>
         <w:pStyle w:val="Heading1"/>
-        <w:spacing w:after="200" w:before="400"/>
-      </w:pPr>
-      <w:r>
+        <w:pBdr>
+          <w:bottom w:val="single" w:color="F6D649" w:sz="16" w:space="4"/>
+        </w:pBdr>
+        <w:spacing w:after="200" w:before="420"/>
+      </w:pPr>
+      <w:r>
+        <w:rPr>
+          <w:rFonts w:ascii="Archivo" w:cs="Archivo" w:eastAsia="Archivo" w:hAnsi="Archivo"/>
+          <w:b/>
+          <w:bCs/>
+          <w:color w:val="1D2B8F"/>
+          <w:sz w:val="30"/>
+          <w:szCs w:val="30"/>
+        </w:rPr>
         <w:t xml:space="preserve">1 · El plan de una página</w:t>
       </w:r>
     </w:p>
@@ -74,7 +90,7 @@
         <w:tc>
           <w:tcPr>
             <w:tcW w:type="dxa" w:w="2400"/>
-            <w:shd w:fill="26402C" w:val="clear"/>
+            <w:shd w:fill="1D2B8F" w:val="clear"/>
             <w:tcMar>
               <w:top w:type="dxa" w:w="100"/>
               <w:left w:type="dxa" w:w="120"/>
@@ -99,7 +115,7 @@
         <w:tc>
           <w:tcPr>
             <w:tcW w:type="dxa" w:w="6620"/>
-            <w:shd w:fill="26402C" w:val="clear"/>
+            <w:shd w:fill="1D2B8F" w:val="clear"/>
             <w:tcMar>
               <w:top w:type="dxa" w:w="100"/>
               <w:left w:type="dxa" w:w="120"/>
@@ -126,20 +142,21 @@
         <w:tc>
           <w:tcPr>
             <w:tcW w:type="dxa" w:w="2400"/>
-            <w:tcMar>
-              <w:top w:type="dxa" w:w="100"/>
-              <w:left w:type="dxa" w:w="120"/>
-              <w:bottom w:type="dxa" w:w="100"/>
-              <w:right w:type="dxa" w:w="120"/>
-            </w:tcMar>
-            <w:vAlign w:val="top"/>
-          </w:tcPr>
-          <w:p>
-            <w:r>
-              <w:rPr>
-                <w:b/>
-                <w:bCs/>
-                <w:color w:val="1F2A1F"/>
+            <w:shd w:fill="FBFAF6" w:val="clear"/>
+            <w:tcMar>
+              <w:top w:type="dxa" w:w="100"/>
+              <w:left w:type="dxa" w:w="120"/>
+              <w:bottom w:type="dxa" w:w="100"/>
+              <w:right w:type="dxa" w:w="120"/>
+            </w:tcMar>
+            <w:vAlign w:val="top"/>
+          </w:tcPr>
+          <w:p>
+            <w:r>
+              <w:rPr>
+                <w:b/>
+                <w:bCs/>
+                <w:color w:val="141414"/>
                 <w:sz w:val="20"/>
                 <w:szCs w:val="20"/>
               </w:rPr>
@@ -150,20 +167,21 @@
         <w:tc>
           <w:tcPr>
             <w:tcW w:type="dxa" w:w="6620"/>
-            <w:tcMar>
-              <w:top w:type="dxa" w:w="100"/>
-              <w:left w:type="dxa" w:w="120"/>
-              <w:bottom w:type="dxa" w:w="100"/>
-              <w:right w:type="dxa" w:w="120"/>
-            </w:tcMar>
-            <w:vAlign w:val="top"/>
-          </w:tcPr>
-          <w:p>
-            <w:r>
-              <w:rPr>
-                <w:b w:val="false"/>
-                <w:bCs w:val="false"/>
-                <w:color w:val="1F2A1F"/>
+            <w:shd w:fill="FBFAF6" w:val="clear"/>
+            <w:tcMar>
+              <w:top w:type="dxa" w:w="100"/>
+              <w:left w:type="dxa" w:w="120"/>
+              <w:bottom w:type="dxa" w:w="100"/>
+              <w:right w:type="dxa" w:w="120"/>
+            </w:tcMar>
+            <w:vAlign w:val="top"/>
+          </w:tcPr>
+          <w:p>
+            <w:r>
+              <w:rPr>
+                <w:b w:val="false"/>
+                <w:bCs w:val="false"/>
+                <w:color w:val="141414"/>
                 <w:sz w:val="20"/>
                 <w:szCs w:val="20"/>
               </w:rPr>
@@ -176,20 +194,21 @@
         <w:tc>
           <w:tcPr>
             <w:tcW w:type="dxa" w:w="2400"/>
-            <w:tcMar>
-              <w:top w:type="dxa" w:w="100"/>
-              <w:left w:type="dxa" w:w="120"/>
-              <w:bottom w:type="dxa" w:w="100"/>
-              <w:right w:type="dxa" w:w="120"/>
-            </w:tcMar>
-            <w:vAlign w:val="top"/>
-          </w:tcPr>
-          <w:p>
-            <w:r>
-              <w:rPr>
-                <w:b/>
-                <w:bCs/>
-                <w:color w:val="1F2A1F"/>
+            <w:shd w:fill="FBFAF6" w:val="clear"/>
+            <w:tcMar>
+              <w:top w:type="dxa" w:w="100"/>
+              <w:left w:type="dxa" w:w="120"/>
+              <w:bottom w:type="dxa" w:w="100"/>
+              <w:right w:type="dxa" w:w="120"/>
+            </w:tcMar>
+            <w:vAlign w:val="top"/>
+          </w:tcPr>
+          <w:p>
+            <w:r>
+              <w:rPr>
+                <w:b/>
+                <w:bCs/>
+                <w:color w:val="141414"/>
                 <w:sz w:val="20"/>
                 <w:szCs w:val="20"/>
               </w:rPr>
@@ -200,20 +219,21 @@
         <w:tc>
           <w:tcPr>
             <w:tcW w:type="dxa" w:w="6620"/>
-            <w:tcMar>
-              <w:top w:type="dxa" w:w="100"/>
-              <w:left w:type="dxa" w:w="120"/>
-              <w:bottom w:type="dxa" w:w="100"/>
-              <w:right w:type="dxa" w:w="120"/>
-            </w:tcMar>
-            <w:vAlign w:val="top"/>
-          </w:tcPr>
-          <w:p>
-            <w:r>
-              <w:rPr>
-                <w:b w:val="false"/>
-                <w:bCs w:val="false"/>
-                <w:color w:val="1F2A1F"/>
+            <w:shd w:fill="FBFAF6" w:val="clear"/>
+            <w:tcMar>
+              <w:top w:type="dxa" w:w="100"/>
+              <w:left w:type="dxa" w:w="120"/>
+              <w:bottom w:type="dxa" w:w="100"/>
+              <w:right w:type="dxa" w:w="120"/>
+            </w:tcMar>
+            <w:vAlign w:val="top"/>
+          </w:tcPr>
+          <w:p>
+            <w:r>
+              <w:rPr>
+                <w:b w:val="false"/>
+                <w:bCs w:val="false"/>
+                <w:color w:val="141414"/>
                 <w:sz w:val="20"/>
                 <w:szCs w:val="20"/>
               </w:rPr>
@@ -229,7 +249,7 @@
       </w:pPr>
       <w:r>
         <w:rPr>
-          <w:color w:val="1F2A1F"/>
+          <w:color w:val="141414"/>
           <w:sz w:val="21"/>
           <w:szCs w:val="21"/>
         </w:rPr>
@@ -242,6 +262,14 @@
         <w:spacing w:after="150" w:before="300"/>
       </w:pPr>
       <w:r>
+        <w:rPr>
+          <w:rFonts w:ascii="Archivo" w:cs="Archivo" w:eastAsia="Archivo" w:hAnsi="Archivo"/>
+          <w:b/>
+          <w:bCs/>
+          <w:color w:val="B8322A"/>
+          <w:sz w:val="24"/>
+          <w:szCs w:val="24"/>
+        </w:rPr>
         <w:t xml:space="preserve">Hoja de ruta</w:t>
       </w:r>
     </w:p>
@@ -267,7 +295,7 @@
         <w:tc>
           <w:tcPr>
             <w:tcW w:type="dxa" w:w="2000"/>
-            <w:shd w:fill="26402C" w:val="clear"/>
+            <w:shd w:fill="1D2B8F" w:val="clear"/>
             <w:tcMar>
               <w:top w:type="dxa" w:w="100"/>
               <w:left w:type="dxa" w:w="120"/>
@@ -292,7 +320,7 @@
         <w:tc>
           <w:tcPr>
             <w:tcW w:type="dxa" w:w="2340"/>
-            <w:shd w:fill="2E7D4F" w:val="clear"/>
+            <w:shd w:fill="1D2B8F" w:val="clear"/>
             <w:tcMar>
               <w:top w:type="dxa" w:w="100"/>
               <w:left w:type="dxa" w:w="120"/>
@@ -317,7 +345,32 @@
         <w:tc>
           <w:tcPr>
             <w:tcW w:type="dxa" w:w="2340"/>
-            <w:shd w:fill="C6821E" w:val="clear"/>
+            <w:shd w:fill="D9A21C" w:val="clear"/>
+            <w:tcMar>
+              <w:top w:type="dxa" w:w="100"/>
+              <w:left w:type="dxa" w:w="120"/>
+              <w:bottom w:type="dxa" w:w="100"/>
+              <w:right w:type="dxa" w:w="120"/>
+            </w:tcMar>
+            <w:vAlign w:val="top"/>
+          </w:tcPr>
+          <w:p>
+            <w:r>
+              <w:rPr>
+                <w:b/>
+                <w:bCs/>
+                <w:color w:val="141414"/>
+                <w:sz w:val="20"/>
+                <w:szCs w:val="20"/>
+              </w:rPr>
+              <w:t xml:space="preserve">P2 · 22.1.27</w:t>
+            </w:r>
+          </w:p>
+        </w:tc>
+        <w:tc>
+          <w:tcPr>
+            <w:tcW w:type="dxa" w:w="2340"/>
+            <w:shd w:fill="B8322A" w:val="clear"/>
             <w:tcMar>
               <w:top w:type="dxa" w:w="100"/>
               <w:left w:type="dxa" w:w="120"/>
@@ -335,32 +388,109 @@
                 <w:sz w:val="20"/>
                 <w:szCs w:val="20"/>
               </w:rPr>
-              <w:t xml:space="preserve">P2 · 22.1.27</w:t>
+              <w:t xml:space="preserve">P3 · 26.2.27</w:t>
+            </w:r>
+          </w:p>
+        </w:tc>
+      </w:tr>
+      <w:tr>
+        <w:tc>
+          <w:tcPr>
+            <w:tcW w:type="dxa" w:w="2000"/>
+            <w:shd w:fill="FBFAF6" w:val="clear"/>
+            <w:tcMar>
+              <w:top w:type="dxa" w:w="100"/>
+              <w:left w:type="dxa" w:w="120"/>
+              <w:bottom w:type="dxa" w:w="100"/>
+              <w:right w:type="dxa" w:w="120"/>
+            </w:tcMar>
+            <w:vAlign w:val="top"/>
+          </w:tcPr>
+          <w:p>
+            <w:r>
+              <w:rPr>
+                <w:b/>
+                <w:bCs/>
+                <w:color w:val="141414"/>
+                <w:sz w:val="20"/>
+                <w:szCs w:val="20"/>
+              </w:rPr>
+              <w:t xml:space="preserve">Qué se lanza</w:t>
             </w:r>
           </w:p>
         </w:tc>
         <w:tc>
           <w:tcPr>
             <w:tcW w:type="dxa" w:w="2340"/>
-            <w:shd w:fill="1D4E89" w:val="clear"/>
-            <w:tcMar>
-              <w:top w:type="dxa" w:w="100"/>
-              <w:left w:type="dxa" w:w="120"/>
-              <w:bottom w:type="dxa" w:w="100"/>
-              <w:right w:type="dxa" w:w="120"/>
-            </w:tcMar>
-            <w:vAlign w:val="top"/>
-          </w:tcPr>
-          <w:p>
-            <w:r>
-              <w:rPr>
-                <w:b/>
-                <w:bCs/>
-                <w:color w:val="FFFFFF"/>
-                <w:sz w:val="20"/>
-                <w:szCs w:val="20"/>
-              </w:rPr>
-              <w:t xml:space="preserve">P3 · 26.2.27</w:t>
+            <w:shd w:fill="FBFAF6" w:val="clear"/>
+            <w:tcMar>
+              <w:top w:type="dxa" w:w="100"/>
+              <w:left w:type="dxa" w:w="120"/>
+              <w:bottom w:type="dxa" w:w="100"/>
+              <w:right w:type="dxa" w:w="120"/>
+            </w:tcMar>
+            <w:vAlign w:val="top"/>
+          </w:tcPr>
+          <w:p>
+            <w:r>
+              <w:rPr>
+                <w:b w:val="false"/>
+                <w:bCs w:val="false"/>
+                <w:color w:val="141414"/>
+                <w:sz w:val="20"/>
+                <w:szCs w:val="20"/>
+              </w:rPr>
+              <w:t xml:space="preserve">Larder + Backend + List, en React. Gratis.</w:t>
+            </w:r>
+          </w:p>
+        </w:tc>
+        <w:tc>
+          <w:tcPr>
+            <w:tcW w:type="dxa" w:w="2340"/>
+            <w:shd w:fill="FBFAF6" w:val="clear"/>
+            <w:tcMar>
+              <w:top w:type="dxa" w:w="100"/>
+              <w:left w:type="dxa" w:w="120"/>
+              <w:bottom w:type="dxa" w:w="100"/>
+              <w:right w:type="dxa" w:w="120"/>
+            </w:tcMar>
+            <w:vAlign w:val="top"/>
+          </w:tcPr>
+          <w:p>
+            <w:r>
+              <w:rPr>
+                <w:b w:val="false"/>
+                <w:bCs w:val="false"/>
+                <w:color w:val="141414"/>
+                <w:sz w:val="20"/>
+                <w:szCs w:val="20"/>
+              </w:rPr>
+              <w:t xml:space="preserve">Track (módulo a medida sobre Odoo) + pantalla en React Native. Empieza el cobro (14,99€/año).</w:t>
+            </w:r>
+          </w:p>
+        </w:tc>
+        <w:tc>
+          <w:tcPr>
+            <w:tcW w:type="dxa" w:w="2340"/>
+            <w:shd w:fill="FBFAF6" w:val="clear"/>
+            <w:tcMar>
+              <w:top w:type="dxa" w:w="100"/>
+              <w:left w:type="dxa" w:w="120"/>
+              <w:bottom w:type="dxa" w:w="100"/>
+              <w:right w:type="dxa" w:w="120"/>
+            </w:tcMar>
+            <w:vAlign w:val="top"/>
+          </w:tcPr>
+          <w:p>
+            <w:r>
+              <w:rPr>
+                <w:b w:val="false"/>
+                <w:bCs w:val="false"/>
+                <w:color w:val="141414"/>
+                <w:sz w:val="20"/>
+                <w:szCs w:val="20"/>
+              </w:rPr>
+              <w:t xml:space="preserve">Compare + comisión por afiliación con supermercados.</w:t>
             </w:r>
           </w:p>
         </w:tc>
@@ -369,96 +499,148 @@
         <w:tc>
           <w:tcPr>
             <w:tcW w:type="dxa" w:w="2000"/>
-            <w:tcMar>
-              <w:top w:type="dxa" w:w="100"/>
-              <w:left w:type="dxa" w:w="120"/>
-              <w:bottom w:type="dxa" w:w="100"/>
-              <w:right w:type="dxa" w:w="120"/>
-            </w:tcMar>
-            <w:vAlign w:val="top"/>
-          </w:tcPr>
-          <w:p>
-            <w:r>
-              <w:rPr>
-                <w:b/>
-                <w:bCs/>
-                <w:color w:val="1F2A1F"/>
-                <w:sz w:val="20"/>
-                <w:szCs w:val="20"/>
-              </w:rPr>
-              <w:t xml:space="preserve">Qué se lanza</w:t>
+            <w:shd w:fill="FBFAF6" w:val="clear"/>
+            <w:tcMar>
+              <w:top w:type="dxa" w:w="100"/>
+              <w:left w:type="dxa" w:w="120"/>
+              <w:bottom w:type="dxa" w:w="100"/>
+              <w:right w:type="dxa" w:w="120"/>
+            </w:tcMar>
+            <w:vAlign w:val="top"/>
+          </w:tcPr>
+          <w:p>
+            <w:r>
+              <w:rPr>
+                <w:b/>
+                <w:bCs/>
+                <w:color w:val="141414"/>
+                <w:sz w:val="20"/>
+                <w:szCs w:val="20"/>
+              </w:rPr>
+              <w:t xml:space="preserve">Horas</w:t>
             </w:r>
           </w:p>
         </w:tc>
         <w:tc>
           <w:tcPr>
             <w:tcW w:type="dxa" w:w="2340"/>
-            <w:tcMar>
-              <w:top w:type="dxa" w:w="100"/>
-              <w:left w:type="dxa" w:w="120"/>
-              <w:bottom w:type="dxa" w:w="100"/>
-              <w:right w:type="dxa" w:w="120"/>
-            </w:tcMar>
-            <w:vAlign w:val="top"/>
-          </w:tcPr>
-          <w:p>
-            <w:r>
-              <w:rPr>
-                <w:b w:val="false"/>
-                <w:bCs w:val="false"/>
-                <w:color w:val="1F2A1F"/>
-                <w:sz w:val="20"/>
-                <w:szCs w:val="20"/>
-              </w:rPr>
-              <w:t xml:space="preserve">Larder + Backend + List, en React. Gratis.</w:t>
+            <w:shd w:fill="FBFAF6" w:val="clear"/>
+            <w:tcMar>
+              <w:top w:type="dxa" w:w="100"/>
+              <w:left w:type="dxa" w:w="120"/>
+              <w:bottom w:type="dxa" w:w="100"/>
+              <w:right w:type="dxa" w:w="120"/>
+            </w:tcMar>
+            <w:vAlign w:val="top"/>
+          </w:tcPr>
+          <w:p>
+            <w:r>
+              <w:rPr>
+                <w:b w:val="false"/>
+                <w:bCs w:val="false"/>
+                <w:color w:val="141414"/>
+                <w:sz w:val="20"/>
+                <w:szCs w:val="20"/>
+              </w:rPr>
+              <w:t xml:space="preserve">Larder — 17h</w:t>
+            </w:r>
+          </w:p>
+          <w:p>
+            <w:r>
+              <w:rPr>
+                <w:b w:val="false"/>
+                <w:bCs w:val="false"/>
+                <w:color w:val="141414"/>
+                <w:sz w:val="20"/>
+                <w:szCs w:val="20"/>
+              </w:rPr>
+              <w:t xml:space="preserve">Backend — 10h</w:t>
+            </w:r>
+          </w:p>
+          <w:p>
+            <w:r>
+              <w:rPr>
+                <w:b w:val="false"/>
+                <w:bCs w:val="false"/>
+                <w:color w:val="141414"/>
+                <w:sz w:val="20"/>
+                <w:szCs w:val="20"/>
+              </w:rPr>
+              <w:t xml:space="preserve">List — 30h</w:t>
             </w:r>
           </w:p>
         </w:tc>
         <w:tc>
           <w:tcPr>
             <w:tcW w:type="dxa" w:w="2340"/>
-            <w:tcMar>
-              <w:top w:type="dxa" w:w="100"/>
-              <w:left w:type="dxa" w:w="120"/>
-              <w:bottom w:type="dxa" w:w="100"/>
-              <w:right w:type="dxa" w:w="120"/>
-            </w:tcMar>
-            <w:vAlign w:val="top"/>
-          </w:tcPr>
-          <w:p>
-            <w:r>
-              <w:rPr>
-                <w:b w:val="false"/>
-                <w:bCs w:val="false"/>
-                <w:color w:val="1F2A1F"/>
-                <w:sz w:val="20"/>
-                <w:szCs w:val="20"/>
-              </w:rPr>
-              <w:t xml:space="preserve">Track (módulo a medida sobre Odoo) + pantalla en React Native. Empieza el cobro (14,99€/año).</w:t>
+            <w:shd w:fill="FBFAF6" w:val="clear"/>
+            <w:tcMar>
+              <w:top w:type="dxa" w:w="100"/>
+              <w:left w:type="dxa" w:w="120"/>
+              <w:bottom w:type="dxa" w:w="100"/>
+              <w:right w:type="dxa" w:w="120"/>
+            </w:tcMar>
+            <w:vAlign w:val="top"/>
+          </w:tcPr>
+          <w:p>
+            <w:r>
+              <w:rPr>
+                <w:b w:val="false"/>
+                <w:bCs w:val="false"/>
+                <w:color w:val="141414"/>
+                <w:sz w:val="20"/>
+                <w:szCs w:val="20"/>
+              </w:rPr>
+              <w:t xml:space="preserve">Track — 20h</w:t>
+            </w:r>
+          </w:p>
+          <w:p>
+            <w:r>
+              <w:rPr>
+                <w:b w:val="false"/>
+                <w:bCs w:val="false"/>
+                <w:color w:val="141414"/>
+                <w:sz w:val="20"/>
+                <w:szCs w:val="20"/>
+              </w:rPr>
+              <w:t xml:space="preserve">React Native — 10h</w:t>
             </w:r>
           </w:p>
         </w:tc>
         <w:tc>
           <w:tcPr>
             <w:tcW w:type="dxa" w:w="2340"/>
-            <w:tcMar>
-              <w:top w:type="dxa" w:w="100"/>
-              <w:left w:type="dxa" w:w="120"/>
-              <w:bottom w:type="dxa" w:w="100"/>
-              <w:right w:type="dxa" w:w="120"/>
-            </w:tcMar>
-            <w:vAlign w:val="top"/>
-          </w:tcPr>
-          <w:p>
-            <w:r>
-              <w:rPr>
-                <w:b w:val="false"/>
-                <w:bCs w:val="false"/>
-                <w:color w:val="1F2A1F"/>
-                <w:sz w:val="20"/>
-                <w:szCs w:val="20"/>
-              </w:rPr>
-              <w:t xml:space="preserve">Compare + comisión por afiliación con supermercados.</w:t>
+            <w:shd w:fill="FBFAF6" w:val="clear"/>
+            <w:tcMar>
+              <w:top w:type="dxa" w:w="100"/>
+              <w:left w:type="dxa" w:w="120"/>
+              <w:bottom w:type="dxa" w:w="100"/>
+              <w:right w:type="dxa" w:w="120"/>
+            </w:tcMar>
+            <w:vAlign w:val="top"/>
+          </w:tcPr>
+          <w:p>
+            <w:r>
+              <w:rPr>
+                <w:b w:val="false"/>
+                <w:bCs w:val="false"/>
+                <w:color w:val="141414"/>
+                <w:sz w:val="20"/>
+                <w:szCs w:val="20"/>
+              </w:rPr>
+              <w:t xml:space="preserve">Compare — 13h</w:t>
+            </w:r>
+          </w:p>
+          <w:p>
+            <w:r>
+              <w:rPr>
+                <w:b w:val="false"/>
+                <w:bCs w:val="false"/>
+                <w:color w:val="141414"/>
+                <w:sz w:val="20"/>
+                <w:szCs w:val="20"/>
+              </w:rPr>
+              <w:t xml:space="preserve">Comisión — 10h (?)</w:t>
             </w:r>
           </w:p>
         </w:tc>
@@ -467,298 +649,156 @@
         <w:tc>
           <w:tcPr>
             <w:tcW w:type="dxa" w:w="2000"/>
-            <w:tcMar>
-              <w:top w:type="dxa" w:w="100"/>
-              <w:left w:type="dxa" w:w="120"/>
-              <w:bottom w:type="dxa" w:w="100"/>
-              <w:right w:type="dxa" w:w="120"/>
-            </w:tcMar>
-            <w:vAlign w:val="top"/>
-          </w:tcPr>
-          <w:p>
-            <w:r>
-              <w:rPr>
-                <w:b/>
-                <w:bCs/>
-                <w:color w:val="1F2A1F"/>
-                <w:sz w:val="20"/>
-                <w:szCs w:val="20"/>
-              </w:rPr>
-              <w:t xml:space="preserve">Horas</w:t>
+            <w:shd w:fill="FBFAF6" w:val="clear"/>
+            <w:tcMar>
+              <w:top w:type="dxa" w:w="100"/>
+              <w:left w:type="dxa" w:w="120"/>
+              <w:bottom w:type="dxa" w:w="100"/>
+              <w:right w:type="dxa" w:w="120"/>
+            </w:tcMar>
+            <w:vAlign w:val="top"/>
+          </w:tcPr>
+          <w:p>
+            <w:r>
+              <w:rPr>
+                <w:b/>
+                <w:bCs/>
+                <w:color w:val="141414"/>
+                <w:sz w:val="20"/>
+                <w:szCs w:val="20"/>
+              </w:rPr>
+              <w:t xml:space="preserve">Criterio de salida</w:t>
             </w:r>
           </w:p>
         </w:tc>
         <w:tc>
           <w:tcPr>
             <w:tcW w:type="dxa" w:w="2340"/>
-            <w:tcMar>
-              <w:top w:type="dxa" w:w="100"/>
-              <w:left w:type="dxa" w:w="120"/>
-              <w:bottom w:type="dxa" w:w="100"/>
-              <w:right w:type="dxa" w:w="120"/>
-            </w:tcMar>
-            <w:vAlign w:val="top"/>
-          </w:tcPr>
-          <w:p>
-            <w:r>
-              <w:rPr>
-                <w:b w:val="false"/>
-                <w:bCs w:val="false"/>
-                <w:color w:val="1F2A1F"/>
-                <w:sz w:val="20"/>
-                <w:szCs w:val="20"/>
-              </w:rPr>
-              <w:t xml:space="preserve">Larder — 17h</w:t>
-            </w:r>
-          </w:p>
-          <w:p>
-            <w:r>
-              <w:rPr>
-                <w:b w:val="false"/>
-                <w:bCs w:val="false"/>
-                <w:color w:val="1F2A1F"/>
-                <w:sz w:val="20"/>
-                <w:szCs w:val="20"/>
-              </w:rPr>
-              <w:t xml:space="preserve">Backend — 10h</w:t>
-            </w:r>
-          </w:p>
-          <w:p>
-            <w:r>
-              <w:rPr>
-                <w:b w:val="false"/>
-                <w:bCs w:val="false"/>
-                <w:color w:val="1F2A1F"/>
-                <w:sz w:val="20"/>
-                <w:szCs w:val="20"/>
-              </w:rPr>
-              <w:t xml:space="preserve">List — 30h</w:t>
+            <w:shd w:fill="FBFAF6" w:val="clear"/>
+            <w:tcMar>
+              <w:top w:type="dxa" w:w="100"/>
+              <w:left w:type="dxa" w:w="120"/>
+              <w:bottom w:type="dxa" w:w="100"/>
+              <w:right w:type="dxa" w:w="120"/>
+            </w:tcMar>
+            <w:vAlign w:val="top"/>
+          </w:tcPr>
+          <w:p>
+            <w:r>
+              <w:rPr>
+                <w:b w:val="false"/>
+                <w:bCs w:val="false"/>
+                <w:color w:val="141414"/>
+                <w:sz w:val="20"/>
+                <w:szCs w:val="20"/>
+              </w:rPr>
+              <w:t xml:space="preserve">Items se loggean correctamente</w:t>
+            </w:r>
+          </w:p>
+          <w:p>
+            <w:r>
+              <w:rPr>
+                <w:b w:val="false"/>
+                <w:bCs w:val="false"/>
+                <w:color w:val="141414"/>
+                <w:sz w:val="20"/>
+                <w:szCs w:val="20"/>
+              </w:rPr>
+              <w:t xml:space="preserve">API calls correctas</w:t>
+            </w:r>
+          </w:p>
+          <w:p>
+            <w:r>
+              <w:rPr>
+                <w:b w:val="false"/>
+                <w:bCs w:val="false"/>
+                <w:color w:val="141414"/>
+                <w:sz w:val="20"/>
+                <w:szCs w:val="20"/>
+              </w:rPr>
+              <w:t xml:space="preserve">Reconocimiento de ticket</w:t>
+            </w:r>
+          </w:p>
+          <w:p>
+            <w:r>
+              <w:rPr>
+                <w:b w:val="false"/>
+                <w:bCs w:val="false"/>
+                <w:color w:val="141414"/>
+                <w:sz w:val="20"/>
+                <w:szCs w:val="20"/>
+              </w:rPr>
+              <w:t xml:space="preserve">Automatización Lista ↔ Larder</w:t>
             </w:r>
           </w:p>
         </w:tc>
         <w:tc>
           <w:tcPr>
             <w:tcW w:type="dxa" w:w="2340"/>
-            <w:tcMar>
-              <w:top w:type="dxa" w:w="100"/>
-              <w:left w:type="dxa" w:w="120"/>
-              <w:bottom w:type="dxa" w:w="100"/>
-              <w:right w:type="dxa" w:w="120"/>
-            </w:tcMar>
-            <w:vAlign w:val="top"/>
-          </w:tcPr>
-          <w:p>
-            <w:r>
-              <w:rPr>
-                <w:b w:val="false"/>
-                <w:bCs w:val="false"/>
-                <w:color w:val="1F2A1F"/>
-                <w:sz w:val="20"/>
-                <w:szCs w:val="20"/>
-              </w:rPr>
-              <w:t xml:space="preserve">Track — 20h</w:t>
-            </w:r>
-          </w:p>
-          <w:p>
-            <w:r>
-              <w:rPr>
-                <w:b w:val="false"/>
-                <w:bCs w:val="false"/>
-                <w:color w:val="1F2A1F"/>
-                <w:sz w:val="20"/>
-                <w:szCs w:val="20"/>
-              </w:rPr>
-              <w:t xml:space="preserve">React Native — 10h</w:t>
+            <w:shd w:fill="FBFAF6" w:val="clear"/>
+            <w:tcMar>
+              <w:top w:type="dxa" w:w="100"/>
+              <w:left w:type="dxa" w:w="120"/>
+              <w:bottom w:type="dxa" w:w="100"/>
+              <w:right w:type="dxa" w:w="120"/>
+            </w:tcMar>
+            <w:vAlign w:val="top"/>
+          </w:tcPr>
+          <w:p>
+            <w:r>
+              <w:rPr>
+                <w:b w:val="false"/>
+                <w:bCs w:val="false"/>
+                <w:color w:val="141414"/>
+                <w:sz w:val="20"/>
+                <w:szCs w:val="20"/>
+              </w:rPr>
+              <w:t xml:space="preserve">Cálculo correcto de deudas entre usuarios</w:t>
+            </w:r>
+          </w:p>
+          <w:p>
+            <w:r>
+              <w:rPr>
+                <w:b w:val="false"/>
+                <w:bCs w:val="false"/>
+                <w:color w:val="141414"/>
+                <w:sz w:val="20"/>
+                <w:szCs w:val="20"/>
+              </w:rPr>
+              <w:t xml:space="preserve">Lectura correcta de items comprados</w:t>
+            </w:r>
+          </w:p>
+          <w:p>
+            <w:r>
+              <w:rPr>
+                <w:b w:val="false"/>
+                <w:bCs w:val="false"/>
+                <w:color w:val="141414"/>
+                <w:sz w:val="20"/>
+                <w:szCs w:val="20"/>
+              </w:rPr>
+              <w:t xml:space="preserve">Export exitoso de app móvil</w:t>
             </w:r>
           </w:p>
         </w:tc>
         <w:tc>
           <w:tcPr>
             <w:tcW w:type="dxa" w:w="2340"/>
-            <w:tcMar>
-              <w:top w:type="dxa" w:w="100"/>
-              <w:left w:type="dxa" w:w="120"/>
-              <w:bottom w:type="dxa" w:w="100"/>
-              <w:right w:type="dxa" w:w="120"/>
-            </w:tcMar>
-            <w:vAlign w:val="top"/>
-          </w:tcPr>
-          <w:p>
-            <w:r>
-              <w:rPr>
-                <w:b w:val="false"/>
-                <w:bCs w:val="false"/>
-                <w:color w:val="1F2A1F"/>
-                <w:sz w:val="20"/>
-                <w:szCs w:val="20"/>
-              </w:rPr>
-              <w:t xml:space="preserve">Compare — 13h</w:t>
-            </w:r>
-          </w:p>
-          <w:p>
-            <w:r>
-              <w:rPr>
-                <w:b w:val="false"/>
-                <w:bCs w:val="false"/>
-                <w:color w:val="1F2A1F"/>
-                <w:sz w:val="20"/>
-                <w:szCs w:val="20"/>
-              </w:rPr>
-              <w:t xml:space="preserve">Comisión — 10h (?)</w:t>
-            </w:r>
-          </w:p>
-        </w:tc>
-      </w:tr>
-      <w:tr>
-        <w:tc>
-          <w:tcPr>
-            <w:tcW w:type="dxa" w:w="2000"/>
-            <w:tcMar>
-              <w:top w:type="dxa" w:w="100"/>
-              <w:left w:type="dxa" w:w="120"/>
-              <w:bottom w:type="dxa" w:w="100"/>
-              <w:right w:type="dxa" w:w="120"/>
-            </w:tcMar>
-            <w:vAlign w:val="top"/>
-          </w:tcPr>
-          <w:p>
-            <w:r>
-              <w:rPr>
-                <w:b/>
-                <w:bCs/>
-                <w:color w:val="1F2A1F"/>
-                <w:sz w:val="20"/>
-                <w:szCs w:val="20"/>
-              </w:rPr>
-              <w:t xml:space="preserve">Criterio de salida</w:t>
-            </w:r>
-          </w:p>
-        </w:tc>
-        <w:tc>
-          <w:tcPr>
-            <w:tcW w:type="dxa" w:w="2340"/>
-            <w:tcMar>
-              <w:top w:type="dxa" w:w="100"/>
-              <w:left w:type="dxa" w:w="120"/>
-              <w:bottom w:type="dxa" w:w="100"/>
-              <w:right w:type="dxa" w:w="120"/>
-            </w:tcMar>
-            <w:vAlign w:val="top"/>
-          </w:tcPr>
-          <w:p>
-            <w:r>
-              <w:rPr>
-                <w:b w:val="false"/>
-                <w:bCs w:val="false"/>
-                <w:color w:val="1F2A1F"/>
-                <w:sz w:val="20"/>
-                <w:szCs w:val="20"/>
-              </w:rPr>
-              <w:t xml:space="preserve">Items se loggean correctamente</w:t>
-            </w:r>
-          </w:p>
-          <w:p>
-            <w:r>
-              <w:rPr>
-                <w:b w:val="false"/>
-                <w:bCs w:val="false"/>
-                <w:color w:val="1F2A1F"/>
-                <w:sz w:val="20"/>
-                <w:szCs w:val="20"/>
-              </w:rPr>
-              <w:t xml:space="preserve">API calls correctas</w:t>
-            </w:r>
-          </w:p>
-          <w:p>
-            <w:r>
-              <w:rPr>
-                <w:b w:val="false"/>
-                <w:bCs w:val="false"/>
-                <w:color w:val="1F2A1F"/>
-                <w:sz w:val="20"/>
-                <w:szCs w:val="20"/>
-              </w:rPr>
-              <w:t xml:space="preserve">Reconocimiento de ticket</w:t>
-            </w:r>
-          </w:p>
-          <w:p>
-            <w:r>
-              <w:rPr>
-                <w:b w:val="false"/>
-                <w:bCs w:val="false"/>
-                <w:color w:val="1F2A1F"/>
-                <w:sz w:val="20"/>
-                <w:szCs w:val="20"/>
-              </w:rPr>
-              <w:t xml:space="preserve">Automatización Lista ↔ Larder</w:t>
-            </w:r>
-          </w:p>
-        </w:tc>
-        <w:tc>
-          <w:tcPr>
-            <w:tcW w:type="dxa" w:w="2340"/>
-            <w:tcMar>
-              <w:top w:type="dxa" w:w="100"/>
-              <w:left w:type="dxa" w:w="120"/>
-              <w:bottom w:type="dxa" w:w="100"/>
-              <w:right w:type="dxa" w:w="120"/>
-            </w:tcMar>
-            <w:vAlign w:val="top"/>
-          </w:tcPr>
-          <w:p>
-            <w:r>
-              <w:rPr>
-                <w:b w:val="false"/>
-                <w:bCs w:val="false"/>
-                <w:color w:val="1F2A1F"/>
-                <w:sz w:val="20"/>
-                <w:szCs w:val="20"/>
-              </w:rPr>
-              <w:t xml:space="preserve">Cálculo correcto de deudas entre usuarios</w:t>
-            </w:r>
-          </w:p>
-          <w:p>
-            <w:r>
-              <w:rPr>
-                <w:b w:val="false"/>
-                <w:bCs w:val="false"/>
-                <w:color w:val="1F2A1F"/>
-                <w:sz w:val="20"/>
-                <w:szCs w:val="20"/>
-              </w:rPr>
-              <w:t xml:space="preserve">Lectura correcta de items comprados</w:t>
-            </w:r>
-          </w:p>
-          <w:p>
-            <w:r>
-              <w:rPr>
-                <w:b w:val="false"/>
-                <w:bCs w:val="false"/>
-                <w:color w:val="1F2A1F"/>
-                <w:sz w:val="20"/>
-                <w:szCs w:val="20"/>
-              </w:rPr>
-              <w:t xml:space="preserve">Export exitoso de app móvil</w:t>
-            </w:r>
-          </w:p>
-        </w:tc>
-        <w:tc>
-          <w:tcPr>
-            <w:tcW w:type="dxa" w:w="2340"/>
-            <w:tcMar>
-              <w:top w:type="dxa" w:w="100"/>
-              <w:left w:type="dxa" w:w="120"/>
-              <w:bottom w:type="dxa" w:w="100"/>
-              <w:right w:type="dxa" w:w="120"/>
-            </w:tcMar>
-            <w:vAlign w:val="top"/>
-          </w:tcPr>
-          <w:p>
-            <w:r>
-              <w:rPr>
-                <w:b w:val="false"/>
-                <w:bCs w:val="false"/>
-                <w:color w:val="1F2A1F"/>
+            <w:shd w:fill="FBFAF6" w:val="clear"/>
+            <w:tcMar>
+              <w:top w:type="dxa" w:w="100"/>
+              <w:left w:type="dxa" w:w="120"/>
+              <w:bottom w:type="dxa" w:w="100"/>
+              <w:right w:type="dxa" w:w="120"/>
+            </w:tcMar>
+            <w:vAlign w:val="top"/>
+          </w:tcPr>
+          <w:p>
+            <w:r>
+              <w:rPr>
+                <w:b w:val="false"/>
+                <w:bCs w:val="false"/>
+                <w:color w:val="141414"/>
                 <w:sz w:val="20"/>
                 <w:szCs w:val="20"/>
               </w:rPr>
@@ -770,7 +810,7 @@
               <w:rPr>
                 <w:b w:val="false"/>
                 <w:bCs w:val="false"/>
-                <w:color w:val="1F2A1F"/>
+                <w:color w:val="141414"/>
                 <w:sz w:val="20"/>
                 <w:szCs w:val="20"/>
               </w:rPr>
@@ -786,7 +826,7 @@
       </w:pPr>
       <w:r>
         <w:rPr>
-          <w:color w:val="1F2A1F"/>
+          <w:color w:val="141414"/>
           <w:sz w:val="21"/>
           <w:szCs w:val="21"/>
         </w:rPr>
@@ -799,6 +839,14 @@
         <w:spacing w:after="150" w:before="300"/>
       </w:pPr>
       <w:r>
+        <w:rPr>
+          <w:rFonts w:ascii="Archivo" w:cs="Archivo" w:eastAsia="Archivo" w:hAnsi="Archivo"/>
+          <w:b/>
+          <w:bCs/>
+          <w:color w:val="B8322A"/>
+          <w:sz w:val="24"/>
+          <w:szCs w:val="24"/>
+        </w:rPr>
         <w:t xml:space="preserve">Inversión</w:t>
       </w:r>
     </w:p>
@@ -822,7 +870,7 @@
         <w:tc>
           <w:tcPr>
             <w:tcW w:type="dxa" w:w="2400"/>
-            <w:shd w:fill="26402C" w:val="clear"/>
+            <w:shd w:fill="1D2B8F" w:val="clear"/>
             <w:tcMar>
               <w:top w:type="dxa" w:w="100"/>
               <w:left w:type="dxa" w:w="120"/>
@@ -847,7 +895,7 @@
         <w:tc>
           <w:tcPr>
             <w:tcW w:type="dxa" w:w="6620"/>
-            <w:shd w:fill="26402C" w:val="clear"/>
+            <w:shd w:fill="1D2B8F" w:val="clear"/>
             <w:tcMar>
               <w:top w:type="dxa" w:w="100"/>
               <w:left w:type="dxa" w:w="120"/>
@@ -874,20 +922,21 @@
         <w:tc>
           <w:tcPr>
             <w:tcW w:type="dxa" w:w="2400"/>
-            <w:tcMar>
-              <w:top w:type="dxa" w:w="100"/>
-              <w:left w:type="dxa" w:w="120"/>
-              <w:bottom w:type="dxa" w:w="100"/>
-              <w:right w:type="dxa" w:w="120"/>
-            </w:tcMar>
-            <w:vAlign w:val="top"/>
-          </w:tcPr>
-          <w:p>
-            <w:r>
-              <w:rPr>
-                <w:b/>
-                <w:bCs/>
-                <w:color w:val="1F2A1F"/>
+            <w:shd w:fill="FBFAF6" w:val="clear"/>
+            <w:tcMar>
+              <w:top w:type="dxa" w:w="100"/>
+              <w:left w:type="dxa" w:w="120"/>
+              <w:bottom w:type="dxa" w:w="100"/>
+              <w:right w:type="dxa" w:w="120"/>
+            </w:tcMar>
+            <w:vAlign w:val="top"/>
+          </w:tcPr>
+          <w:p>
+            <w:r>
+              <w:rPr>
+                <w:b/>
+                <w:bCs/>
+                <w:color w:val="141414"/>
                 <w:sz w:val="20"/>
                 <w:szCs w:val="20"/>
               </w:rPr>
@@ -898,20 +947,21 @@
         <w:tc>
           <w:tcPr>
             <w:tcW w:type="dxa" w:w="6620"/>
-            <w:tcMar>
-              <w:top w:type="dxa" w:w="100"/>
-              <w:left w:type="dxa" w:w="120"/>
-              <w:bottom w:type="dxa" w:w="100"/>
-              <w:right w:type="dxa" w:w="120"/>
-            </w:tcMar>
-            <w:vAlign w:val="top"/>
-          </w:tcPr>
-          <w:p>
-            <w:r>
-              <w:rPr>
-                <w:b w:val="false"/>
-                <w:bCs w:val="false"/>
-                <w:color w:val="1F2A1F"/>
+            <w:shd w:fill="FBFAF6" w:val="clear"/>
+            <w:tcMar>
+              <w:top w:type="dxa" w:w="100"/>
+              <w:left w:type="dxa" w:w="120"/>
+              <w:bottom w:type="dxa" w:w="100"/>
+              <w:right w:type="dxa" w:w="120"/>
+            </w:tcMar>
+            <w:vAlign w:val="top"/>
+          </w:tcPr>
+          <w:p>
+            <w:r>
+              <w:rPr>
+                <w:b w:val="false"/>
+                <w:bCs w:val="false"/>
+                <w:color w:val="141414"/>
                 <w:sz w:val="20"/>
                 <w:szCs w:val="20"/>
               </w:rPr>
@@ -924,20 +974,21 @@
         <w:tc>
           <w:tcPr>
             <w:tcW w:type="dxa" w:w="2400"/>
-            <w:tcMar>
-              <w:top w:type="dxa" w:w="100"/>
-              <w:left w:type="dxa" w:w="120"/>
-              <w:bottom w:type="dxa" w:w="100"/>
-              <w:right w:type="dxa" w:w="120"/>
-            </w:tcMar>
-            <w:vAlign w:val="top"/>
-          </w:tcPr>
-          <w:p>
-            <w:r>
-              <w:rPr>
-                <w:b/>
-                <w:bCs/>
-                <w:color w:val="1F2A1F"/>
+            <w:shd w:fill="FBFAF6" w:val="clear"/>
+            <w:tcMar>
+              <w:top w:type="dxa" w:w="100"/>
+              <w:left w:type="dxa" w:w="120"/>
+              <w:bottom w:type="dxa" w:w="100"/>
+              <w:right w:type="dxa" w:w="120"/>
+            </w:tcMar>
+            <w:vAlign w:val="top"/>
+          </w:tcPr>
+          <w:p>
+            <w:r>
+              <w:rPr>
+                <w:b/>
+                <w:bCs/>
+                <w:color w:val="141414"/>
                 <w:sz w:val="20"/>
                 <w:szCs w:val="20"/>
               </w:rPr>
@@ -948,20 +999,21 @@
         <w:tc>
           <w:tcPr>
             <w:tcW w:type="dxa" w:w="6620"/>
-            <w:tcMar>
-              <w:top w:type="dxa" w:w="100"/>
-              <w:left w:type="dxa" w:w="120"/>
-              <w:bottom w:type="dxa" w:w="100"/>
-              <w:right w:type="dxa" w:w="120"/>
-            </w:tcMar>
-            <w:vAlign w:val="top"/>
-          </w:tcPr>
-          <w:p>
-            <w:r>
-              <w:rPr>
-                <w:b w:val="false"/>
-                <w:bCs w:val="false"/>
-                <w:color w:val="1F2A1F"/>
+            <w:shd w:fill="FBFAF6" w:val="clear"/>
+            <w:tcMar>
+              <w:top w:type="dxa" w:w="100"/>
+              <w:left w:type="dxa" w:w="120"/>
+              <w:bottom w:type="dxa" w:w="100"/>
+              <w:right w:type="dxa" w:w="120"/>
+            </w:tcMar>
+            <w:vAlign w:val="top"/>
+          </w:tcPr>
+          <w:p>
+            <w:r>
+              <w:rPr>
+                <w:b w:val="false"/>
+                <w:bCs w:val="false"/>
+                <w:color w:val="141414"/>
                 <w:sz w:val="20"/>
                 <w:szCs w:val="20"/>
               </w:rPr>
@@ -977,7 +1029,7 @@
       </w:pPr>
       <w:r>
         <w:rPr>
-          <w:color w:val="1F2A1F"/>
+          <w:color w:val="141414"/>
           <w:sz w:val="21"/>
           <w:szCs w:val="21"/>
         </w:rPr>
@@ -990,6 +1042,14 @@
         <w:spacing w:after="150" w:before="300"/>
       </w:pPr>
       <w:r>
+        <w:rPr>
+          <w:rFonts w:ascii="Archivo" w:cs="Archivo" w:eastAsia="Archivo" w:hAnsi="Archivo"/>
+          <w:b/>
+          <w:bCs/>
+          <w:color w:val="B8322A"/>
+          <w:sz w:val="24"/>
+          <w:szCs w:val="24"/>
+        </w:rPr>
         <w:t xml:space="preserve">Riesgos</w:t>
       </w:r>
     </w:p>
@@ -1013,7 +1073,7 @@
         <w:tc>
           <w:tcPr>
             <w:tcW w:type="dxa" w:w="4510"/>
-            <w:shd w:fill="26402C" w:val="clear"/>
+            <w:shd w:fill="B8322A" w:val="clear"/>
             <w:tcMar>
               <w:top w:type="dxa" w:w="100"/>
               <w:left w:type="dxa" w:w="120"/>
@@ -1038,7 +1098,7 @@
         <w:tc>
           <w:tcPr>
             <w:tcW w:type="dxa" w:w="4510"/>
-            <w:shd w:fill="26402C" w:val="clear"/>
+            <w:shd w:fill="B8322A" w:val="clear"/>
             <w:tcMar>
               <w:top w:type="dxa" w:w="100"/>
               <w:left w:type="dxa" w:w="120"/>
@@ -1065,20 +1125,21 @@
         <w:tc>
           <w:tcPr>
             <w:tcW w:type="dxa" w:w="4510"/>
-            <w:tcMar>
-              <w:top w:type="dxa" w:w="100"/>
-              <w:left w:type="dxa" w:w="120"/>
-              <w:bottom w:type="dxa" w:w="100"/>
-              <w:right w:type="dxa" w:w="120"/>
-            </w:tcMar>
-            <w:vAlign w:val="top"/>
-          </w:tcPr>
-          <w:p>
-            <w:r>
-              <w:rPr>
-                <w:b w:val="false"/>
-                <w:bCs w:val="false"/>
-                <w:color w:val="1F2A1F"/>
+            <w:shd w:fill="FBFAF6" w:val="clear"/>
+            <w:tcMar>
+              <w:top w:type="dxa" w:w="100"/>
+              <w:left w:type="dxa" w:w="120"/>
+              <w:bottom w:type="dxa" w:w="100"/>
+              <w:right w:type="dxa" w:w="120"/>
+            </w:tcMar>
+            <w:vAlign w:val="top"/>
+          </w:tcPr>
+          <w:p>
+            <w:r>
+              <w:rPr>
+                <w:b w:val="false"/>
+                <w:bCs w:val="false"/>
+                <w:color w:val="141414"/>
                 <w:sz w:val="20"/>
                 <w:szCs w:val="20"/>
               </w:rPr>
@@ -1089,20 +1150,21 @@
         <w:tc>
           <w:tcPr>
             <w:tcW w:type="dxa" w:w="4510"/>
-            <w:tcMar>
-              <w:top w:type="dxa" w:w="100"/>
-              <w:left w:type="dxa" w:w="120"/>
-              <w:bottom w:type="dxa" w:w="100"/>
-              <w:right w:type="dxa" w:w="120"/>
-            </w:tcMar>
-            <w:vAlign w:val="top"/>
-          </w:tcPr>
-          <w:p>
-            <w:r>
-              <w:rPr>
-                <w:b w:val="false"/>
-                <w:bCs w:val="false"/>
-                <w:color w:val="1F2A1F"/>
+            <w:shd w:fill="FBFAF6" w:val="clear"/>
+            <w:tcMar>
+              <w:top w:type="dxa" w:w="100"/>
+              <w:left w:type="dxa" w:w="120"/>
+              <w:bottom w:type="dxa" w:w="100"/>
+              <w:right w:type="dxa" w:w="120"/>
+            </w:tcMar>
+            <w:vAlign w:val="top"/>
+          </w:tcPr>
+          <w:p>
+            <w:r>
+              <w:rPr>
+                <w:b w:val="false"/>
+                <w:bCs w:val="false"/>
+                <w:color w:val="141414"/>
                 <w:sz w:val="20"/>
                 <w:szCs w:val="20"/>
               </w:rPr>
@@ -1115,20 +1177,21 @@
         <w:tc>
           <w:tcPr>
             <w:tcW w:type="dxa" w:w="4510"/>
-            <w:tcMar>
-              <w:top w:type="dxa" w:w="100"/>
-              <w:left w:type="dxa" w:w="120"/>
-              <w:bottom w:type="dxa" w:w="100"/>
-              <w:right w:type="dxa" w:w="120"/>
-            </w:tcMar>
-            <w:vAlign w:val="top"/>
-          </w:tcPr>
-          <w:p>
-            <w:r>
-              <w:rPr>
-                <w:b w:val="false"/>
-                <w:bCs w:val="false"/>
-                <w:color w:val="1F2A1F"/>
+            <w:shd w:fill="FBFAF6" w:val="clear"/>
+            <w:tcMar>
+              <w:top w:type="dxa" w:w="100"/>
+              <w:left w:type="dxa" w:w="120"/>
+              <w:bottom w:type="dxa" w:w="100"/>
+              <w:right w:type="dxa" w:w="120"/>
+            </w:tcMar>
+            <w:vAlign w:val="top"/>
+          </w:tcPr>
+          <w:p>
+            <w:r>
+              <w:rPr>
+                <w:b w:val="false"/>
+                <w:bCs w:val="false"/>
+                <w:color w:val="141414"/>
                 <w:sz w:val="20"/>
                 <w:szCs w:val="20"/>
               </w:rPr>
@@ -1139,20 +1202,21 @@
         <w:tc>
           <w:tcPr>
             <w:tcW w:type="dxa" w:w="4510"/>
-            <w:tcMar>
-              <w:top w:type="dxa" w:w="100"/>
-              <w:left w:type="dxa" w:w="120"/>
-              <w:bottom w:type="dxa" w:w="100"/>
-              <w:right w:type="dxa" w:w="120"/>
-            </w:tcMar>
-            <w:vAlign w:val="top"/>
-          </w:tcPr>
-          <w:p>
-            <w:r>
-              <w:rPr>
-                <w:b w:val="false"/>
-                <w:bCs w:val="false"/>
-                <w:color w:val="1F2A1F"/>
+            <w:shd w:fill="FBFAF6" w:val="clear"/>
+            <w:tcMar>
+              <w:top w:type="dxa" w:w="100"/>
+              <w:left w:type="dxa" w:w="120"/>
+              <w:bottom w:type="dxa" w:w="100"/>
+              <w:right w:type="dxa" w:w="120"/>
+            </w:tcMar>
+            <w:vAlign w:val="top"/>
+          </w:tcPr>
+          <w:p>
+            <w:r>
+              <w:rPr>
+                <w:b w:val="false"/>
+                <w:bCs w:val="false"/>
+                <w:color w:val="141414"/>
                 <w:sz w:val="20"/>
                 <w:szCs w:val="20"/>
               </w:rPr>
@@ -1165,20 +1229,21 @@
         <w:tc>
           <w:tcPr>
             <w:tcW w:type="dxa" w:w="4510"/>
-            <w:tcMar>
-              <w:top w:type="dxa" w:w="100"/>
-              <w:left w:type="dxa" w:w="120"/>
-              <w:bottom w:type="dxa" w:w="100"/>
-              <w:right w:type="dxa" w:w="120"/>
-            </w:tcMar>
-            <w:vAlign w:val="top"/>
-          </w:tcPr>
-          <w:p>
-            <w:r>
-              <w:rPr>
-                <w:b w:val="false"/>
-                <w:bCs w:val="false"/>
-                <w:color w:val="1F2A1F"/>
+            <w:shd w:fill="FBFAF6" w:val="clear"/>
+            <w:tcMar>
+              <w:top w:type="dxa" w:w="100"/>
+              <w:left w:type="dxa" w:w="120"/>
+              <w:bottom w:type="dxa" w:w="100"/>
+              <w:right w:type="dxa" w:w="120"/>
+            </w:tcMar>
+            <w:vAlign w:val="top"/>
+          </w:tcPr>
+          <w:p>
+            <w:r>
+              <w:rPr>
+                <w:b w:val="false"/>
+                <w:bCs w:val="false"/>
+                <w:color w:val="141414"/>
                 <w:sz w:val="20"/>
                 <w:szCs w:val="20"/>
               </w:rPr>
@@ -1189,20 +1254,21 @@
         <w:tc>
           <w:tcPr>
             <w:tcW w:type="dxa" w:w="4510"/>
-            <w:tcMar>
-              <w:top w:type="dxa" w:w="100"/>
-              <w:left w:type="dxa" w:w="120"/>
-              <w:bottom w:type="dxa" w:w="100"/>
-              <w:right w:type="dxa" w:w="120"/>
-            </w:tcMar>
-            <w:vAlign w:val="top"/>
-          </w:tcPr>
-          <w:p>
-            <w:r>
-              <w:rPr>
-                <w:b w:val="false"/>
-                <w:bCs w:val="false"/>
-                <w:color w:val="1F2A1F"/>
+            <w:shd w:fill="FBFAF6" w:val="clear"/>
+            <w:tcMar>
+              <w:top w:type="dxa" w:w="100"/>
+              <w:left w:type="dxa" w:w="120"/>
+              <w:bottom w:type="dxa" w:w="100"/>
+              <w:right w:type="dxa" w:w="120"/>
+            </w:tcMar>
+            <w:vAlign w:val="top"/>
+          </w:tcPr>
+          <w:p>
+            <w:r>
+              <w:rPr>
+                <w:b w:val="false"/>
+                <w:bCs w:val="false"/>
+                <w:color w:val="141414"/>
                 <w:sz w:val="20"/>
                 <w:szCs w:val="20"/>
               </w:rPr>
@@ -1215,9 +1281,20 @@
     <w:p>
       <w:pPr>
         <w:pStyle w:val="Heading1"/>
-        <w:spacing w:after="200" w:before="400"/>
-      </w:pPr>
-      <w:r>
+        <w:pBdr>
+          <w:bottom w:val="single" w:color="F6D649" w:sz="16" w:space="4"/>
+        </w:pBdr>
+        <w:spacing w:after="200" w:before="420"/>
+      </w:pPr>
+      <w:r>
+        <w:rPr>
+          <w:rFonts w:ascii="Archivo" w:cs="Archivo" w:eastAsia="Archivo" w:hAnsi="Archivo"/>
+          <w:b/>
+          <w:bCs/>
+          <w:color w:val="1D2B8F"/>
+          <w:sz w:val="30"/>
+          <w:szCs w:val="30"/>
+        </w:rPr>
         <w:t xml:space="preserve">2 · Los dos casos de uso</w:t>
       </w:r>
     </w:p>
@@ -1227,6 +1304,14 @@
         <w:spacing w:after="150" w:before="300"/>
       </w:pPr>
       <w:r>
+        <w:rPr>
+          <w:rFonts w:ascii="Archivo" w:cs="Archivo" w:eastAsia="Archivo" w:hAnsi="Archivo"/>
+          <w:b/>
+          <w:bCs/>
+          <w:color w:val="B8322A"/>
+          <w:sz w:val="24"/>
+          <w:szCs w:val="24"/>
+        </w:rPr>
         <w:t xml:space="preserve">Caso de uso 1 — Marcar un item como "out" en Larder</w:t>
       </w:r>
     </w:p>
@@ -1250,7 +1335,7 @@
         <w:tc>
           <w:tcPr>
             <w:tcW w:type="dxa" w:w="2000"/>
-            <w:shd w:fill="26402C" w:val="clear"/>
+            <w:shd w:fill="1D2B8F" w:val="clear"/>
             <w:tcMar>
               <w:top w:type="dxa" w:w="100"/>
               <w:left w:type="dxa" w:w="120"/>
@@ -1275,7 +1360,7 @@
         <w:tc>
           <w:tcPr>
             <w:tcW w:type="dxa" w:w="7020"/>
-            <w:shd w:fill="26402C" w:val="clear"/>
+            <w:shd w:fill="1D2B8F" w:val="clear"/>
             <w:tcMar>
               <w:top w:type="dxa" w:w="100"/>
               <w:left w:type="dxa" w:w="120"/>
@@ -1302,20 +1387,21 @@
         <w:tc>
           <w:tcPr>
             <w:tcW w:type="dxa" w:w="2000"/>
-            <w:tcMar>
-              <w:top w:type="dxa" w:w="100"/>
-              <w:left w:type="dxa" w:w="120"/>
-              <w:bottom w:type="dxa" w:w="100"/>
-              <w:right w:type="dxa" w:w="120"/>
-            </w:tcMar>
-            <w:vAlign w:val="top"/>
-          </w:tcPr>
-          <w:p>
-            <w:r>
-              <w:rPr>
-                <w:b/>
-                <w:bCs/>
-                <w:color w:val="1F2A1F"/>
+            <w:shd w:fill="FBFAF6" w:val="clear"/>
+            <w:tcMar>
+              <w:top w:type="dxa" w:w="100"/>
+              <w:left w:type="dxa" w:w="120"/>
+              <w:bottom w:type="dxa" w:w="100"/>
+              <w:right w:type="dxa" w:w="120"/>
+            </w:tcMar>
+            <w:vAlign w:val="top"/>
+          </w:tcPr>
+          <w:p>
+            <w:r>
+              <w:rPr>
+                <w:b/>
+                <w:bCs/>
+                <w:color w:val="141414"/>
                 <w:sz w:val="20"/>
                 <w:szCs w:val="20"/>
               </w:rPr>
@@ -1326,20 +1412,21 @@
         <w:tc>
           <w:tcPr>
             <w:tcW w:type="dxa" w:w="7020"/>
-            <w:tcMar>
-              <w:top w:type="dxa" w:w="100"/>
-              <w:left w:type="dxa" w:w="120"/>
-              <w:bottom w:type="dxa" w:w="100"/>
-              <w:right w:type="dxa" w:w="120"/>
-            </w:tcMar>
-            <w:vAlign w:val="top"/>
-          </w:tcPr>
-          <w:p>
-            <w:r>
-              <w:rPr>
-                <w:b w:val="false"/>
-                <w:bCs w:val="false"/>
-                <w:color w:val="1F2A1F"/>
+            <w:shd w:fill="FBFAF6" w:val="clear"/>
+            <w:tcMar>
+              <w:top w:type="dxa" w:w="100"/>
+              <w:left w:type="dxa" w:w="120"/>
+              <w:bottom w:type="dxa" w:w="100"/>
+              <w:right w:type="dxa" w:w="120"/>
+            </w:tcMar>
+            <w:vAlign w:val="top"/>
+          </w:tcPr>
+          <w:p>
+            <w:r>
+              <w:rPr>
+                <w:b w:val="false"/>
+                <w:bCs w:val="false"/>
+                <w:color w:val="141414"/>
                 <w:sz w:val="20"/>
                 <w:szCs w:val="20"/>
               </w:rPr>
@@ -1352,20 +1439,21 @@
         <w:tc>
           <w:tcPr>
             <w:tcW w:type="dxa" w:w="2000"/>
-            <w:tcMar>
-              <w:top w:type="dxa" w:w="100"/>
-              <w:left w:type="dxa" w:w="120"/>
-              <w:bottom w:type="dxa" w:w="100"/>
-              <w:right w:type="dxa" w:w="120"/>
-            </w:tcMar>
-            <w:vAlign w:val="top"/>
-          </w:tcPr>
-          <w:p>
-            <w:r>
-              <w:rPr>
-                <w:b/>
-                <w:bCs/>
-                <w:color w:val="1F2A1F"/>
+            <w:shd w:fill="FBFAF6" w:val="clear"/>
+            <w:tcMar>
+              <w:top w:type="dxa" w:w="100"/>
+              <w:left w:type="dxa" w:w="120"/>
+              <w:bottom w:type="dxa" w:w="100"/>
+              <w:right w:type="dxa" w:w="120"/>
+            </w:tcMar>
+            <w:vAlign w:val="top"/>
+          </w:tcPr>
+          <w:p>
+            <w:r>
+              <w:rPr>
+                <w:b/>
+                <w:bCs/>
+                <w:color w:val="141414"/>
                 <w:sz w:val="20"/>
                 <w:szCs w:val="20"/>
               </w:rPr>
@@ -1376,20 +1464,21 @@
         <w:tc>
           <w:tcPr>
             <w:tcW w:type="dxa" w:w="7020"/>
-            <w:tcMar>
-              <w:top w:type="dxa" w:w="100"/>
-              <w:left w:type="dxa" w:w="120"/>
-              <w:bottom w:type="dxa" w:w="100"/>
-              <w:right w:type="dxa" w:w="120"/>
-            </w:tcMar>
-            <w:vAlign w:val="top"/>
-          </w:tcPr>
-          <w:p>
-            <w:r>
-              <w:rPr>
-                <w:b w:val="false"/>
-                <w:bCs w:val="false"/>
-                <w:color w:val="1F2A1F"/>
+            <w:shd w:fill="FBFAF6" w:val="clear"/>
+            <w:tcMar>
+              <w:top w:type="dxa" w:w="100"/>
+              <w:left w:type="dxa" w:w="120"/>
+              <w:bottom w:type="dxa" w:w="100"/>
+              <w:right w:type="dxa" w:w="120"/>
+            </w:tcMar>
+            <w:vAlign w:val="top"/>
+          </w:tcPr>
+          <w:p>
+            <w:r>
+              <w:rPr>
+                <w:b w:val="false"/>
+                <w:bCs w:val="false"/>
+                <w:color w:val="141414"/>
                 <w:sz w:val="20"/>
                 <w:szCs w:val="20"/>
               </w:rPr>
@@ -1401,7 +1490,7 @@
               <w:rPr>
                 <w:b w:val="false"/>
                 <w:bCs w:val="false"/>
-                <w:color w:val="1F2A1F"/>
+                <w:color w:val="141414"/>
                 <w:sz w:val="20"/>
                 <w:szCs w:val="20"/>
               </w:rPr>
@@ -1413,7 +1502,7 @@
               <w:rPr>
                 <w:b w:val="false"/>
                 <w:bCs w:val="false"/>
-                <w:color w:val="1F2A1F"/>
+                <w:color w:val="141414"/>
                 <w:sz w:val="20"/>
                 <w:szCs w:val="20"/>
               </w:rPr>
@@ -1425,7 +1514,7 @@
               <w:rPr>
                 <w:b w:val="false"/>
                 <w:bCs w:val="false"/>
-                <w:color w:val="1F2A1F"/>
+                <w:color w:val="141414"/>
                 <w:sz w:val="20"/>
                 <w:szCs w:val="20"/>
               </w:rPr>
@@ -1438,20 +1527,21 @@
         <w:tc>
           <w:tcPr>
             <w:tcW w:type="dxa" w:w="2000"/>
-            <w:tcMar>
-              <w:top w:type="dxa" w:w="100"/>
-              <w:left w:type="dxa" w:w="120"/>
-              <w:bottom w:type="dxa" w:w="100"/>
-              <w:right w:type="dxa" w:w="120"/>
-            </w:tcMar>
-            <w:vAlign w:val="top"/>
-          </w:tcPr>
-          <w:p>
-            <w:r>
-              <w:rPr>
-                <w:b/>
-                <w:bCs/>
-                <w:color w:val="1F2A1F"/>
+            <w:shd w:fill="FBFAF6" w:val="clear"/>
+            <w:tcMar>
+              <w:top w:type="dxa" w:w="100"/>
+              <w:left w:type="dxa" w:w="120"/>
+              <w:bottom w:type="dxa" w:w="100"/>
+              <w:right w:type="dxa" w:w="120"/>
+            </w:tcMar>
+            <w:vAlign w:val="top"/>
+          </w:tcPr>
+          <w:p>
+            <w:r>
+              <w:rPr>
+                <w:b/>
+                <w:bCs/>
+                <w:color w:val="141414"/>
                 <w:sz w:val="20"/>
                 <w:szCs w:val="20"/>
               </w:rPr>
@@ -1462,20 +1552,21 @@
         <w:tc>
           <w:tcPr>
             <w:tcW w:type="dxa" w:w="7020"/>
-            <w:tcMar>
-              <w:top w:type="dxa" w:w="100"/>
-              <w:left w:type="dxa" w:w="120"/>
-              <w:bottom w:type="dxa" w:w="100"/>
-              <w:right w:type="dxa" w:w="120"/>
-            </w:tcMar>
-            <w:vAlign w:val="top"/>
-          </w:tcPr>
-          <w:p>
-            <w:r>
-              <w:rPr>
-                <w:b w:val="false"/>
-                <w:bCs w:val="false"/>
-                <w:color w:val="1F2A1F"/>
+            <w:shd w:fill="FBFAF6" w:val="clear"/>
+            <w:tcMar>
+              <w:top w:type="dxa" w:w="100"/>
+              <w:left w:type="dxa" w:w="120"/>
+              <w:bottom w:type="dxa" w:w="100"/>
+              <w:right w:type="dxa" w:w="120"/>
+            </w:tcMar>
+            <w:vAlign w:val="top"/>
+          </w:tcPr>
+          <w:p>
+            <w:r>
+              <w:rPr>
+                <w:b w:val="false"/>
+                <w:bCs w:val="false"/>
+                <w:color w:val="141414"/>
                 <w:sz w:val="20"/>
                 <w:szCs w:val="20"/>
               </w:rPr>
@@ -1488,20 +1579,21 @@
         <w:tc>
           <w:tcPr>
             <w:tcW w:type="dxa" w:w="2000"/>
-            <w:tcMar>
-              <w:top w:type="dxa" w:w="100"/>
-              <w:left w:type="dxa" w:w="120"/>
-              <w:bottom w:type="dxa" w:w="100"/>
-              <w:right w:type="dxa" w:w="120"/>
-            </w:tcMar>
-            <w:vAlign w:val="top"/>
-          </w:tcPr>
-          <w:p>
-            <w:r>
-              <w:rPr>
-                <w:b/>
-                <w:bCs/>
-                <w:color w:val="1F2A1F"/>
+            <w:shd w:fill="FBFAF6" w:val="clear"/>
+            <w:tcMar>
+              <w:top w:type="dxa" w:w="100"/>
+              <w:left w:type="dxa" w:w="120"/>
+              <w:bottom w:type="dxa" w:w="100"/>
+              <w:right w:type="dxa" w:w="120"/>
+            </w:tcMar>
+            <w:vAlign w:val="top"/>
+          </w:tcPr>
+          <w:p>
+            <w:r>
+              <w:rPr>
+                <w:b/>
+                <w:bCs/>
+                <w:color w:val="141414"/>
                 <w:sz w:val="20"/>
                 <w:szCs w:val="20"/>
               </w:rPr>
@@ -1512,20 +1604,21 @@
         <w:tc>
           <w:tcPr>
             <w:tcW w:type="dxa" w:w="7020"/>
-            <w:tcMar>
-              <w:top w:type="dxa" w:w="100"/>
-              <w:left w:type="dxa" w:w="120"/>
-              <w:bottom w:type="dxa" w:w="100"/>
-              <w:right w:type="dxa" w:w="120"/>
-            </w:tcMar>
-            <w:vAlign w:val="top"/>
-          </w:tcPr>
-          <w:p>
-            <w:r>
-              <w:rPr>
-                <w:b w:val="false"/>
-                <w:bCs w:val="false"/>
-                <w:color w:val="1F2A1F"/>
+            <w:shd w:fill="FBFAF6" w:val="clear"/>
+            <w:tcMar>
+              <w:top w:type="dxa" w:w="100"/>
+              <w:left w:type="dxa" w:w="120"/>
+              <w:bottom w:type="dxa" w:w="100"/>
+              <w:right w:type="dxa" w:w="120"/>
+            </w:tcMar>
+            <w:vAlign w:val="top"/>
+          </w:tcPr>
+          <w:p>
+            <w:r>
+              <w:rPr>
+                <w:b w:val="false"/>
+                <w:bCs w:val="false"/>
+                <w:color w:val="141414"/>
                 <w:sz w:val="20"/>
                 <w:szCs w:val="20"/>
               </w:rPr>
@@ -1537,7 +1630,7 @@
               <w:rPr>
                 <w:b w:val="false"/>
                 <w:bCs w:val="false"/>
-                <w:color w:val="1F2A1F"/>
+                <w:color w:val="141414"/>
                 <w:sz w:val="20"/>
                 <w:szCs w:val="20"/>
               </w:rPr>
@@ -1553,6 +1646,14 @@
         <w:spacing w:after="150" w:before="300"/>
       </w:pPr>
       <w:r>
+        <w:rPr>
+          <w:rFonts w:ascii="Archivo" w:cs="Archivo" w:eastAsia="Archivo" w:hAnsi="Archivo"/>
+          <w:b/>
+          <w:bCs/>
+          <w:color w:val="B8322A"/>
+          <w:sz w:val="24"/>
+          <w:szCs w:val="24"/>
+        </w:rPr>
         <w:t xml:space="preserve">Caso de uso 2 — Marcar como comprado un item dentro de List</w:t>
       </w:r>
     </w:p>
@@ -1576,7 +1677,7 @@
         <w:tc>
           <w:tcPr>
             <w:tcW w:type="dxa" w:w="2000"/>
-            <w:shd w:fill="26402C" w:val="clear"/>
+            <w:shd w:fill="1D2B8F" w:val="clear"/>
             <w:tcMar>
               <w:top w:type="dxa" w:w="100"/>
               <w:left w:type="dxa" w:w="120"/>
@@ -1601,7 +1702,7 @@
         <w:tc>
           <w:tcPr>
             <w:tcW w:type="dxa" w:w="7020"/>
-            <w:shd w:fill="26402C" w:val="clear"/>
+            <w:shd w:fill="1D2B8F" w:val="clear"/>
             <w:tcMar>
               <w:top w:type="dxa" w:w="100"/>
               <w:left w:type="dxa" w:w="120"/>
@@ -1628,20 +1729,21 @@
         <w:tc>
           <w:tcPr>
             <w:tcW w:type="dxa" w:w="2000"/>
-            <w:tcMar>
-              <w:top w:type="dxa" w:w="100"/>
-              <w:left w:type="dxa" w:w="120"/>
-              <w:bottom w:type="dxa" w:w="100"/>
-              <w:right w:type="dxa" w:w="120"/>
-            </w:tcMar>
-            <w:vAlign w:val="top"/>
-          </w:tcPr>
-          <w:p>
-            <w:r>
-              <w:rPr>
-                <w:b/>
-                <w:bCs/>
-                <w:color w:val="1F2A1F"/>
+            <w:shd w:fill="FBFAF6" w:val="clear"/>
+            <w:tcMar>
+              <w:top w:type="dxa" w:w="100"/>
+              <w:left w:type="dxa" w:w="120"/>
+              <w:bottom w:type="dxa" w:w="100"/>
+              <w:right w:type="dxa" w:w="120"/>
+            </w:tcMar>
+            <w:vAlign w:val="top"/>
+          </w:tcPr>
+          <w:p>
+            <w:r>
+              <w:rPr>
+                <w:b/>
+                <w:bCs/>
+                <w:color w:val="141414"/>
                 <w:sz w:val="20"/>
                 <w:szCs w:val="20"/>
               </w:rPr>
@@ -1652,20 +1754,21 @@
         <w:tc>
           <w:tcPr>
             <w:tcW w:type="dxa" w:w="7020"/>
-            <w:tcMar>
-              <w:top w:type="dxa" w:w="100"/>
-              <w:left w:type="dxa" w:w="120"/>
-              <w:bottom w:type="dxa" w:w="100"/>
-              <w:right w:type="dxa" w:w="120"/>
-            </w:tcMar>
-            <w:vAlign w:val="top"/>
-          </w:tcPr>
-          <w:p>
-            <w:r>
-              <w:rPr>
-                <w:b w:val="false"/>
-                <w:bCs w:val="false"/>
-                <w:color w:val="1F2A1F"/>
+            <w:shd w:fill="FBFAF6" w:val="clear"/>
+            <w:tcMar>
+              <w:top w:type="dxa" w:w="100"/>
+              <w:left w:type="dxa" w:w="120"/>
+              <w:bottom w:type="dxa" w:w="100"/>
+              <w:right w:type="dxa" w:w="120"/>
+            </w:tcMar>
+            <w:vAlign w:val="top"/>
+          </w:tcPr>
+          <w:p>
+            <w:r>
+              <w:rPr>
+                <w:b w:val="false"/>
+                <w:bCs w:val="false"/>
+                <w:color w:val="141414"/>
                 <w:sz w:val="20"/>
                 <w:szCs w:val="20"/>
               </w:rPr>
@@ -1678,20 +1781,21 @@
         <w:tc>
           <w:tcPr>
             <w:tcW w:type="dxa" w:w="2000"/>
-            <w:tcMar>
-              <w:top w:type="dxa" w:w="100"/>
-              <w:left w:type="dxa" w:w="120"/>
-              <w:bottom w:type="dxa" w:w="100"/>
-              <w:right w:type="dxa" w:w="120"/>
-            </w:tcMar>
-            <w:vAlign w:val="top"/>
-          </w:tcPr>
-          <w:p>
-            <w:r>
-              <w:rPr>
-                <w:b/>
-                <w:bCs/>
-                <w:color w:val="1F2A1F"/>
+            <w:shd w:fill="FBFAF6" w:val="clear"/>
+            <w:tcMar>
+              <w:top w:type="dxa" w:w="100"/>
+              <w:left w:type="dxa" w:w="120"/>
+              <w:bottom w:type="dxa" w:w="100"/>
+              <w:right w:type="dxa" w:w="120"/>
+            </w:tcMar>
+            <w:vAlign w:val="top"/>
+          </w:tcPr>
+          <w:p>
+            <w:r>
+              <w:rPr>
+                <w:b/>
+                <w:bCs/>
+                <w:color w:val="141414"/>
                 <w:sz w:val="20"/>
                 <w:szCs w:val="20"/>
               </w:rPr>
@@ -1702,20 +1806,21 @@
         <w:tc>
           <w:tcPr>
             <w:tcW w:type="dxa" w:w="7020"/>
-            <w:tcMar>
-              <w:top w:type="dxa" w:w="100"/>
-              <w:left w:type="dxa" w:w="120"/>
-              <w:bottom w:type="dxa" w:w="100"/>
-              <w:right w:type="dxa" w:w="120"/>
-            </w:tcMar>
-            <w:vAlign w:val="top"/>
-          </w:tcPr>
-          <w:p>
-            <w:r>
-              <w:rPr>
-                <w:b w:val="false"/>
-                <w:bCs w:val="false"/>
-                <w:color w:val="1F2A1F"/>
+            <w:shd w:fill="FBFAF6" w:val="clear"/>
+            <w:tcMar>
+              <w:top w:type="dxa" w:w="100"/>
+              <w:left w:type="dxa" w:w="120"/>
+              <w:bottom w:type="dxa" w:w="100"/>
+              <w:right w:type="dxa" w:w="120"/>
+            </w:tcMar>
+            <w:vAlign w:val="top"/>
+          </w:tcPr>
+          <w:p>
+            <w:r>
+              <w:rPr>
+                <w:b w:val="false"/>
+                <w:bCs w:val="false"/>
+                <w:color w:val="141414"/>
                 <w:sz w:val="20"/>
                 <w:szCs w:val="20"/>
               </w:rPr>
@@ -1727,7 +1832,7 @@
               <w:rPr>
                 <w:b w:val="false"/>
                 <w:bCs w:val="false"/>
-                <w:color w:val="1F2A1F"/>
+                <w:color w:val="141414"/>
                 <w:sz w:val="20"/>
                 <w:szCs w:val="20"/>
               </w:rPr>
@@ -1740,20 +1845,21 @@
         <w:tc>
           <w:tcPr>
             <w:tcW w:type="dxa" w:w="2000"/>
-            <w:tcMar>
-              <w:top w:type="dxa" w:w="100"/>
-              <w:left w:type="dxa" w:w="120"/>
-              <w:bottom w:type="dxa" w:w="100"/>
-              <w:right w:type="dxa" w:w="120"/>
-            </w:tcMar>
-            <w:vAlign w:val="top"/>
-          </w:tcPr>
-          <w:p>
-            <w:r>
-              <w:rPr>
-                <w:b/>
-                <w:bCs/>
-                <w:color w:val="1F2A1F"/>
+            <w:shd w:fill="FBFAF6" w:val="clear"/>
+            <w:tcMar>
+              <w:top w:type="dxa" w:w="100"/>
+              <w:left w:type="dxa" w:w="120"/>
+              <w:bottom w:type="dxa" w:w="100"/>
+              <w:right w:type="dxa" w:w="120"/>
+            </w:tcMar>
+            <w:vAlign w:val="top"/>
+          </w:tcPr>
+          <w:p>
+            <w:r>
+              <w:rPr>
+                <w:b/>
+                <w:bCs/>
+                <w:color w:val="141414"/>
                 <w:sz w:val="20"/>
                 <w:szCs w:val="20"/>
               </w:rPr>
@@ -1764,20 +1870,21 @@
         <w:tc>
           <w:tcPr>
             <w:tcW w:type="dxa" w:w="7020"/>
-            <w:tcMar>
-              <w:top w:type="dxa" w:w="100"/>
-              <w:left w:type="dxa" w:w="120"/>
-              <w:bottom w:type="dxa" w:w="100"/>
-              <w:right w:type="dxa" w:w="120"/>
-            </w:tcMar>
-            <w:vAlign w:val="top"/>
-          </w:tcPr>
-          <w:p>
-            <w:r>
-              <w:rPr>
-                <w:b w:val="false"/>
-                <w:bCs w:val="false"/>
-                <w:color w:val="1F2A1F"/>
+            <w:shd w:fill="FBFAF6" w:val="clear"/>
+            <w:tcMar>
+              <w:top w:type="dxa" w:w="100"/>
+              <w:left w:type="dxa" w:w="120"/>
+              <w:bottom w:type="dxa" w:w="100"/>
+              <w:right w:type="dxa" w:w="120"/>
+            </w:tcMar>
+            <w:vAlign w:val="top"/>
+          </w:tcPr>
+          <w:p>
+            <w:r>
+              <w:rPr>
+                <w:b w:val="false"/>
+                <w:bCs w:val="false"/>
+                <w:color w:val="141414"/>
                 <w:sz w:val="20"/>
                 <w:szCs w:val="20"/>
               </w:rPr>
@@ -1790,20 +1897,21 @@
         <w:tc>
           <w:tcPr>
             <w:tcW w:type="dxa" w:w="2000"/>
-            <w:tcMar>
-              <w:top w:type="dxa" w:w="100"/>
-              <w:left w:type="dxa" w:w="120"/>
-              <w:bottom w:type="dxa" w:w="100"/>
-              <w:right w:type="dxa" w:w="120"/>
-            </w:tcMar>
-            <w:vAlign w:val="top"/>
-          </w:tcPr>
-          <w:p>
-            <w:r>
-              <w:rPr>
-                <w:b/>
-                <w:bCs/>
-                <w:color w:val="1F2A1F"/>
+            <w:shd w:fill="FBFAF6" w:val="clear"/>
+            <w:tcMar>
+              <w:top w:type="dxa" w:w="100"/>
+              <w:left w:type="dxa" w:w="120"/>
+              <w:bottom w:type="dxa" w:w="100"/>
+              <w:right w:type="dxa" w:w="120"/>
+            </w:tcMar>
+            <w:vAlign w:val="top"/>
+          </w:tcPr>
+          <w:p>
+            <w:r>
+              <w:rPr>
+                <w:b/>
+                <w:bCs/>
+                <w:color w:val="141414"/>
                 <w:sz w:val="20"/>
                 <w:szCs w:val="20"/>
               </w:rPr>
@@ -1814,20 +1922,21 @@
         <w:tc>
           <w:tcPr>
             <w:tcW w:type="dxa" w:w="7020"/>
-            <w:tcMar>
-              <w:top w:type="dxa" w:w="100"/>
-              <w:left w:type="dxa" w:w="120"/>
-              <w:bottom w:type="dxa" w:w="100"/>
-              <w:right w:type="dxa" w:w="120"/>
-            </w:tcMar>
-            <w:vAlign w:val="top"/>
-          </w:tcPr>
-          <w:p>
-            <w:r>
-              <w:rPr>
-                <w:b w:val="false"/>
-                <w:bCs w:val="false"/>
-                <w:color w:val="1F2A1F"/>
+            <w:shd w:fill="FBFAF6" w:val="clear"/>
+            <w:tcMar>
+              <w:top w:type="dxa" w:w="100"/>
+              <w:left w:type="dxa" w:w="120"/>
+              <w:bottom w:type="dxa" w:w="100"/>
+              <w:right w:type="dxa" w:w="120"/>
+            </w:tcMar>
+            <w:vAlign w:val="top"/>
+          </w:tcPr>
+          <w:p>
+            <w:r>
+              <w:rPr>
+                <w:b w:val="false"/>
+                <w:bCs w:val="false"/>
+                <w:color w:val="141414"/>
                 <w:sz w:val="20"/>
                 <w:szCs w:val="20"/>
               </w:rPr>
@@ -1840,17 +1949,29 @@
     <w:p>
       <w:pPr>
         <w:pStyle w:val="Heading1"/>
-        <w:spacing w:after="200" w:before="400"/>
-      </w:pPr>
-      <w:r>
+        <w:pBdr>
+          <w:bottom w:val="single" w:color="F6D649" w:sz="16" w:space="4"/>
+        </w:pBdr>
+        <w:spacing w:after="200" w:before="420"/>
+      </w:pPr>
+      <w:r>
+        <w:rPr>
+          <w:rFonts w:ascii="Archivo" w:cs="Archivo" w:eastAsia="Archivo" w:hAnsi="Archivo"/>
+          <w:b/>
+          <w:bCs/>
+          <w:color w:val="1D2B8F"/>
+          <w:sz w:val="30"/>
+          <w:szCs w:val="30"/>
+        </w:rPr>
         <w:t xml:space="preserve">3 · Delimitación con el ERP  (Sistemas de Xestión Empresarial)</w:t>
       </w:r>
     </w:p>
     <w:p>
       <w:pPr>
         <w:pBdr>
-          <w:left w:val="single" w:color="C6821E" w:sz="18" w:space="8"/>
+          <w:left w:val="single" w:color="D9A21C" w:sz="24" w:space="8"/>
         </w:pBdr>
+        <w:shd w:fill="FBFAF6" w:val="clear"/>
         <w:spacing w:after="200" w:before="100"/>
         <w:ind w:left="200"/>
       </w:pPr>
@@ -1858,7 +1979,7 @@
         <w:rPr>
           <w:i/>
           <w:iCs/>
-          <w:color w:val="5B6559"/>
+          <w:color w:val="6B6259"/>
           <w:sz w:val="20"/>
           <w:szCs w:val="20"/>
         </w:rPr>
@@ -1871,6 +1992,14 @@
         <w:spacing w:after="150" w:before="300"/>
       </w:pPr>
       <w:r>
+        <w:rPr>
+          <w:rFonts w:ascii="Archivo" w:cs="Archivo" w:eastAsia="Archivo" w:hAnsi="Archivo"/>
+          <w:b/>
+          <w:bCs/>
+          <w:color w:val="B8322A"/>
+          <w:sz w:val="24"/>
+          <w:szCs w:val="24"/>
+        </w:rPr>
         <w:t xml:space="preserve">Con Odoo</w:t>
       </w:r>
     </w:p>
@@ -1894,7 +2023,7 @@
         <w:tc>
           <w:tcPr>
             <w:tcW w:type="dxa" w:w="3000"/>
-            <w:shd w:fill="26402C" w:val="clear"/>
+            <w:shd w:fill="1D2B8F" w:val="clear"/>
             <w:tcMar>
               <w:top w:type="dxa" w:w="100"/>
               <w:left w:type="dxa" w:w="120"/>
@@ -1919,7 +2048,7 @@
         <w:tc>
           <w:tcPr>
             <w:tcW w:type="dxa" w:w="6020"/>
-            <w:shd w:fill="26402C" w:val="clear"/>
+            <w:shd w:fill="1D2B8F" w:val="clear"/>
             <w:tcMar>
               <w:top w:type="dxa" w:w="100"/>
               <w:left w:type="dxa" w:w="120"/>
@@ -1946,20 +2075,21 @@
         <w:tc>
           <w:tcPr>
             <w:tcW w:type="dxa" w:w="3000"/>
-            <w:tcMar>
-              <w:top w:type="dxa" w:w="100"/>
-              <w:left w:type="dxa" w:w="120"/>
-              <w:bottom w:type="dxa" w:w="100"/>
-              <w:right w:type="dxa" w:w="120"/>
-            </w:tcMar>
-            <w:vAlign w:val="top"/>
-          </w:tcPr>
-          <w:p>
-            <w:r>
-              <w:rPr>
-                <w:b/>
-                <w:bCs/>
-                <w:color w:val="1F2A1F"/>
+            <w:shd w:fill="FBFAF6" w:val="clear"/>
+            <w:tcMar>
+              <w:top w:type="dxa" w:w="100"/>
+              <w:left w:type="dxa" w:w="120"/>
+              <w:bottom w:type="dxa" w:w="100"/>
+              <w:right w:type="dxa" w:w="120"/>
+            </w:tcMar>
+            <w:vAlign w:val="top"/>
+          </w:tcPr>
+          <w:p>
+            <w:r>
+              <w:rPr>
+                <w:b/>
+                <w:bCs/>
+                <w:color w:val="141414"/>
                 <w:sz w:val="20"/>
                 <w:szCs w:val="20"/>
               </w:rPr>
@@ -1970,20 +2100,21 @@
         <w:tc>
           <w:tcPr>
             <w:tcW w:type="dxa" w:w="6020"/>
-            <w:tcMar>
-              <w:top w:type="dxa" w:w="100"/>
-              <w:left w:type="dxa" w:w="120"/>
-              <w:bottom w:type="dxa" w:w="100"/>
-              <w:right w:type="dxa" w:w="120"/>
-            </w:tcMar>
-            <w:vAlign w:val="top"/>
-          </w:tcPr>
-          <w:p>
-            <w:r>
-              <w:rPr>
-                <w:b w:val="false"/>
-                <w:bCs w:val="false"/>
-                <w:color w:val="1F2A1F"/>
+            <w:shd w:fill="FBFAF6" w:val="clear"/>
+            <w:tcMar>
+              <w:top w:type="dxa" w:w="100"/>
+              <w:left w:type="dxa" w:w="120"/>
+              <w:bottom w:type="dxa" w:w="100"/>
+              <w:right w:type="dxa" w:w="120"/>
+            </w:tcMar>
+            <w:vAlign w:val="top"/>
+          </w:tcPr>
+          <w:p>
+            <w:r>
+              <w:rPr>
+                <w:b w:val="false"/>
+                <w:bCs w:val="false"/>
+                <w:color w:val="141414"/>
                 <w:sz w:val="20"/>
                 <w:szCs w:val="20"/>
               </w:rPr>
@@ -1995,7 +2126,7 @@
               <w:rPr>
                 <w:b w:val="false"/>
                 <w:bCs w:val="false"/>
-                <w:color w:val="1F2A1F"/>
+                <w:color w:val="141414"/>
                 <w:sz w:val="20"/>
                 <w:szCs w:val="20"/>
               </w:rPr>
@@ -2008,20 +2139,21 @@
         <w:tc>
           <w:tcPr>
             <w:tcW w:type="dxa" w:w="3000"/>
-            <w:tcMar>
-              <w:top w:type="dxa" w:w="100"/>
-              <w:left w:type="dxa" w:w="120"/>
-              <w:bottom w:type="dxa" w:w="100"/>
-              <w:right w:type="dxa" w:w="120"/>
-            </w:tcMar>
-            <w:vAlign w:val="top"/>
-          </w:tcPr>
-          <w:p>
-            <w:r>
-              <w:rPr>
-                <w:b/>
-                <w:bCs/>
-                <w:color w:val="1F2A1F"/>
+            <w:shd w:fill="FBFAF6" w:val="clear"/>
+            <w:tcMar>
+              <w:top w:type="dxa" w:w="100"/>
+              <w:left w:type="dxa" w:w="120"/>
+              <w:bottom w:type="dxa" w:w="100"/>
+              <w:right w:type="dxa" w:w="120"/>
+            </w:tcMar>
+            <w:vAlign w:val="top"/>
+          </w:tcPr>
+          <w:p>
+            <w:r>
+              <w:rPr>
+                <w:b/>
+                <w:bCs/>
+                <w:color w:val="141414"/>
                 <w:sz w:val="20"/>
                 <w:szCs w:val="20"/>
               </w:rPr>
@@ -2032,20 +2164,21 @@
         <w:tc>
           <w:tcPr>
             <w:tcW w:type="dxa" w:w="6020"/>
-            <w:tcMar>
-              <w:top w:type="dxa" w:w="100"/>
-              <w:left w:type="dxa" w:w="120"/>
-              <w:bottom w:type="dxa" w:w="100"/>
-              <w:right w:type="dxa" w:w="120"/>
-            </w:tcMar>
-            <w:vAlign w:val="top"/>
-          </w:tcPr>
-          <w:p>
-            <w:r>
-              <w:rPr>
-                <w:b w:val="false"/>
-                <w:bCs w:val="false"/>
-                <w:color w:val="1F2A1F"/>
+            <w:shd w:fill="FBFAF6" w:val="clear"/>
+            <w:tcMar>
+              <w:top w:type="dxa" w:w="100"/>
+              <w:left w:type="dxa" w:w="120"/>
+              <w:bottom w:type="dxa" w:w="100"/>
+              <w:right w:type="dxa" w:w="120"/>
+            </w:tcMar>
+            <w:vAlign w:val="top"/>
+          </w:tcPr>
+          <w:p>
+            <w:r>
+              <w:rPr>
+                <w:b w:val="false"/>
+                <w:bCs w:val="false"/>
+                <w:color w:val="141414"/>
                 <w:sz w:val="20"/>
                 <w:szCs w:val="20"/>
               </w:rPr>
@@ -2058,8 +2191,9 @@
     <w:p>
       <w:pPr>
         <w:pBdr>
-          <w:left w:val="single" w:color="C6821E" w:sz="18" w:space="8"/>
+          <w:left w:val="single" w:color="D9A21C" w:sz="24" w:space="8"/>
         </w:pBdr>
+        <w:shd w:fill="FBFAF6" w:val="clear"/>
         <w:spacing w:after="200" w:before="100"/>
         <w:ind w:left="200"/>
       </w:pPr>
@@ -2067,7 +2201,7 @@
         <w:rPr>
           <w:i/>
           <w:iCs/>
-          <w:color w:val="5B6559"/>
+          <w:color w:val="6B6259"/>
           <w:sz w:val="20"/>
           <w:szCs w:val="20"/>
         </w:rPr>
@@ -2082,7 +2216,7 @@
         <w:rPr>
           <w:i/>
           <w:iCs/>
-          <w:color w:val="5B6559"/>
+          <w:color w:val="6B6259"/>
           <w:sz w:val="21"/>
           <w:szCs w:val="21"/>
         </w:rPr>
@@ -2092,9 +2226,20 @@
     <w:p>
       <w:pPr>
         <w:pStyle w:val="Heading1"/>
-        <w:spacing w:after="200" w:before="400"/>
-      </w:pPr>
-      <w:r>
+        <w:pBdr>
+          <w:bottom w:val="single" w:color="F6D649" w:sz="16" w:space="4"/>
+        </w:pBdr>
+        <w:spacing w:after="200" w:before="420"/>
+      </w:pPr>
+      <w:r>
+        <w:rPr>
+          <w:rFonts w:ascii="Archivo" w:cs="Archivo" w:eastAsia="Archivo" w:hAnsi="Archivo"/>
+          <w:b/>
+          <w:bCs/>
+          <w:color w:val="1D2B8F"/>
+          <w:sz w:val="30"/>
+          <w:szCs w:val="30"/>
+        </w:rPr>
         <w:t xml:space="preserve">4 · La sección crítica  (Servicios y Procesos)</w:t>
       </w:r>
     </w:p>
@@ -2118,7 +2263,7 @@
         <w:tc>
           <w:tcPr>
             <w:tcW w:type="dxa" w:w="2400"/>
-            <w:shd w:fill="26402C" w:val="clear"/>
+            <w:shd w:fill="1D2B8F" w:val="clear"/>
             <w:tcMar>
               <w:top w:type="dxa" w:w="100"/>
               <w:left w:type="dxa" w:w="120"/>
@@ -2143,7 +2288,7 @@
         <w:tc>
           <w:tcPr>
             <w:tcW w:type="dxa" w:w="6620"/>
-            <w:shd w:fill="26402C" w:val="clear"/>
+            <w:shd w:fill="1D2B8F" w:val="clear"/>
             <w:tcMar>
               <w:top w:type="dxa" w:w="100"/>
               <w:left w:type="dxa" w:w="120"/>
@@ -2170,20 +2315,21 @@
         <w:tc>
           <w:tcPr>
             <w:tcW w:type="dxa" w:w="2400"/>
-            <w:tcMar>
-              <w:top w:type="dxa" w:w="100"/>
-              <w:left w:type="dxa" w:w="120"/>
-              <w:bottom w:type="dxa" w:w="100"/>
-              <w:right w:type="dxa" w:w="120"/>
-            </w:tcMar>
-            <w:vAlign w:val="top"/>
-          </w:tcPr>
-          <w:p>
-            <w:r>
-              <w:rPr>
-                <w:b/>
-                <w:bCs/>
-                <w:color w:val="1F2A1F"/>
+            <w:shd w:fill="FBFAF6" w:val="clear"/>
+            <w:tcMar>
+              <w:top w:type="dxa" w:w="100"/>
+              <w:left w:type="dxa" w:w="120"/>
+              <w:bottom w:type="dxa" w:w="100"/>
+              <w:right w:type="dxa" w:w="120"/>
+            </w:tcMar>
+            <w:vAlign w:val="top"/>
+          </w:tcPr>
+          <w:p>
+            <w:r>
+              <w:rPr>
+                <w:b/>
+                <w:bCs/>
+                <w:color w:val="141414"/>
                 <w:sz w:val="20"/>
                 <w:szCs w:val="20"/>
               </w:rPr>
@@ -2194,20 +2340,21 @@
         <w:tc>
           <w:tcPr>
             <w:tcW w:type="dxa" w:w="6620"/>
-            <w:tcMar>
-              <w:top w:type="dxa" w:w="100"/>
-              <w:left w:type="dxa" w:w="120"/>
-              <w:bottom w:type="dxa" w:w="100"/>
-              <w:right w:type="dxa" w:w="120"/>
-            </w:tcMar>
-            <w:vAlign w:val="top"/>
-          </w:tcPr>
-          <w:p>
-            <w:r>
-              <w:rPr>
-                <w:b w:val="false"/>
-                <w:bCs w:val="false"/>
-                <w:color w:val="1F2A1F"/>
+            <w:shd w:fill="FBFAF6" w:val="clear"/>
+            <w:tcMar>
+              <w:top w:type="dxa" w:w="100"/>
+              <w:left w:type="dxa" w:w="120"/>
+              <w:bottom w:type="dxa" w:w="100"/>
+              <w:right w:type="dxa" w:w="120"/>
+            </w:tcMar>
+            <w:vAlign w:val="top"/>
+          </w:tcPr>
+          <w:p>
+            <w:r>
+              <w:rPr>
+                <w:b w:val="false"/>
+                <w:bCs w:val="false"/>
+                <w:color w:val="141414"/>
                 <w:sz w:val="20"/>
                 <w:szCs w:val="20"/>
               </w:rPr>
@@ -2220,20 +2367,21 @@
         <w:tc>
           <w:tcPr>
             <w:tcW w:type="dxa" w:w="2400"/>
-            <w:tcMar>
-              <w:top w:type="dxa" w:w="100"/>
-              <w:left w:type="dxa" w:w="120"/>
-              <w:bottom w:type="dxa" w:w="100"/>
-              <w:right w:type="dxa" w:w="120"/>
-            </w:tcMar>
-            <w:vAlign w:val="top"/>
-          </w:tcPr>
-          <w:p>
-            <w:r>
-              <w:rPr>
-                <w:b/>
-                <w:bCs/>
-                <w:color w:val="1F2A1F"/>
+            <w:shd w:fill="FBFAF6" w:val="clear"/>
+            <w:tcMar>
+              <w:top w:type="dxa" w:w="100"/>
+              <w:left w:type="dxa" w:w="120"/>
+              <w:bottom w:type="dxa" w:w="100"/>
+              <w:right w:type="dxa" w:w="120"/>
+            </w:tcMar>
+            <w:vAlign w:val="top"/>
+          </w:tcPr>
+          <w:p>
+            <w:r>
+              <w:rPr>
+                <w:b/>
+                <w:bCs/>
+                <w:color w:val="141414"/>
                 <w:sz w:val="20"/>
                 <w:szCs w:val="20"/>
               </w:rPr>
@@ -2244,20 +2392,21 @@
         <w:tc>
           <w:tcPr>
             <w:tcW w:type="dxa" w:w="6620"/>
-            <w:tcMar>
-              <w:top w:type="dxa" w:w="100"/>
-              <w:left w:type="dxa" w:w="120"/>
-              <w:bottom w:type="dxa" w:w="100"/>
-              <w:right w:type="dxa" w:w="120"/>
-            </w:tcMar>
-            <w:vAlign w:val="top"/>
-          </w:tcPr>
-          <w:p>
-            <w:r>
-              <w:rPr>
-                <w:b w:val="false"/>
-                <w:bCs w:val="false"/>
-                <w:color w:val="1F2A1F"/>
+            <w:shd w:fill="FBFAF6" w:val="clear"/>
+            <w:tcMar>
+              <w:top w:type="dxa" w:w="100"/>
+              <w:left w:type="dxa" w:w="120"/>
+              <w:bottom w:type="dxa" w:w="100"/>
+              <w:right w:type="dxa" w:w="120"/>
+            </w:tcMar>
+            <w:vAlign w:val="top"/>
+          </w:tcPr>
+          <w:p>
+            <w:r>
+              <w:rPr>
+                <w:b w:val="false"/>
+                <w:bCs w:val="false"/>
+                <w:color w:val="141414"/>
                 <w:sz w:val="20"/>
                 <w:szCs w:val="20"/>
               </w:rPr>
@@ -2269,7 +2418,7 @@
               <w:rPr>
                 <w:b w:val="false"/>
                 <w:bCs w:val="false"/>
-                <w:color w:val="1F2A1F"/>
+                <w:color w:val="141414"/>
                 <w:sz w:val="20"/>
                 <w:szCs w:val="20"/>
               </w:rPr>
@@ -2282,20 +2431,21 @@
         <w:tc>
           <w:tcPr>
             <w:tcW w:type="dxa" w:w="2400"/>
-            <w:tcMar>
-              <w:top w:type="dxa" w:w="100"/>
-              <w:left w:type="dxa" w:w="120"/>
-              <w:bottom w:type="dxa" w:w="100"/>
-              <w:right w:type="dxa" w:w="120"/>
-            </w:tcMar>
-            <w:vAlign w:val="top"/>
-          </w:tcPr>
-          <w:p>
-            <w:r>
-              <w:rPr>
-                <w:b/>
-                <w:bCs/>
-                <w:color w:val="1F2A1F"/>
+            <w:shd w:fill="FBFAF6" w:val="clear"/>
+            <w:tcMar>
+              <w:top w:type="dxa" w:w="100"/>
+              <w:left w:type="dxa" w:w="120"/>
+              <w:bottom w:type="dxa" w:w="100"/>
+              <w:right w:type="dxa" w:w="120"/>
+            </w:tcMar>
+            <w:vAlign w:val="top"/>
+          </w:tcPr>
+          <w:p>
+            <w:r>
+              <w:rPr>
+                <w:b/>
+                <w:bCs/>
+                <w:color w:val="141414"/>
                 <w:sz w:val="20"/>
                 <w:szCs w:val="20"/>
               </w:rPr>
@@ -2306,6 +2456,7 @@
         <w:tc>
           <w:tcPr>
             <w:tcW w:type="dxa" w:w="6620"/>
+            <w:shd w:fill="FBFAF6" w:val="clear"/>
             <w:tcMar>
               <w:top w:type="dxa" w:w="100"/>
               <w:left w:type="dxa" w:w="120"/>
@@ -2319,7 +2470,7 @@
               <w:rPr>
                 <w:i/>
                 <w:iCs/>
-                <w:color w:val="5B6559"/>
+                <w:color w:val="6B6259"/>
                 <w:sz w:val="20"/>
                 <w:szCs w:val="20"/>
               </w:rPr>
@@ -2332,20 +2483,21 @@
         <w:tc>
           <w:tcPr>
             <w:tcW w:type="dxa" w:w="2400"/>
-            <w:tcMar>
-              <w:top w:type="dxa" w:w="100"/>
-              <w:left w:type="dxa" w:w="120"/>
-              <w:bottom w:type="dxa" w:w="100"/>
-              <w:right w:type="dxa" w:w="120"/>
-            </w:tcMar>
-            <w:vAlign w:val="top"/>
-          </w:tcPr>
-          <w:p>
-            <w:r>
-              <w:rPr>
-                <w:b/>
-                <w:bCs/>
-                <w:color w:val="1F2A1F"/>
+            <w:shd w:fill="FBFAF6" w:val="clear"/>
+            <w:tcMar>
+              <w:top w:type="dxa" w:w="100"/>
+              <w:left w:type="dxa" w:w="120"/>
+              <w:bottom w:type="dxa" w:w="100"/>
+              <w:right w:type="dxa" w:w="120"/>
+            </w:tcMar>
+            <w:vAlign w:val="top"/>
+          </w:tcPr>
+          <w:p>
+            <w:r>
+              <w:rPr>
+                <w:b/>
+                <w:bCs/>
+                <w:color w:val="141414"/>
                 <w:sz w:val="20"/>
                 <w:szCs w:val="20"/>
               </w:rPr>
@@ -2356,6 +2508,7 @@
         <w:tc>
           <w:tcPr>
             <w:tcW w:type="dxa" w:w="6620"/>
+            <w:shd w:fill="FBFAF6" w:val="clear"/>
             <w:tcMar>
               <w:top w:type="dxa" w:w="100"/>
               <w:left w:type="dxa" w:w="120"/>
@@ -2369,7 +2522,7 @@
               <w:rPr>
                 <w:i/>
                 <w:iCs/>
-                <w:color w:val="5B6559"/>
+                <w:color w:val="6B6259"/>
                 <w:sz w:val="20"/>
                 <w:szCs w:val="20"/>
               </w:rPr>
@@ -2385,6 +2538,14 @@
         <w:spacing w:after="150" w:before="300"/>
       </w:pPr>
       <w:r>
+        <w:rPr>
+          <w:rFonts w:ascii="Archivo" w:cs="Archivo" w:eastAsia="Archivo" w:hAnsi="Archivo"/>
+          <w:b/>
+          <w:bCs/>
+          <w:color w:val="B8322A"/>
+          <w:sz w:val="24"/>
+          <w:szCs w:val="24"/>
+        </w:rPr>
         <w:t xml:space="preserve">La tarea en segundo plano</w:t>
       </w:r>
     </w:p>
@@ -2395,7 +2556,7 @@
       </w:pPr>
       <w:r>
         <w:rPr>
-          <w:color w:val="1F2A1F"/>
+          <w:color w:val="141414"/>
           <w:sz w:val="21"/>
           <w:szCs w:val="21"/>
         </w:rPr>
@@ -2409,7 +2570,7 @@
       </w:pPr>
       <w:r>
         <w:rPr>
-          <w:color w:val="1F2A1F"/>
+          <w:color w:val="141414"/>
           <w:sz w:val="21"/>
           <w:szCs w:val="21"/>
         </w:rPr>
@@ -2423,7 +2584,7 @@
       </w:pPr>
       <w:r>
         <w:rPr>
-          <w:color w:val="1F2A1F"/>
+          <w:color w:val="141414"/>
           <w:sz w:val="21"/>
           <w:szCs w:val="21"/>
         </w:rPr>
@@ -2437,7 +2598,7 @@
       </w:pPr>
       <w:r>
         <w:rPr>
-          <w:color w:val="1F2A1F"/>
+          <w:color w:val="141414"/>
           <w:sz w:val="21"/>
           <w:szCs w:val="21"/>
         </w:rPr>
@@ -2452,7 +2613,7 @@
         <w:rPr>
           <w:i/>
           <w:iCs/>
-          <w:color w:val="5B6559"/>
+          <w:color w:val="6B6259"/>
           <w:sz w:val="21"/>
           <w:szCs w:val="21"/>
         </w:rPr>
@@ -2462,9 +2623,20 @@
     <w:p>
       <w:pPr>
         <w:pStyle w:val="Heading1"/>
-        <w:spacing w:after="200" w:before="400"/>
-      </w:pPr>
-      <w:r>
+        <w:pBdr>
+          <w:bottom w:val="single" w:color="F6D649" w:sz="16" w:space="4"/>
+        </w:pBdr>
+        <w:spacing w:after="200" w:before="420"/>
+      </w:pPr>
+      <w:r>
+        <w:rPr>
+          <w:rFonts w:ascii="Archivo" w:cs="Archivo" w:eastAsia="Archivo" w:hAnsi="Archivo"/>
+          <w:b/>
+          <w:bCs/>
+          <w:color w:val="1D2B8F"/>
+          <w:sz w:val="30"/>
+          <w:szCs w:val="30"/>
+        </w:rPr>
         <w:t xml:space="preserve">5 · Modelo de datos e integraciones  (Acceso a Datos)</w:t>
       </w:r>
     </w:p>
@@ -2474,6 +2646,14 @@
         <w:spacing w:after="150" w:before="300"/>
       </w:pPr>
       <w:r>
+        <w:rPr>
+          <w:rFonts w:ascii="Archivo" w:cs="Archivo" w:eastAsia="Archivo" w:hAnsi="Archivo"/>
+          <w:b/>
+          <w:bCs/>
+          <w:color w:val="B8322A"/>
+          <w:sz w:val="24"/>
+          <w:szCs w:val="24"/>
+        </w:rPr>
         <w:t xml:space="preserve">Entidades</w:t>
       </w:r>
     </w:p>
@@ -2484,7 +2664,7 @@
       </w:pPr>
       <w:r>
         <w:rPr>
-          <w:color w:val="1F2A1F"/>
+          <w:color w:val="141414"/>
           <w:sz w:val="21"/>
           <w:szCs w:val="21"/>
         </w:rPr>
@@ -2498,7 +2678,7 @@
       </w:pPr>
       <w:r>
         <w:rPr>
-          <w:color w:val="1F2A1F"/>
+          <w:color w:val="141414"/>
           <w:sz w:val="21"/>
           <w:szCs w:val="21"/>
         </w:rPr>
@@ -2512,7 +2692,7 @@
       </w:pPr>
       <w:r>
         <w:rPr>
-          <w:color w:val="1F2A1F"/>
+          <w:color w:val="141414"/>
           <w:sz w:val="21"/>
           <w:szCs w:val="21"/>
         </w:rPr>
@@ -2526,7 +2706,7 @@
       </w:pPr>
       <w:r>
         <w:rPr>
-          <w:color w:val="1F2A1F"/>
+          <w:color w:val="141414"/>
           <w:sz w:val="21"/>
           <w:szCs w:val="21"/>
         </w:rPr>
@@ -2540,7 +2720,7 @@
       </w:pPr>
       <w:r>
         <w:rPr>
-          <w:color w:val="1F2A1F"/>
+          <w:color w:val="141414"/>
           <w:sz w:val="21"/>
           <w:szCs w:val="21"/>
         </w:rPr>
@@ -2554,7 +2734,7 @@
       </w:pPr>
       <w:r>
         <w:rPr>
-          <w:color w:val="1F2A1F"/>
+          <w:color w:val="141414"/>
           <w:sz w:val="21"/>
           <w:szCs w:val="21"/>
         </w:rPr>
@@ -2567,6 +2747,14 @@
         <w:spacing w:after="150" w:before="300"/>
       </w:pPr>
       <w:r>
+        <w:rPr>
+          <w:rFonts w:ascii="Archivo" w:cs="Archivo" w:eastAsia="Archivo" w:hAnsi="Archivo"/>
+          <w:b/>
+          <w:bCs/>
+          <w:color w:val="B8322A"/>
+          <w:sz w:val="24"/>
+          <w:szCs w:val="24"/>
+        </w:rPr>
         <w:t xml:space="preserve">Relaciones</w:t>
       </w:r>
     </w:p>
@@ -2577,7 +2765,7 @@
       </w:pPr>
       <w:r>
         <w:rPr>
-          <w:color w:val="1F2A1F"/>
+          <w:color w:val="141414"/>
           <w:sz w:val="21"/>
           <w:szCs w:val="21"/>
         </w:rPr>
@@ -2591,7 +2779,7 @@
       </w:pPr>
       <w:r>
         <w:rPr>
-          <w:color w:val="1F2A1F"/>
+          <w:color w:val="141414"/>
           <w:sz w:val="21"/>
           <w:szCs w:val="21"/>
         </w:rPr>
@@ -2605,7 +2793,7 @@
       </w:pPr>
       <w:r>
         <w:rPr>
-          <w:color w:val="1F2A1F"/>
+          <w:color w:val="141414"/>
           <w:sz w:val="21"/>
           <w:szCs w:val="21"/>
         </w:rPr>
@@ -2619,7 +2807,7 @@
       </w:pPr>
       <w:r>
         <w:rPr>
-          <w:color w:val="1F2A1F"/>
+          <w:color w:val="141414"/>
           <w:sz w:val="21"/>
           <w:szCs w:val="21"/>
         </w:rPr>
@@ -2632,6 +2820,14 @@
         <w:spacing w:after="150" w:before="300"/>
       </w:pPr>
       <w:r>
+        <w:rPr>
+          <w:rFonts w:ascii="Archivo" w:cs="Archivo" w:eastAsia="Archivo" w:hAnsi="Archivo"/>
+          <w:b/>
+          <w:bCs/>
+          <w:color w:val="B8322A"/>
+          <w:sz w:val="24"/>
+          <w:szCs w:val="24"/>
+        </w:rPr>
         <w:t xml:space="preserve">Claves</w:t>
       </w:r>
     </w:p>
@@ -2642,7 +2838,7 @@
       </w:pPr>
       <w:r>
         <w:rPr>
-          <w:color w:val="1F2A1F"/>
+          <w:color w:val="141414"/>
           <w:sz w:val="21"/>
           <w:szCs w:val="21"/>
         </w:rPr>
@@ -2656,7 +2852,7 @@
       </w:pPr>
       <w:r>
         <w:rPr>
-          <w:color w:val="1F2A1F"/>
+          <w:color w:val="141414"/>
           <w:sz w:val="21"/>
           <w:szCs w:val="21"/>
         </w:rPr>
@@ -2669,6 +2865,14 @@
         <w:spacing w:after="150" w:before="300"/>
       </w:pPr>
       <w:r>
+        <w:rPr>
+          <w:rFonts w:ascii="Archivo" w:cs="Archivo" w:eastAsia="Archivo" w:hAnsi="Archivo"/>
+          <w:b/>
+          <w:bCs/>
+          <w:color w:val="B8322A"/>
+          <w:sz w:val="24"/>
+          <w:szCs w:val="24"/>
+        </w:rPr>
         <w:t xml:space="preserve">Operaciones por caso de uso</w:t>
       </w:r>
     </w:p>
@@ -2692,7 +2896,7 @@
         <w:tc>
           <w:tcPr>
             <w:tcW w:type="dxa" w:w="2400"/>
-            <w:shd w:fill="26402C" w:val="clear"/>
+            <w:shd w:fill="1D2B8F" w:val="clear"/>
             <w:tcMar>
               <w:top w:type="dxa" w:w="100"/>
               <w:left w:type="dxa" w:w="120"/>
@@ -2717,7 +2921,7 @@
         <w:tc>
           <w:tcPr>
             <w:tcW w:type="dxa" w:w="6620"/>
-            <w:shd w:fill="26402C" w:val="clear"/>
+            <w:shd w:fill="1D2B8F" w:val="clear"/>
             <w:tcMar>
               <w:top w:type="dxa" w:w="100"/>
               <w:left w:type="dxa" w:w="120"/>
@@ -2744,20 +2948,21 @@
         <w:tc>
           <w:tcPr>
             <w:tcW w:type="dxa" w:w="2400"/>
-            <w:tcMar>
-              <w:top w:type="dxa" w:w="100"/>
-              <w:left w:type="dxa" w:w="120"/>
-              <w:bottom w:type="dxa" w:w="100"/>
-              <w:right w:type="dxa" w:w="120"/>
-            </w:tcMar>
-            <w:vAlign w:val="top"/>
-          </w:tcPr>
-          <w:p>
-            <w:r>
-              <w:rPr>
-                <w:b/>
-                <w:bCs/>
-                <w:color w:val="1F2A1F"/>
+            <w:shd w:fill="FBFAF6" w:val="clear"/>
+            <w:tcMar>
+              <w:top w:type="dxa" w:w="100"/>
+              <w:left w:type="dxa" w:w="120"/>
+              <w:bottom w:type="dxa" w:w="100"/>
+              <w:right w:type="dxa" w:w="120"/>
+            </w:tcMar>
+            <w:vAlign w:val="top"/>
+          </w:tcPr>
+          <w:p>
+            <w:r>
+              <w:rPr>
+                <w:b/>
+                <w:bCs/>
+                <w:color w:val="141414"/>
                 <w:sz w:val="20"/>
                 <w:szCs w:val="20"/>
               </w:rPr>
@@ -2768,20 +2973,21 @@
         <w:tc>
           <w:tcPr>
             <w:tcW w:type="dxa" w:w="6620"/>
-            <w:tcMar>
-              <w:top w:type="dxa" w:w="100"/>
-              <w:left w:type="dxa" w:w="120"/>
-              <w:bottom w:type="dxa" w:w="100"/>
-              <w:right w:type="dxa" w:w="120"/>
-            </w:tcMar>
-            <w:vAlign w:val="top"/>
-          </w:tcPr>
-          <w:p>
-            <w:r>
-              <w:rPr>
-                <w:b w:val="false"/>
-                <w:bCs w:val="false"/>
-                <w:color w:val="1F2A1F"/>
+            <w:shd w:fill="FBFAF6" w:val="clear"/>
+            <w:tcMar>
+              <w:top w:type="dxa" w:w="100"/>
+              <w:left w:type="dxa" w:w="120"/>
+              <w:bottom w:type="dxa" w:w="100"/>
+              <w:right w:type="dxa" w:w="120"/>
+            </w:tcMar>
+            <w:vAlign w:val="top"/>
+          </w:tcPr>
+          <w:p>
+            <w:r>
+              <w:rPr>
+                <w:b w:val="false"/>
+                <w:bCs w:val="false"/>
+                <w:color w:val="141414"/>
                 <w:sz w:val="20"/>
                 <w:szCs w:val="20"/>
               </w:rPr>
@@ -2794,20 +3000,21 @@
         <w:tc>
           <w:tcPr>
             <w:tcW w:type="dxa" w:w="2400"/>
-            <w:tcMar>
-              <w:top w:type="dxa" w:w="100"/>
-              <w:left w:type="dxa" w:w="120"/>
-              <w:bottom w:type="dxa" w:w="100"/>
-              <w:right w:type="dxa" w:w="120"/>
-            </w:tcMar>
-            <w:vAlign w:val="top"/>
-          </w:tcPr>
-          <w:p>
-            <w:r>
-              <w:rPr>
-                <w:b/>
-                <w:bCs/>
-                <w:color w:val="1F2A1F"/>
+            <w:shd w:fill="FBFAF6" w:val="clear"/>
+            <w:tcMar>
+              <w:top w:type="dxa" w:w="100"/>
+              <w:left w:type="dxa" w:w="120"/>
+              <w:bottom w:type="dxa" w:w="100"/>
+              <w:right w:type="dxa" w:w="120"/>
+            </w:tcMar>
+            <w:vAlign w:val="top"/>
+          </w:tcPr>
+          <w:p>
+            <w:r>
+              <w:rPr>
+                <w:b/>
+                <w:bCs/>
+                <w:color w:val="141414"/>
                 <w:sz w:val="20"/>
                 <w:szCs w:val="20"/>
               </w:rPr>
@@ -2818,20 +3025,21 @@
         <w:tc>
           <w:tcPr>
             <w:tcW w:type="dxa" w:w="6620"/>
-            <w:tcMar>
-              <w:top w:type="dxa" w:w="100"/>
-              <w:left w:type="dxa" w:w="120"/>
-              <w:bottom w:type="dxa" w:w="100"/>
-              <w:right w:type="dxa" w:w="120"/>
-            </w:tcMar>
-            <w:vAlign w:val="top"/>
-          </w:tcPr>
-          <w:p>
-            <w:r>
-              <w:rPr>
-                <w:b w:val="false"/>
-                <w:bCs w:val="false"/>
-                <w:color w:val="1F2A1F"/>
+            <w:shd w:fill="FBFAF6" w:val="clear"/>
+            <w:tcMar>
+              <w:top w:type="dxa" w:w="100"/>
+              <w:left w:type="dxa" w:w="120"/>
+              <w:bottom w:type="dxa" w:w="100"/>
+              <w:right w:type="dxa" w:w="120"/>
+            </w:tcMar>
+            <w:vAlign w:val="top"/>
+          </w:tcPr>
+          <w:p>
+            <w:r>
+              <w:rPr>
+                <w:b w:val="false"/>
+                <w:bCs w:val="false"/>
+                <w:color w:val="141414"/>
                 <w:sz w:val="20"/>
                 <w:szCs w:val="20"/>
               </w:rPr>
@@ -2847,6 +3055,14 @@
         <w:spacing w:after="150" w:before="300"/>
       </w:pPr>
       <w:r>
+        <w:rPr>
+          <w:rFonts w:ascii="Archivo" w:cs="Archivo" w:eastAsia="Archivo" w:hAnsi="Archivo"/>
+          <w:b/>
+          <w:bCs/>
+          <w:color w:val="B8322A"/>
+          <w:sz w:val="24"/>
+          <w:szCs w:val="24"/>
+        </w:rPr>
         <w:t xml:space="preserve">Las integraciones</w:t>
       </w:r>
     </w:p>
@@ -2872,7 +3088,7 @@
         <w:tc>
           <w:tcPr>
             <w:tcW w:type="dxa" w:w="2000"/>
-            <w:shd w:fill="26402C" w:val="clear"/>
+            <w:shd w:fill="1D2B8F" w:val="clear"/>
             <w:tcMar>
               <w:top w:type="dxa" w:w="100"/>
               <w:left w:type="dxa" w:w="120"/>
@@ -2897,7 +3113,7 @@
         <w:tc>
           <w:tcPr>
             <w:tcW w:type="dxa" w:w="2000"/>
-            <w:shd w:fill="26402C" w:val="clear"/>
+            <w:shd w:fill="1D2B8F" w:val="clear"/>
             <w:tcMar>
               <w:top w:type="dxa" w:w="100"/>
               <w:left w:type="dxa" w:w="120"/>
@@ -2922,7 +3138,7 @@
         <w:tc>
           <w:tcPr>
             <w:tcW w:type="dxa" w:w="3120"/>
-            <w:shd w:fill="26402C" w:val="clear"/>
+            <w:shd w:fill="1D2B8F" w:val="clear"/>
             <w:tcMar>
               <w:top w:type="dxa" w:w="100"/>
               <w:left w:type="dxa" w:w="120"/>
@@ -2947,7 +3163,7 @@
         <w:tc>
           <w:tcPr>
             <w:tcW w:type="dxa" w:w="1900"/>
-            <w:shd w:fill="26402C" w:val="clear"/>
+            <w:shd w:fill="1D2B8F" w:val="clear"/>
             <w:tcMar>
               <w:top w:type="dxa" w:w="100"/>
               <w:left w:type="dxa" w:w="120"/>
@@ -2974,20 +3190,21 @@
         <w:tc>
           <w:tcPr>
             <w:tcW w:type="dxa" w:w="2000"/>
-            <w:tcMar>
-              <w:top w:type="dxa" w:w="100"/>
-              <w:left w:type="dxa" w:w="120"/>
-              <w:bottom w:type="dxa" w:w="100"/>
-              <w:right w:type="dxa" w:w="120"/>
-            </w:tcMar>
-            <w:vAlign w:val="top"/>
-          </w:tcPr>
-          <w:p>
-            <w:r>
-              <w:rPr>
-                <w:b w:val="false"/>
-                <w:bCs w:val="false"/>
-                <w:color w:val="1F2A1F"/>
+            <w:shd w:fill="FBFAF6" w:val="clear"/>
+            <w:tcMar>
+              <w:top w:type="dxa" w:w="100"/>
+              <w:left w:type="dxa" w:w="120"/>
+              <w:bottom w:type="dxa" w:w="100"/>
+              <w:right w:type="dxa" w:w="120"/>
+            </w:tcMar>
+            <w:vAlign w:val="top"/>
+          </w:tcPr>
+          <w:p>
+            <w:r>
+              <w:rPr>
+                <w:b w:val="false"/>
+                <w:bCs w:val="false"/>
+                <w:color w:val="141414"/>
                 <w:sz w:val="20"/>
                 <w:szCs w:val="20"/>
               </w:rPr>
@@ -2998,20 +3215,21 @@
         <w:tc>
           <w:tcPr>
             <w:tcW w:type="dxa" w:w="2000"/>
-            <w:tcMar>
-              <w:top w:type="dxa" w:w="100"/>
-              <w:left w:type="dxa" w:w="120"/>
-              <w:bottom w:type="dxa" w:w="100"/>
-              <w:right w:type="dxa" w:w="120"/>
-            </w:tcMar>
-            <w:vAlign w:val="top"/>
-          </w:tcPr>
-          <w:p>
-            <w:r>
-              <w:rPr>
-                <w:b w:val="false"/>
-                <w:bCs w:val="false"/>
-                <w:color w:val="1F2A1F"/>
+            <w:shd w:fill="FBFAF6" w:val="clear"/>
+            <w:tcMar>
+              <w:top w:type="dxa" w:w="100"/>
+              <w:left w:type="dxa" w:w="120"/>
+              <w:bottom w:type="dxa" w:w="100"/>
+              <w:right w:type="dxa" w:w="120"/>
+            </w:tcMar>
+            <w:vAlign w:val="top"/>
+          </w:tcPr>
+          <w:p>
+            <w:r>
+              <w:rPr>
+                <w:b w:val="false"/>
+                <w:bCs w:val="false"/>
+                <w:color w:val="141414"/>
                 <w:sz w:val="20"/>
                 <w:szCs w:val="20"/>
               </w:rPr>
@@ -3022,20 +3240,21 @@
         <w:tc>
           <w:tcPr>
             <w:tcW w:type="dxa" w:w="3120"/>
-            <w:tcMar>
-              <w:top w:type="dxa" w:w="100"/>
-              <w:left w:type="dxa" w:w="120"/>
-              <w:bottom w:type="dxa" w:w="100"/>
-              <w:right w:type="dxa" w:w="120"/>
-            </w:tcMar>
-            <w:vAlign w:val="top"/>
-          </w:tcPr>
-          <w:p>
-            <w:r>
-              <w:rPr>
-                <w:b w:val="false"/>
-                <w:bCs w:val="false"/>
-                <w:color w:val="1F2A1F"/>
+            <w:shd w:fill="FBFAF6" w:val="clear"/>
+            <w:tcMar>
+              <w:top w:type="dxa" w:w="100"/>
+              <w:left w:type="dxa" w:w="120"/>
+              <w:bottom w:type="dxa" w:w="100"/>
+              <w:right w:type="dxa" w:w="120"/>
+            </w:tcMar>
+            <w:vAlign w:val="top"/>
+          </w:tcPr>
+          <w:p>
+            <w:r>
+              <w:rPr>
+                <w:b w:val="false"/>
+                <w:bCs w:val="false"/>
+                <w:color w:val="141414"/>
                 <w:sz w:val="20"/>
                 <w:szCs w:val="20"/>
               </w:rPr>
@@ -3046,20 +3265,21 @@
         <w:tc>
           <w:tcPr>
             <w:tcW w:type="dxa" w:w="1900"/>
-            <w:tcMar>
-              <w:top w:type="dxa" w:w="100"/>
-              <w:left w:type="dxa" w:w="120"/>
-              <w:bottom w:type="dxa" w:w="100"/>
-              <w:right w:type="dxa" w:w="120"/>
-            </w:tcMar>
-            <w:vAlign w:val="top"/>
-          </w:tcPr>
-          <w:p>
-            <w:r>
-              <w:rPr>
-                <w:b w:val="false"/>
-                <w:bCs w:val="false"/>
-                <w:color w:val="1F2A1F"/>
+            <w:shd w:fill="FBFAF6" w:val="clear"/>
+            <w:tcMar>
+              <w:top w:type="dxa" w:w="100"/>
+              <w:left w:type="dxa" w:w="120"/>
+              <w:bottom w:type="dxa" w:w="100"/>
+              <w:right w:type="dxa" w:w="120"/>
+            </w:tcMar>
+            <w:vAlign w:val="top"/>
+          </w:tcPr>
+          <w:p>
+            <w:r>
+              <w:rPr>
+                <w:b w:val="false"/>
+                <w:bCs w:val="false"/>
+                <w:color w:val="141414"/>
                 <w:sz w:val="20"/>
                 <w:szCs w:val="20"/>
               </w:rPr>
@@ -3072,20 +3292,21 @@
         <w:tc>
           <w:tcPr>
             <w:tcW w:type="dxa" w:w="2000"/>
-            <w:tcMar>
-              <w:top w:type="dxa" w:w="100"/>
-              <w:left w:type="dxa" w:w="120"/>
-              <w:bottom w:type="dxa" w:w="100"/>
-              <w:right w:type="dxa" w:w="120"/>
-            </w:tcMar>
-            <w:vAlign w:val="top"/>
-          </w:tcPr>
-          <w:p>
-            <w:r>
-              <w:rPr>
-                <w:b w:val="false"/>
-                <w:bCs w:val="false"/>
-                <w:color w:val="1F2A1F"/>
+            <w:shd w:fill="FBFAF6" w:val="clear"/>
+            <w:tcMar>
+              <w:top w:type="dxa" w:w="100"/>
+              <w:left w:type="dxa" w:w="120"/>
+              <w:bottom w:type="dxa" w:w="100"/>
+              <w:right w:type="dxa" w:w="120"/>
+            </w:tcMar>
+            <w:vAlign w:val="top"/>
+          </w:tcPr>
+          <w:p>
+            <w:r>
+              <w:rPr>
+                <w:b w:val="false"/>
+                <w:bCs w:val="false"/>
+                <w:color w:val="141414"/>
                 <w:sz w:val="20"/>
                 <w:szCs w:val="20"/>
               </w:rPr>
@@ -3096,20 +3317,21 @@
         <w:tc>
           <w:tcPr>
             <w:tcW w:type="dxa" w:w="2000"/>
-            <w:tcMar>
-              <w:top w:type="dxa" w:w="100"/>
-              <w:left w:type="dxa" w:w="120"/>
-              <w:bottom w:type="dxa" w:w="100"/>
-              <w:right w:type="dxa" w:w="120"/>
-            </w:tcMar>
-            <w:vAlign w:val="top"/>
-          </w:tcPr>
-          <w:p>
-            <w:r>
-              <w:rPr>
-                <w:b w:val="false"/>
-                <w:bCs w:val="false"/>
-                <w:color w:val="1F2A1F"/>
+            <w:shd w:fill="FBFAF6" w:val="clear"/>
+            <w:tcMar>
+              <w:top w:type="dxa" w:w="100"/>
+              <w:left w:type="dxa" w:w="120"/>
+              <w:bottom w:type="dxa" w:w="100"/>
+              <w:right w:type="dxa" w:w="120"/>
+            </w:tcMar>
+            <w:vAlign w:val="top"/>
+          </w:tcPr>
+          <w:p>
+            <w:r>
+              <w:rPr>
+                <w:b w:val="false"/>
+                <w:bCs w:val="false"/>
+                <w:color w:val="141414"/>
                 <w:sz w:val="20"/>
                 <w:szCs w:val="20"/>
               </w:rPr>
@@ -3120,20 +3342,21 @@
         <w:tc>
           <w:tcPr>
             <w:tcW w:type="dxa" w:w="3120"/>
-            <w:tcMar>
-              <w:top w:type="dxa" w:w="100"/>
-              <w:left w:type="dxa" w:w="120"/>
-              <w:bottom w:type="dxa" w:w="100"/>
-              <w:right w:type="dxa" w:w="120"/>
-            </w:tcMar>
-            <w:vAlign w:val="top"/>
-          </w:tcPr>
-          <w:p>
-            <w:r>
-              <w:rPr>
-                <w:b w:val="false"/>
-                <w:bCs w:val="false"/>
-                <w:color w:val="1F2A1F"/>
+            <w:shd w:fill="FBFAF6" w:val="clear"/>
+            <w:tcMar>
+              <w:top w:type="dxa" w:w="100"/>
+              <w:left w:type="dxa" w:w="120"/>
+              <w:bottom w:type="dxa" w:w="100"/>
+              <w:right w:type="dxa" w:w="120"/>
+            </w:tcMar>
+            <w:vAlign w:val="top"/>
+          </w:tcPr>
+          <w:p>
+            <w:r>
+              <w:rPr>
+                <w:b w:val="false"/>
+                <w:bCs w:val="false"/>
+                <w:color w:val="141414"/>
                 <w:sz w:val="20"/>
                 <w:szCs w:val="20"/>
               </w:rPr>
@@ -3144,20 +3367,21 @@
         <w:tc>
           <w:tcPr>
             <w:tcW w:type="dxa" w:w="1900"/>
-            <w:tcMar>
-              <w:top w:type="dxa" w:w="100"/>
-              <w:left w:type="dxa" w:w="120"/>
-              <w:bottom w:type="dxa" w:w="100"/>
-              <w:right w:type="dxa" w:w="120"/>
-            </w:tcMar>
-            <w:vAlign w:val="top"/>
-          </w:tcPr>
-          <w:p>
-            <w:r>
-              <w:rPr>
-                <w:b w:val="false"/>
-                <w:bCs w:val="false"/>
-                <w:color w:val="1F2A1F"/>
+            <w:shd w:fill="FBFAF6" w:val="clear"/>
+            <w:tcMar>
+              <w:top w:type="dxa" w:w="100"/>
+              <w:left w:type="dxa" w:w="120"/>
+              <w:bottom w:type="dxa" w:w="100"/>
+              <w:right w:type="dxa" w:w="120"/>
+            </w:tcMar>
+            <w:vAlign w:val="top"/>
+          </w:tcPr>
+          <w:p>
+            <w:r>
+              <w:rPr>
+                <w:b w:val="false"/>
+                <w:bCs w:val="false"/>
+                <w:color w:val="141414"/>
                 <w:sz w:val="20"/>
                 <w:szCs w:val="20"/>
               </w:rPr>
@@ -3170,20 +3394,21 @@
         <w:tc>
           <w:tcPr>
             <w:tcW w:type="dxa" w:w="2000"/>
-            <w:tcMar>
-              <w:top w:type="dxa" w:w="100"/>
-              <w:left w:type="dxa" w:w="120"/>
-              <w:bottom w:type="dxa" w:w="100"/>
-              <w:right w:type="dxa" w:w="120"/>
-            </w:tcMar>
-            <w:vAlign w:val="top"/>
-          </w:tcPr>
-          <w:p>
-            <w:r>
-              <w:rPr>
-                <w:b w:val="false"/>
-                <w:bCs w:val="false"/>
-                <w:color w:val="1F2A1F"/>
+            <w:shd w:fill="FBFAF6" w:val="clear"/>
+            <w:tcMar>
+              <w:top w:type="dxa" w:w="100"/>
+              <w:left w:type="dxa" w:w="120"/>
+              <w:bottom w:type="dxa" w:w="100"/>
+              <w:right w:type="dxa" w:w="120"/>
+            </w:tcMar>
+            <w:vAlign w:val="top"/>
+          </w:tcPr>
+          <w:p>
+            <w:r>
+              <w:rPr>
+                <w:b w:val="false"/>
+                <w:bCs w:val="false"/>
+                <w:color w:val="141414"/>
                 <w:sz w:val="20"/>
                 <w:szCs w:val="20"/>
               </w:rPr>
@@ -3194,20 +3419,21 @@
         <w:tc>
           <w:tcPr>
             <w:tcW w:type="dxa" w:w="2000"/>
-            <w:tcMar>
-              <w:top w:type="dxa" w:w="100"/>
-              <w:left w:type="dxa" w:w="120"/>
-              <w:bottom w:type="dxa" w:w="100"/>
-              <w:right w:type="dxa" w:w="120"/>
-            </w:tcMar>
-            <w:vAlign w:val="top"/>
-          </w:tcPr>
-          <w:p>
-            <w:r>
-              <w:rPr>
-                <w:b w:val="false"/>
-                <w:bCs w:val="false"/>
-                <w:color w:val="1F2A1F"/>
+            <w:shd w:fill="FBFAF6" w:val="clear"/>
+            <w:tcMar>
+              <w:top w:type="dxa" w:w="100"/>
+              <w:left w:type="dxa" w:w="120"/>
+              <w:bottom w:type="dxa" w:w="100"/>
+              <w:right w:type="dxa" w:w="120"/>
+            </w:tcMar>
+            <w:vAlign w:val="top"/>
+          </w:tcPr>
+          <w:p>
+            <w:r>
+              <w:rPr>
+                <w:b w:val="false"/>
+                <w:bCs w:val="false"/>
+                <w:color w:val="141414"/>
                 <w:sz w:val="20"/>
                 <w:szCs w:val="20"/>
               </w:rPr>
@@ -3218,20 +3444,21 @@
         <w:tc>
           <w:tcPr>
             <w:tcW w:type="dxa" w:w="3120"/>
-            <w:tcMar>
-              <w:top w:type="dxa" w:w="100"/>
-              <w:left w:type="dxa" w:w="120"/>
-              <w:bottom w:type="dxa" w:w="100"/>
-              <w:right w:type="dxa" w:w="120"/>
-            </w:tcMar>
-            <w:vAlign w:val="top"/>
-          </w:tcPr>
-          <w:p>
-            <w:r>
-              <w:rPr>
-                <w:b w:val="false"/>
-                <w:bCs w:val="false"/>
-                <w:color w:val="1F2A1F"/>
+            <w:shd w:fill="FBFAF6" w:val="clear"/>
+            <w:tcMar>
+              <w:top w:type="dxa" w:w="100"/>
+              <w:left w:type="dxa" w:w="120"/>
+              <w:bottom w:type="dxa" w:w="100"/>
+              <w:right w:type="dxa" w:w="120"/>
+            </w:tcMar>
+            <w:vAlign w:val="top"/>
+          </w:tcPr>
+          <w:p>
+            <w:r>
+              <w:rPr>
+                <w:b w:val="false"/>
+                <w:bCs w:val="false"/>
+                <w:color w:val="141414"/>
                 <w:sz w:val="20"/>
                 <w:szCs w:val="20"/>
               </w:rPr>
@@ -3242,20 +3469,21 @@
         <w:tc>
           <w:tcPr>
             <w:tcW w:type="dxa" w:w="1900"/>
-            <w:tcMar>
-              <w:top w:type="dxa" w:w="100"/>
-              <w:left w:type="dxa" w:w="120"/>
-              <w:bottom w:type="dxa" w:w="100"/>
-              <w:right w:type="dxa" w:w="120"/>
-            </w:tcMar>
-            <w:vAlign w:val="top"/>
-          </w:tcPr>
-          <w:p>
-            <w:r>
-              <w:rPr>
-                <w:b w:val="false"/>
-                <w:bCs w:val="false"/>
-                <w:color w:val="1F2A1F"/>
+            <w:shd w:fill="FBFAF6" w:val="clear"/>
+            <w:tcMar>
+              <w:top w:type="dxa" w:w="100"/>
+              <w:left w:type="dxa" w:w="120"/>
+              <w:bottom w:type="dxa" w:w="100"/>
+              <w:right w:type="dxa" w:w="120"/>
+            </w:tcMar>
+            <w:vAlign w:val="top"/>
+          </w:tcPr>
+          <w:p>
+            <w:r>
+              <w:rPr>
+                <w:b w:val="false"/>
+                <w:bCs w:val="false"/>
+                <w:color w:val="141414"/>
                 <w:sz w:val="20"/>
                 <w:szCs w:val="20"/>
               </w:rPr>
@@ -3268,20 +3496,21 @@
         <w:tc>
           <w:tcPr>
             <w:tcW w:type="dxa" w:w="2000"/>
-            <w:tcMar>
-              <w:top w:type="dxa" w:w="100"/>
-              <w:left w:type="dxa" w:w="120"/>
-              <w:bottom w:type="dxa" w:w="100"/>
-              <w:right w:type="dxa" w:w="120"/>
-            </w:tcMar>
-            <w:vAlign w:val="top"/>
-          </w:tcPr>
-          <w:p>
-            <w:r>
-              <w:rPr>
-                <w:b w:val="false"/>
-                <w:bCs w:val="false"/>
-                <w:color w:val="1F2A1F"/>
+            <w:shd w:fill="FBFAF6" w:val="clear"/>
+            <w:tcMar>
+              <w:top w:type="dxa" w:w="100"/>
+              <w:left w:type="dxa" w:w="120"/>
+              <w:bottom w:type="dxa" w:w="100"/>
+              <w:right w:type="dxa" w:w="120"/>
+            </w:tcMar>
+            <w:vAlign w:val="top"/>
+          </w:tcPr>
+          <w:p>
+            <w:r>
+              <w:rPr>
+                <w:b w:val="false"/>
+                <w:bCs w:val="false"/>
+                <w:color w:val="141414"/>
                 <w:sz w:val="20"/>
                 <w:szCs w:val="20"/>
               </w:rPr>
@@ -3292,20 +3521,21 @@
         <w:tc>
           <w:tcPr>
             <w:tcW w:type="dxa" w:w="2000"/>
-            <w:tcMar>
-              <w:top w:type="dxa" w:w="100"/>
-              <w:left w:type="dxa" w:w="120"/>
-              <w:bottom w:type="dxa" w:w="100"/>
-              <w:right w:type="dxa" w:w="120"/>
-            </w:tcMar>
-            <w:vAlign w:val="top"/>
-          </w:tcPr>
-          <w:p>
-            <w:r>
-              <w:rPr>
-                <w:b w:val="false"/>
-                <w:bCs w:val="false"/>
-                <w:color w:val="1F2A1F"/>
+            <w:shd w:fill="FBFAF6" w:val="clear"/>
+            <w:tcMar>
+              <w:top w:type="dxa" w:w="100"/>
+              <w:left w:type="dxa" w:w="120"/>
+              <w:bottom w:type="dxa" w:w="100"/>
+              <w:right w:type="dxa" w:w="120"/>
+            </w:tcMar>
+            <w:vAlign w:val="top"/>
+          </w:tcPr>
+          <w:p>
+            <w:r>
+              <w:rPr>
+                <w:b w:val="false"/>
+                <w:bCs w:val="false"/>
+                <w:color w:val="141414"/>
                 <w:sz w:val="20"/>
                 <w:szCs w:val="20"/>
               </w:rPr>
@@ -3316,20 +3546,21 @@
         <w:tc>
           <w:tcPr>
             <w:tcW w:type="dxa" w:w="3120"/>
-            <w:tcMar>
-              <w:top w:type="dxa" w:w="100"/>
-              <w:left w:type="dxa" w:w="120"/>
-              <w:bottom w:type="dxa" w:w="100"/>
-              <w:right w:type="dxa" w:w="120"/>
-            </w:tcMar>
-            <w:vAlign w:val="top"/>
-          </w:tcPr>
-          <w:p>
-            <w:r>
-              <w:rPr>
-                <w:b w:val="false"/>
-                <w:bCs w:val="false"/>
-                <w:color w:val="1F2A1F"/>
+            <w:shd w:fill="FBFAF6" w:val="clear"/>
+            <w:tcMar>
+              <w:top w:type="dxa" w:w="100"/>
+              <w:left w:type="dxa" w:w="120"/>
+              <w:bottom w:type="dxa" w:w="100"/>
+              <w:right w:type="dxa" w:w="120"/>
+            </w:tcMar>
+            <w:vAlign w:val="top"/>
+          </w:tcPr>
+          <w:p>
+            <w:r>
+              <w:rPr>
+                <w:b w:val="false"/>
+                <w:bCs w:val="false"/>
+                <w:color w:val="141414"/>
                 <w:sz w:val="20"/>
                 <w:szCs w:val="20"/>
               </w:rPr>
@@ -3340,20 +3571,21 @@
         <w:tc>
           <w:tcPr>
             <w:tcW w:type="dxa" w:w="1900"/>
-            <w:tcMar>
-              <w:top w:type="dxa" w:w="100"/>
-              <w:left w:type="dxa" w:w="120"/>
-              <w:bottom w:type="dxa" w:w="100"/>
-              <w:right w:type="dxa" w:w="120"/>
-            </w:tcMar>
-            <w:vAlign w:val="top"/>
-          </w:tcPr>
-          <w:p>
-            <w:r>
-              <w:rPr>
-                <w:b w:val="false"/>
-                <w:bCs w:val="false"/>
-                <w:color w:val="1F2A1F"/>
+            <w:shd w:fill="FBFAF6" w:val="clear"/>
+            <w:tcMar>
+              <w:top w:type="dxa" w:w="100"/>
+              <w:left w:type="dxa" w:w="120"/>
+              <w:bottom w:type="dxa" w:w="100"/>
+              <w:right w:type="dxa" w:w="120"/>
+            </w:tcMar>
+            <w:vAlign w:val="top"/>
+          </w:tcPr>
+          <w:p>
+            <w:r>
+              <w:rPr>
+                <w:b w:val="false"/>
+                <w:bCs w:val="false"/>
+                <w:color w:val="141414"/>
                 <w:sz w:val="20"/>
                 <w:szCs w:val="20"/>
               </w:rPr>
@@ -3366,20 +3598,21 @@
         <w:tc>
           <w:tcPr>
             <w:tcW w:type="dxa" w:w="2000"/>
-            <w:tcMar>
-              <w:top w:type="dxa" w:w="100"/>
-              <w:left w:type="dxa" w:w="120"/>
-              <w:bottom w:type="dxa" w:w="100"/>
-              <w:right w:type="dxa" w:w="120"/>
-            </w:tcMar>
-            <w:vAlign w:val="top"/>
-          </w:tcPr>
-          <w:p>
-            <w:r>
-              <w:rPr>
-                <w:b w:val="false"/>
-                <w:bCs w:val="false"/>
-                <w:color w:val="1F2A1F"/>
+            <w:shd w:fill="FBFAF6" w:val="clear"/>
+            <w:tcMar>
+              <w:top w:type="dxa" w:w="100"/>
+              <w:left w:type="dxa" w:w="120"/>
+              <w:bottom w:type="dxa" w:w="100"/>
+              <w:right w:type="dxa" w:w="120"/>
+            </w:tcMar>
+            <w:vAlign w:val="top"/>
+          </w:tcPr>
+          <w:p>
+            <w:r>
+              <w:rPr>
+                <w:b w:val="false"/>
+                <w:bCs w:val="false"/>
+                <w:color w:val="141414"/>
                 <w:sz w:val="20"/>
                 <w:szCs w:val="20"/>
               </w:rPr>
@@ -3390,20 +3623,21 @@
         <w:tc>
           <w:tcPr>
             <w:tcW w:type="dxa" w:w="2000"/>
-            <w:tcMar>
-              <w:top w:type="dxa" w:w="100"/>
-              <w:left w:type="dxa" w:w="120"/>
-              <w:bottom w:type="dxa" w:w="100"/>
-              <w:right w:type="dxa" w:w="120"/>
-            </w:tcMar>
-            <w:vAlign w:val="top"/>
-          </w:tcPr>
-          <w:p>
-            <w:r>
-              <w:rPr>
-                <w:b w:val="false"/>
-                <w:bCs w:val="false"/>
-                <w:color w:val="1F2A1F"/>
+            <w:shd w:fill="FBFAF6" w:val="clear"/>
+            <w:tcMar>
+              <w:top w:type="dxa" w:w="100"/>
+              <w:left w:type="dxa" w:w="120"/>
+              <w:bottom w:type="dxa" w:w="100"/>
+              <w:right w:type="dxa" w:w="120"/>
+            </w:tcMar>
+            <w:vAlign w:val="top"/>
+          </w:tcPr>
+          <w:p>
+            <w:r>
+              <w:rPr>
+                <w:b w:val="false"/>
+                <w:bCs w:val="false"/>
+                <w:color w:val="141414"/>
                 <w:sz w:val="20"/>
                 <w:szCs w:val="20"/>
               </w:rPr>
@@ -3414,20 +3648,21 @@
         <w:tc>
           <w:tcPr>
             <w:tcW w:type="dxa" w:w="3120"/>
-            <w:tcMar>
-              <w:top w:type="dxa" w:w="100"/>
-              <w:left w:type="dxa" w:w="120"/>
-              <w:bottom w:type="dxa" w:w="100"/>
-              <w:right w:type="dxa" w:w="120"/>
-            </w:tcMar>
-            <w:vAlign w:val="top"/>
-          </w:tcPr>
-          <w:p>
-            <w:r>
-              <w:rPr>
-                <w:b w:val="false"/>
-                <w:bCs w:val="false"/>
-                <w:color w:val="1F2A1F"/>
+            <w:shd w:fill="FBFAF6" w:val="clear"/>
+            <w:tcMar>
+              <w:top w:type="dxa" w:w="100"/>
+              <w:left w:type="dxa" w:w="120"/>
+              <w:bottom w:type="dxa" w:w="100"/>
+              <w:right w:type="dxa" w:w="120"/>
+            </w:tcMar>
+            <w:vAlign w:val="top"/>
+          </w:tcPr>
+          <w:p>
+            <w:r>
+              <w:rPr>
+                <w:b w:val="false"/>
+                <w:bCs w:val="false"/>
+                <w:color w:val="141414"/>
                 <w:sz w:val="20"/>
                 <w:szCs w:val="20"/>
               </w:rPr>
@@ -3438,20 +3673,21 @@
         <w:tc>
           <w:tcPr>
             <w:tcW w:type="dxa" w:w="1900"/>
-            <w:tcMar>
-              <w:top w:type="dxa" w:w="100"/>
-              <w:left w:type="dxa" w:w="120"/>
-              <w:bottom w:type="dxa" w:w="100"/>
-              <w:right w:type="dxa" w:w="120"/>
-            </w:tcMar>
-            <w:vAlign w:val="top"/>
-          </w:tcPr>
-          <w:p>
-            <w:r>
-              <w:rPr>
-                <w:b w:val="false"/>
-                <w:bCs w:val="false"/>
-                <w:color w:val="1F2A1F"/>
+            <w:shd w:fill="FBFAF6" w:val="clear"/>
+            <w:tcMar>
+              <w:top w:type="dxa" w:w="100"/>
+              <w:left w:type="dxa" w:w="120"/>
+              <w:bottom w:type="dxa" w:w="100"/>
+              <w:right w:type="dxa" w:w="120"/>
+            </w:tcMar>
+            <w:vAlign w:val="top"/>
+          </w:tcPr>
+          <w:p>
+            <w:r>
+              <w:rPr>
+                <w:b w:val="false"/>
+                <w:bCs w:val="false"/>
+                <w:color w:val="141414"/>
                 <w:sz w:val="20"/>
                 <w:szCs w:val="20"/>
               </w:rPr>
@@ -3464,20 +3700,21 @@
         <w:tc>
           <w:tcPr>
             <w:tcW w:type="dxa" w:w="2000"/>
-            <w:tcMar>
-              <w:top w:type="dxa" w:w="100"/>
-              <w:left w:type="dxa" w:w="120"/>
-              <w:bottom w:type="dxa" w:w="100"/>
-              <w:right w:type="dxa" w:w="120"/>
-            </w:tcMar>
-            <w:vAlign w:val="top"/>
-          </w:tcPr>
-          <w:p>
-            <w:r>
-              <w:rPr>
-                <w:b w:val="false"/>
-                <w:bCs w:val="false"/>
-                <w:color w:val="1F2A1F"/>
+            <w:shd w:fill="FBFAF6" w:val="clear"/>
+            <w:tcMar>
+              <w:top w:type="dxa" w:w="100"/>
+              <w:left w:type="dxa" w:w="120"/>
+              <w:bottom w:type="dxa" w:w="100"/>
+              <w:right w:type="dxa" w:w="120"/>
+            </w:tcMar>
+            <w:vAlign w:val="top"/>
+          </w:tcPr>
+          <w:p>
+            <w:r>
+              <w:rPr>
+                <w:b w:val="false"/>
+                <w:bCs w:val="false"/>
+                <w:color w:val="141414"/>
                 <w:sz w:val="20"/>
                 <w:szCs w:val="20"/>
               </w:rPr>
@@ -3488,20 +3725,21 @@
         <w:tc>
           <w:tcPr>
             <w:tcW w:type="dxa" w:w="2000"/>
-            <w:tcMar>
-              <w:top w:type="dxa" w:w="100"/>
-              <w:left w:type="dxa" w:w="120"/>
-              <w:bottom w:type="dxa" w:w="100"/>
-              <w:right w:type="dxa" w:w="120"/>
-            </w:tcMar>
-            <w:vAlign w:val="top"/>
-          </w:tcPr>
-          <w:p>
-            <w:r>
-              <w:rPr>
-                <w:b w:val="false"/>
-                <w:bCs w:val="false"/>
-                <w:color w:val="1F2A1F"/>
+            <w:shd w:fill="FBFAF6" w:val="clear"/>
+            <w:tcMar>
+              <w:top w:type="dxa" w:w="100"/>
+              <w:left w:type="dxa" w:w="120"/>
+              <w:bottom w:type="dxa" w:w="100"/>
+              <w:right w:type="dxa" w:w="120"/>
+            </w:tcMar>
+            <w:vAlign w:val="top"/>
+          </w:tcPr>
+          <w:p>
+            <w:r>
+              <w:rPr>
+                <w:b w:val="false"/>
+                <w:bCs w:val="false"/>
+                <w:color w:val="141414"/>
                 <w:sz w:val="20"/>
                 <w:szCs w:val="20"/>
               </w:rPr>
@@ -3512,20 +3750,21 @@
         <w:tc>
           <w:tcPr>
             <w:tcW w:type="dxa" w:w="3120"/>
-            <w:tcMar>
-              <w:top w:type="dxa" w:w="100"/>
-              <w:left w:type="dxa" w:w="120"/>
-              <w:bottom w:type="dxa" w:w="100"/>
-              <w:right w:type="dxa" w:w="120"/>
-            </w:tcMar>
-            <w:vAlign w:val="top"/>
-          </w:tcPr>
-          <w:p>
-            <w:r>
-              <w:rPr>
-                <w:b w:val="false"/>
-                <w:bCs w:val="false"/>
-                <w:color w:val="1F2A1F"/>
+            <w:shd w:fill="FBFAF6" w:val="clear"/>
+            <w:tcMar>
+              <w:top w:type="dxa" w:w="100"/>
+              <w:left w:type="dxa" w:w="120"/>
+              <w:bottom w:type="dxa" w:w="100"/>
+              <w:right w:type="dxa" w:w="120"/>
+            </w:tcMar>
+            <w:vAlign w:val="top"/>
+          </w:tcPr>
+          <w:p>
+            <w:r>
+              <w:rPr>
+                <w:b w:val="false"/>
+                <w:bCs w:val="false"/>
+                <w:color w:val="141414"/>
                 <w:sz w:val="20"/>
                 <w:szCs w:val="20"/>
               </w:rPr>
@@ -3536,20 +3775,21 @@
         <w:tc>
           <w:tcPr>
             <w:tcW w:type="dxa" w:w="1900"/>
-            <w:tcMar>
-              <w:top w:type="dxa" w:w="100"/>
-              <w:left w:type="dxa" w:w="120"/>
-              <w:bottom w:type="dxa" w:w="100"/>
-              <w:right w:type="dxa" w:w="120"/>
-            </w:tcMar>
-            <w:vAlign w:val="top"/>
-          </w:tcPr>
-          <w:p>
-            <w:r>
-              <w:rPr>
-                <w:b w:val="false"/>
-                <w:bCs w:val="false"/>
-                <w:color w:val="1F2A1F"/>
+            <w:shd w:fill="FBFAF6" w:val="clear"/>
+            <w:tcMar>
+              <w:top w:type="dxa" w:w="100"/>
+              <w:left w:type="dxa" w:w="120"/>
+              <w:bottom w:type="dxa" w:w="100"/>
+              <w:right w:type="dxa" w:w="120"/>
+            </w:tcMar>
+            <w:vAlign w:val="top"/>
+          </w:tcPr>
+          <w:p>
+            <w:r>
+              <w:rPr>
+                <w:b w:val="false"/>
+                <w:bCs w:val="false"/>
+                <w:color w:val="141414"/>
                 <w:sz w:val="20"/>
                 <w:szCs w:val="20"/>
               </w:rPr>
@@ -3565,7 +3805,7 @@
       </w:pPr>
       <w:r>
         <w:rPr>
-          <w:color w:val="1F2A1F"/>
+          <w:color w:val="141414"/>
           <w:sz w:val="21"/>
           <w:szCs w:val="21"/>
         </w:rPr>
@@ -3578,7 +3818,7 @@
       </w:pPr>
       <w:r>
         <w:rPr>
-          <w:color w:val="1F2A1F"/>
+          <w:color w:val="141414"/>
           <w:sz w:val="21"/>
           <w:szCs w:val="21"/>
         </w:rPr>
@@ -3593,7 +3833,7 @@
         <w:rPr>
           <w:i/>
           <w:iCs/>
-          <w:color w:val="5B6559"/>
+          <w:color w:val="6B6259"/>
           <w:sz w:val="21"/>
           <w:szCs w:val="21"/>
         </w:rPr>
@@ -3603,9 +3843,20 @@
     <w:p>
       <w:pPr>
         <w:pStyle w:val="Heading1"/>
-        <w:spacing w:after="200" w:before="400"/>
-      </w:pPr>
-      <w:r>
+        <w:pBdr>
+          <w:bottom w:val="single" w:color="F6D649" w:sz="16" w:space="4"/>
+        </w:pBdr>
+        <w:spacing w:after="200" w:before="420"/>
+      </w:pPr>
+      <w:r>
+        <w:rPr>
+          <w:rFonts w:ascii="Archivo" w:cs="Archivo" w:eastAsia="Archivo" w:hAnsi="Archivo"/>
+          <w:b/>
+          <w:bCs/>
+          <w:color w:val="1D2B8F"/>
+          <w:sz w:val="30"/>
+          <w:szCs w:val="30"/>
+        </w:rPr>
         <w:t xml:space="preserve">6 · Las pantallas  (Multimedia y Dispositivos Móviles)</w:t>
       </w:r>
     </w:p>
@@ -3615,6 +3866,14 @@
         <w:spacing w:after="150" w:before="300"/>
       </w:pPr>
       <w:r>
+        <w:rPr>
+          <w:rFonts w:ascii="Archivo" w:cs="Archivo" w:eastAsia="Archivo" w:hAnsi="Archivo"/>
+          <w:b/>
+          <w:bCs/>
+          <w:color w:val="B8322A"/>
+          <w:sz w:val="24"/>
+          <w:szCs w:val="24"/>
+        </w:rPr>
         <w:t xml:space="preserve">Mapa de navegación</w:t>
       </w:r>
     </w:p>
@@ -3624,7 +3883,7 @@
       </w:pPr>
       <w:r>
         <w:rPr>
-          <w:color w:val="1F2A1F"/>
+          <w:color w:val="141414"/>
           <w:sz w:val="21"/>
           <w:szCs w:val="21"/>
         </w:rPr>
@@ -3637,6 +3896,14 @@
         <w:spacing w:after="150" w:before="300"/>
       </w:pPr>
       <w:r>
+        <w:rPr>
+          <w:rFonts w:ascii="Archivo" w:cs="Archivo" w:eastAsia="Archivo" w:hAnsi="Archivo"/>
+          <w:b/>
+          <w:bCs/>
+          <w:color w:val="B8322A"/>
+          <w:sz w:val="24"/>
+          <w:szCs w:val="24"/>
+        </w:rPr>
         <w:t xml:space="preserve">Wireframe de la pantalla clave (Larder)</w:t>
       </w:r>
     </w:p>
@@ -3646,7 +3913,7 @@
       </w:pPr>
       <w:r>
         <w:rPr>
-          <w:color w:val="1F2A1F"/>
+          <w:color w:val="141414"/>
           <w:sz w:val="21"/>
           <w:szCs w:val="21"/>
         </w:rPr>
@@ -3659,6 +3926,14 @@
         <w:spacing w:after="150" w:before="300"/>
       </w:pPr>
       <w:r>
+        <w:rPr>
+          <w:rFonts w:ascii="Archivo" w:cs="Archivo" w:eastAsia="Archivo" w:hAnsi="Archivo"/>
+          <w:b/>
+          <w:bCs/>
+          <w:color w:val="B8322A"/>
+          <w:sz w:val="24"/>
+          <w:szCs w:val="24"/>
+        </w:rPr>
         <w:t xml:space="preserve">Los tres estados de cada pantalla</w:t>
       </w:r>
     </w:p>
@@ -3682,7 +3957,7 @@
         <w:tc>
           <w:tcPr>
             <w:tcW w:type="dxa" w:w="2400"/>
-            <w:shd w:fill="26402C" w:val="clear"/>
+            <w:shd w:fill="1D2B8F" w:val="clear"/>
             <w:tcMar>
               <w:top w:type="dxa" w:w="100"/>
               <w:left w:type="dxa" w:w="120"/>
@@ -3707,7 +3982,7 @@
         <w:tc>
           <w:tcPr>
             <w:tcW w:type="dxa" w:w="6620"/>
-            <w:shd w:fill="26402C" w:val="clear"/>
+            <w:shd w:fill="1D2B8F" w:val="clear"/>
             <w:tcMar>
               <w:top w:type="dxa" w:w="100"/>
               <w:left w:type="dxa" w:w="120"/>
@@ -3734,20 +4009,21 @@
         <w:tc>
           <w:tcPr>
             <w:tcW w:type="dxa" w:w="2400"/>
-            <w:tcMar>
-              <w:top w:type="dxa" w:w="100"/>
-              <w:left w:type="dxa" w:w="120"/>
-              <w:bottom w:type="dxa" w:w="100"/>
-              <w:right w:type="dxa" w:w="120"/>
-            </w:tcMar>
-            <w:vAlign w:val="top"/>
-          </w:tcPr>
-          <w:p>
-            <w:r>
-              <w:rPr>
-                <w:b/>
-                <w:bCs/>
-                <w:color w:val="1F2A1F"/>
+            <w:shd w:fill="FBFAF6" w:val="clear"/>
+            <w:tcMar>
+              <w:top w:type="dxa" w:w="100"/>
+              <w:left w:type="dxa" w:w="120"/>
+              <w:bottom w:type="dxa" w:w="100"/>
+              <w:right w:type="dxa" w:w="120"/>
+            </w:tcMar>
+            <w:vAlign w:val="top"/>
+          </w:tcPr>
+          <w:p>
+            <w:r>
+              <w:rPr>
+                <w:b/>
+                <w:bCs/>
+                <w:color w:val="141414"/>
                 <w:sz w:val="20"/>
                 <w:szCs w:val="20"/>
               </w:rPr>
@@ -3758,20 +4034,21 @@
         <w:tc>
           <w:tcPr>
             <w:tcW w:type="dxa" w:w="6620"/>
-            <w:tcMar>
-              <w:top w:type="dxa" w:w="100"/>
-              <w:left w:type="dxa" w:w="120"/>
-              <w:bottom w:type="dxa" w:w="100"/>
-              <w:right w:type="dxa" w:w="120"/>
-            </w:tcMar>
-            <w:vAlign w:val="top"/>
-          </w:tcPr>
-          <w:p>
-            <w:r>
-              <w:rPr>
-                <w:b w:val="false"/>
-                <w:bCs w:val="false"/>
-                <w:color w:val="1F2A1F"/>
+            <w:shd w:fill="FBFAF6" w:val="clear"/>
+            <w:tcMar>
+              <w:top w:type="dxa" w:w="100"/>
+              <w:left w:type="dxa" w:w="120"/>
+              <w:bottom w:type="dxa" w:w="100"/>
+              <w:right w:type="dxa" w:w="120"/>
+            </w:tcMar>
+            <w:vAlign w:val="top"/>
+          </w:tcPr>
+          <w:p>
+            <w:r>
+              <w:rPr>
+                <w:b w:val="false"/>
+                <w:bCs w:val="false"/>
+                <w:color w:val="141414"/>
                 <w:sz w:val="20"/>
                 <w:szCs w:val="20"/>
               </w:rPr>
@@ -3784,20 +4061,21 @@
         <w:tc>
           <w:tcPr>
             <w:tcW w:type="dxa" w:w="2400"/>
-            <w:tcMar>
-              <w:top w:type="dxa" w:w="100"/>
-              <w:left w:type="dxa" w:w="120"/>
-              <w:bottom w:type="dxa" w:w="100"/>
-              <w:right w:type="dxa" w:w="120"/>
-            </w:tcMar>
-            <w:vAlign w:val="top"/>
-          </w:tcPr>
-          <w:p>
-            <w:r>
-              <w:rPr>
-                <w:b/>
-                <w:bCs/>
-                <w:color w:val="1F2A1F"/>
+            <w:shd w:fill="FBFAF6" w:val="clear"/>
+            <w:tcMar>
+              <w:top w:type="dxa" w:w="100"/>
+              <w:left w:type="dxa" w:w="120"/>
+              <w:bottom w:type="dxa" w:w="100"/>
+              <w:right w:type="dxa" w:w="120"/>
+            </w:tcMar>
+            <w:vAlign w:val="top"/>
+          </w:tcPr>
+          <w:p>
+            <w:r>
+              <w:rPr>
+                <w:b/>
+                <w:bCs/>
+                <w:color w:val="141414"/>
                 <w:sz w:val="20"/>
                 <w:szCs w:val="20"/>
               </w:rPr>
@@ -3808,20 +4086,21 @@
         <w:tc>
           <w:tcPr>
             <w:tcW w:type="dxa" w:w="6620"/>
-            <w:tcMar>
-              <w:top w:type="dxa" w:w="100"/>
-              <w:left w:type="dxa" w:w="120"/>
-              <w:bottom w:type="dxa" w:w="100"/>
-              <w:right w:type="dxa" w:w="120"/>
-            </w:tcMar>
-            <w:vAlign w:val="top"/>
-          </w:tcPr>
-          <w:p>
-            <w:r>
-              <w:rPr>
-                <w:b w:val="false"/>
-                <w:bCs w:val="false"/>
-                <w:color w:val="1F2A1F"/>
+            <w:shd w:fill="FBFAF6" w:val="clear"/>
+            <w:tcMar>
+              <w:top w:type="dxa" w:w="100"/>
+              <w:left w:type="dxa" w:w="120"/>
+              <w:bottom w:type="dxa" w:w="100"/>
+              <w:right w:type="dxa" w:w="120"/>
+            </w:tcMar>
+            <w:vAlign w:val="top"/>
+          </w:tcPr>
+          <w:p>
+            <w:r>
+              <w:rPr>
+                <w:b w:val="false"/>
+                <w:bCs w:val="false"/>
+                <w:color w:val="141414"/>
                 <w:sz w:val="20"/>
                 <w:szCs w:val="20"/>
               </w:rPr>
@@ -3834,20 +4113,21 @@
         <w:tc>
           <w:tcPr>
             <w:tcW w:type="dxa" w:w="2400"/>
-            <w:tcMar>
-              <w:top w:type="dxa" w:w="100"/>
-              <w:left w:type="dxa" w:w="120"/>
-              <w:bottom w:type="dxa" w:w="100"/>
-              <w:right w:type="dxa" w:w="120"/>
-            </w:tcMar>
-            <w:vAlign w:val="top"/>
-          </w:tcPr>
-          <w:p>
-            <w:r>
-              <w:rPr>
-                <w:b/>
-                <w:bCs/>
-                <w:color w:val="1F2A1F"/>
+            <w:shd w:fill="FBFAF6" w:val="clear"/>
+            <w:tcMar>
+              <w:top w:type="dxa" w:w="100"/>
+              <w:left w:type="dxa" w:w="120"/>
+              <w:bottom w:type="dxa" w:w="100"/>
+              <w:right w:type="dxa" w:w="120"/>
+            </w:tcMar>
+            <w:vAlign w:val="top"/>
+          </w:tcPr>
+          <w:p>
+            <w:r>
+              <w:rPr>
+                <w:b/>
+                <w:bCs/>
+                <w:color w:val="141414"/>
                 <w:sz w:val="20"/>
                 <w:szCs w:val="20"/>
               </w:rPr>
@@ -3858,20 +4138,21 @@
         <w:tc>
           <w:tcPr>
             <w:tcW w:type="dxa" w:w="6620"/>
-            <w:tcMar>
-              <w:top w:type="dxa" w:w="100"/>
-              <w:left w:type="dxa" w:w="120"/>
-              <w:bottom w:type="dxa" w:w="100"/>
-              <w:right w:type="dxa" w:w="120"/>
-            </w:tcMar>
-            <w:vAlign w:val="top"/>
-          </w:tcPr>
-          <w:p>
-            <w:r>
-              <w:rPr>
-                <w:b w:val="false"/>
-                <w:bCs w:val="false"/>
-                <w:color w:val="1F2A1F"/>
+            <w:shd w:fill="FBFAF6" w:val="clear"/>
+            <w:tcMar>
+              <w:top w:type="dxa" w:w="100"/>
+              <w:left w:type="dxa" w:w="120"/>
+              <w:bottom w:type="dxa" w:w="100"/>
+              <w:right w:type="dxa" w:w="120"/>
+            </w:tcMar>
+            <w:vAlign w:val="top"/>
+          </w:tcPr>
+          <w:p>
+            <w:r>
+              <w:rPr>
+                <w:b w:val="false"/>
+                <w:bCs w:val="false"/>
+                <w:color w:val="141414"/>
                 <w:sz w:val="20"/>
                 <w:szCs w:val="20"/>
               </w:rPr>
@@ -3887,6 +4168,14 @@
         <w:spacing w:after="150" w:before="300"/>
       </w:pPr>
       <w:r>
+        <w:rPr>
+          <w:rFonts w:ascii="Archivo" w:cs="Archivo" w:eastAsia="Archivo" w:hAnsi="Archivo"/>
+          <w:b/>
+          <w:bCs/>
+          <w:color w:val="B8322A"/>
+          <w:sz w:val="24"/>
+          <w:szCs w:val="24"/>
+        </w:rPr>
         <w:t xml:space="preserve">Componentes repetidos (mínimo 3)</w:t>
       </w:r>
     </w:p>
@@ -3897,7 +4186,7 @@
       </w:pPr>
       <w:r>
         <w:rPr>
-          <w:color w:val="1F2A1F"/>
+          <w:color w:val="141414"/>
           <w:sz w:val="21"/>
           <w:szCs w:val="21"/>
         </w:rPr>
@@ -3911,7 +4200,7 @@
       </w:pPr>
       <w:r>
         <w:rPr>
-          <w:color w:val="1F2A1F"/>
+          <w:color w:val="141414"/>
           <w:sz w:val="21"/>
           <w:szCs w:val="21"/>
         </w:rPr>
@@ -3925,7 +4214,7 @@
       </w:pPr>
       <w:r>
         <w:rPr>
-          <w:color w:val="1F2A1F"/>
+          <w:color w:val="141414"/>
           <w:sz w:val="21"/>
           <w:szCs w:val="21"/>
         </w:rPr>
@@ -3939,7 +4228,7 @@
       </w:pPr>
       <w:r>
         <w:rPr>
-          <w:color w:val="1F2A1F"/>
+          <w:color w:val="141414"/>
           <w:sz w:val="21"/>
           <w:szCs w:val="21"/>
         </w:rPr>
@@ -3952,6 +4241,14 @@
         <w:spacing w:after="150" w:before="300"/>
       </w:pPr>
       <w:r>
+        <w:rPr>
+          <w:rFonts w:ascii="Archivo" w:cs="Archivo" w:eastAsia="Archivo" w:hAnsi="Archivo"/>
+          <w:b/>
+          <w:bCs/>
+          <w:color w:val="B8322A"/>
+          <w:sz w:val="24"/>
+          <w:szCs w:val="24"/>
+        </w:rPr>
         <w:t xml:space="preserve">La pantalla que va a React Native</w:t>
       </w:r>
     </w:p>
@@ -3975,7 +4272,7 @@
         <w:tc>
           <w:tcPr>
             <w:tcW w:type="dxa" w:w="2400"/>
-            <w:shd w:fill="26402C" w:val="clear"/>
+            <w:shd w:fill="1D2B8F" w:val="clear"/>
             <w:tcMar>
               <w:top w:type="dxa" w:w="100"/>
               <w:left w:type="dxa" w:w="120"/>
@@ -4000,7 +4297,7 @@
         <w:tc>
           <w:tcPr>
             <w:tcW w:type="dxa" w:w="6620"/>
-            <w:shd w:fill="26402C" w:val="clear"/>
+            <w:shd w:fill="1D2B8F" w:val="clear"/>
             <w:tcMar>
               <w:top w:type="dxa" w:w="100"/>
               <w:left w:type="dxa" w:w="120"/>
@@ -4027,20 +4324,21 @@
         <w:tc>
           <w:tcPr>
             <w:tcW w:type="dxa" w:w="2400"/>
-            <w:tcMar>
-              <w:top w:type="dxa" w:w="100"/>
-              <w:left w:type="dxa" w:w="120"/>
-              <w:bottom w:type="dxa" w:w="100"/>
-              <w:right w:type="dxa" w:w="120"/>
-            </w:tcMar>
-            <w:vAlign w:val="top"/>
-          </w:tcPr>
-          <w:p>
-            <w:r>
-              <w:rPr>
-                <w:b/>
-                <w:bCs/>
-                <w:color w:val="1F2A1F"/>
+            <w:shd w:fill="FBFAF6" w:val="clear"/>
+            <w:tcMar>
+              <w:top w:type="dxa" w:w="100"/>
+              <w:left w:type="dxa" w:w="120"/>
+              <w:bottom w:type="dxa" w:w="100"/>
+              <w:right w:type="dxa" w:w="120"/>
+            </w:tcMar>
+            <w:vAlign w:val="top"/>
+          </w:tcPr>
+          <w:p>
+            <w:r>
+              <w:rPr>
+                <w:b/>
+                <w:bCs/>
+                <w:color w:val="141414"/>
                 <w:sz w:val="20"/>
                 <w:szCs w:val="20"/>
               </w:rPr>
@@ -4051,20 +4349,21 @@
         <w:tc>
           <w:tcPr>
             <w:tcW w:type="dxa" w:w="6620"/>
-            <w:tcMar>
-              <w:top w:type="dxa" w:w="100"/>
-              <w:left w:type="dxa" w:w="120"/>
-              <w:bottom w:type="dxa" w:w="100"/>
-              <w:right w:type="dxa" w:w="120"/>
-            </w:tcMar>
-            <w:vAlign w:val="top"/>
-          </w:tcPr>
-          <w:p>
-            <w:r>
-              <w:rPr>
-                <w:b w:val="false"/>
-                <w:bCs w:val="false"/>
-                <w:color w:val="1F2A1F"/>
+            <w:shd w:fill="FBFAF6" w:val="clear"/>
+            <w:tcMar>
+              <w:top w:type="dxa" w:w="100"/>
+              <w:left w:type="dxa" w:w="120"/>
+              <w:bottom w:type="dxa" w:w="100"/>
+              <w:right w:type="dxa" w:w="120"/>
+            </w:tcMar>
+            <w:vAlign w:val="top"/>
+          </w:tcPr>
+          <w:p>
+            <w:r>
+              <w:rPr>
+                <w:b w:val="false"/>
+                <w:bCs w:val="false"/>
+                <w:color w:val="141414"/>
                 <w:sz w:val="20"/>
                 <w:szCs w:val="20"/>
               </w:rPr>
@@ -4077,20 +4376,21 @@
         <w:tc>
           <w:tcPr>
             <w:tcW w:type="dxa" w:w="2400"/>
-            <w:tcMar>
-              <w:top w:type="dxa" w:w="100"/>
-              <w:left w:type="dxa" w:w="120"/>
-              <w:bottom w:type="dxa" w:w="100"/>
-              <w:right w:type="dxa" w:w="120"/>
-            </w:tcMar>
-            <w:vAlign w:val="top"/>
-          </w:tcPr>
-          <w:p>
-            <w:r>
-              <w:rPr>
-                <w:b/>
-                <w:bCs/>
-                <w:color w:val="1F2A1F"/>
+            <w:shd w:fill="FBFAF6" w:val="clear"/>
+            <w:tcMar>
+              <w:top w:type="dxa" w:w="100"/>
+              <w:left w:type="dxa" w:w="120"/>
+              <w:bottom w:type="dxa" w:w="100"/>
+              <w:right w:type="dxa" w:w="120"/>
+            </w:tcMar>
+            <w:vAlign w:val="top"/>
+          </w:tcPr>
+          <w:p>
+            <w:r>
+              <w:rPr>
+                <w:b/>
+                <w:bCs/>
+                <w:color w:val="141414"/>
                 <w:sz w:val="20"/>
                 <w:szCs w:val="20"/>
               </w:rPr>
@@ -4101,20 +4401,21 @@
         <w:tc>
           <w:tcPr>
             <w:tcW w:type="dxa" w:w="6620"/>
-            <w:tcMar>
-              <w:top w:type="dxa" w:w="100"/>
-              <w:left w:type="dxa" w:w="120"/>
-              <w:bottom w:type="dxa" w:w="100"/>
-              <w:right w:type="dxa" w:w="120"/>
-            </w:tcMar>
-            <w:vAlign w:val="top"/>
-          </w:tcPr>
-          <w:p>
-            <w:r>
-              <w:rPr>
-                <w:b w:val="false"/>
-                <w:bCs w:val="false"/>
-                <w:color w:val="1F2A1F"/>
+            <w:shd w:fill="FBFAF6" w:val="clear"/>
+            <w:tcMar>
+              <w:top w:type="dxa" w:w="100"/>
+              <w:left w:type="dxa" w:w="120"/>
+              <w:bottom w:type="dxa" w:w="100"/>
+              <w:right w:type="dxa" w:w="120"/>
+            </w:tcMar>
+            <w:vAlign w:val="top"/>
+          </w:tcPr>
+          <w:p>
+            <w:r>
+              <w:rPr>
+                <w:b w:val="false"/>
+                <w:bCs w:val="false"/>
+                <w:color w:val="141414"/>
                 <w:sz w:val="20"/>
                 <w:szCs w:val="20"/>
               </w:rPr>
@@ -4127,20 +4428,21 @@
         <w:tc>
           <w:tcPr>
             <w:tcW w:type="dxa" w:w="2400"/>
-            <w:tcMar>
-              <w:top w:type="dxa" w:w="100"/>
-              <w:left w:type="dxa" w:w="120"/>
-              <w:bottom w:type="dxa" w:w="100"/>
-              <w:right w:type="dxa" w:w="120"/>
-            </w:tcMar>
-            <w:vAlign w:val="top"/>
-          </w:tcPr>
-          <w:p>
-            <w:r>
-              <w:rPr>
-                <w:b/>
-                <w:bCs/>
-                <w:color w:val="1F2A1F"/>
+            <w:shd w:fill="FBFAF6" w:val="clear"/>
+            <w:tcMar>
+              <w:top w:type="dxa" w:w="100"/>
+              <w:left w:type="dxa" w:w="120"/>
+              <w:bottom w:type="dxa" w:w="100"/>
+              <w:right w:type="dxa" w:w="120"/>
+            </w:tcMar>
+            <w:vAlign w:val="top"/>
+          </w:tcPr>
+          <w:p>
+            <w:r>
+              <w:rPr>
+                <w:b/>
+                <w:bCs/>
+                <w:color w:val="141414"/>
                 <w:sz w:val="20"/>
                 <w:szCs w:val="20"/>
               </w:rPr>
@@ -4151,20 +4453,21 @@
         <w:tc>
           <w:tcPr>
             <w:tcW w:type="dxa" w:w="6620"/>
-            <w:tcMar>
-              <w:top w:type="dxa" w:w="100"/>
-              <w:left w:type="dxa" w:w="120"/>
-              <w:bottom w:type="dxa" w:w="100"/>
-              <w:right w:type="dxa" w:w="120"/>
-            </w:tcMar>
-            <w:vAlign w:val="top"/>
-          </w:tcPr>
-          <w:p>
-            <w:r>
-              <w:rPr>
-                <w:b w:val="false"/>
-                <w:bCs w:val="false"/>
-                <w:color w:val="1F2A1F"/>
+            <w:shd w:fill="FBFAF6" w:val="clear"/>
+            <w:tcMar>
+              <w:top w:type="dxa" w:w="100"/>
+              <w:left w:type="dxa" w:w="120"/>
+              <w:bottom w:type="dxa" w:w="100"/>
+              <w:right w:type="dxa" w:w="120"/>
+            </w:tcMar>
+            <w:vAlign w:val="top"/>
+          </w:tcPr>
+          <w:p>
+            <w:r>
+              <w:rPr>
+                <w:b w:val="false"/>
+                <w:bCs w:val="false"/>
+                <w:color w:val="141414"/>
                 <w:sz w:val="20"/>
                 <w:szCs w:val="20"/>
               </w:rPr>
@@ -4177,20 +4480,21 @@
         <w:tc>
           <w:tcPr>
             <w:tcW w:type="dxa" w:w="2400"/>
-            <w:tcMar>
-              <w:top w:type="dxa" w:w="100"/>
-              <w:left w:type="dxa" w:w="120"/>
-              <w:bottom w:type="dxa" w:w="100"/>
-              <w:right w:type="dxa" w:w="120"/>
-            </w:tcMar>
-            <w:vAlign w:val="top"/>
-          </w:tcPr>
-          <w:p>
-            <w:r>
-              <w:rPr>
-                <w:b/>
-                <w:bCs/>
-                <w:color w:val="1F2A1F"/>
+            <w:shd w:fill="FBFAF6" w:val="clear"/>
+            <w:tcMar>
+              <w:top w:type="dxa" w:w="100"/>
+              <w:left w:type="dxa" w:w="120"/>
+              <w:bottom w:type="dxa" w:w="100"/>
+              <w:right w:type="dxa" w:w="120"/>
+            </w:tcMar>
+            <w:vAlign w:val="top"/>
+          </w:tcPr>
+          <w:p>
+            <w:r>
+              <w:rPr>
+                <w:b/>
+                <w:bCs/>
+                <w:color w:val="141414"/>
                 <w:sz w:val="20"/>
                 <w:szCs w:val="20"/>
               </w:rPr>
@@ -4201,20 +4505,21 @@
         <w:tc>
           <w:tcPr>
             <w:tcW w:type="dxa" w:w="6620"/>
-            <w:tcMar>
-              <w:top w:type="dxa" w:w="100"/>
-              <w:left w:type="dxa" w:w="120"/>
-              <w:bottom w:type="dxa" w:w="100"/>
-              <w:right w:type="dxa" w:w="120"/>
-            </w:tcMar>
-            <w:vAlign w:val="top"/>
-          </w:tcPr>
-          <w:p>
-            <w:r>
-              <w:rPr>
-                <w:b w:val="false"/>
-                <w:bCs w:val="false"/>
-                <w:color w:val="1F2A1F"/>
+            <w:shd w:fill="FBFAF6" w:val="clear"/>
+            <w:tcMar>
+              <w:top w:type="dxa" w:w="100"/>
+              <w:left w:type="dxa" w:w="120"/>
+              <w:bottom w:type="dxa" w:w="100"/>
+              <w:right w:type="dxa" w:w="120"/>
+            </w:tcMar>
+            <w:vAlign w:val="top"/>
+          </w:tcPr>
+          <w:p>
+            <w:r>
+              <w:rPr>
+                <w:b w:val="false"/>
+                <w:bCs w:val="false"/>
+                <w:color w:val="141414"/>
                 <w:sz w:val="20"/>
                 <w:szCs w:val="20"/>
               </w:rPr>
@@ -4232,7 +4537,7 @@
         <w:rPr>
           <w:i/>
           <w:iCs/>
-          <w:color w:val="5B6559"/>
+          <w:color w:val="6B6259"/>
           <w:sz w:val="21"/>
           <w:szCs w:val="21"/>
         </w:rPr>
@@ -4425,7 +4730,14 @@
 <file path=word/styles.xml><?xml version="1.0" encoding="utf-8"?>
 <w:styles xmlns:mc="http://schemas.openxmlformats.org/markup-compatibility/2006" xmlns:r="http://schemas.openxmlformats.org/officeDocument/2006/relationships" xmlns:w="http://schemas.openxmlformats.org/wordprocessingml/2006/main" xmlns:w14="http://schemas.microsoft.com/office/word/2010/wordml" xmlns:w15="http://schemas.microsoft.com/office/word/2012/wordml" mc:Ignorable="w14 w15">
   <w:docDefaults>
-    <w:rPrDefault/>
+    <w:rPrDefault>
+      <w:rPr>
+        <w:rFonts w:ascii="Archivo" w:cs="Archivo" w:eastAsia="Archivo" w:hAnsi="Archivo"/>
+        <w:color w:val="141414"/>
+        <w:sz w:val="21"/>
+        <w:szCs w:val="21"/>
+      </w:rPr>
+    </w:rPrDefault>
     <w:pPrDefault/>
   </w:docDefaults>
   <w:style w:type="paragraph" w:styleId="Title">

</xml_diff>

<commit_message>
Suavizar la estética del documento: acentos discretos, no bloques de color
Sustituye las cabeceras de tabla en rojo/azul/ámbar por un estilo de cuaderno (fondo crema, texto en tinta, un solo filete azul) y reduce el color a detalles puntuales: el punto de fase en la hoja de ruta, el borde de las notas y la línea bajo los títulos.

Co-Authored-By: Claude Sonnet 5 <noreply@anthropic.com>
Claude-Session: https://claude.ai/code/session_012BwrUiCYr6ApYk5hmXyh4o
</commit_message>
<xml_diff>
--- a/docs/especificacion-tecnica.docx
+++ b/docs/especificacion-tecnica.docx
@@ -9,63 +9,62 @@
       </w:pPr>
       <w:r>
         <w:rPr>
-          <w:rFonts w:ascii="Covered By Your Grace" w:cs="Covered By Your Grace" w:eastAsia="Covered By Your Grace" w:hAnsi="Covered By Your Grace"/>
-          <w:b/>
-          <w:bCs/>
-          <w:color w:val="1D2B8F"/>
-          <w:sz w:val="72"/>
-          <w:szCs w:val="72"/>
-        </w:rPr>
-        <w:t xml:space="preserve">LARDER</w:t>
-      </w:r>
-    </w:p>
-    <w:p>
-      <w:pPr>
-        <w:spacing w:after="120"/>
-      </w:pPr>
-      <w:r>
-        <w:rPr>
-          <w:rFonts w:ascii="Archivo" w:cs="Archivo" w:eastAsia="Archivo" w:hAnsi="Archivo"/>
-          <w:color w:val="141414"/>
-          <w:sz w:val="28"/>
-          <w:szCs w:val="28"/>
-        </w:rPr>
-        <w:t xml:space="preserve">Especificación técnica — Proyecto 1</w:t>
-      </w:r>
-    </w:p>
-    <w:p>
-      <w:pPr>
-        <w:spacing w:after="400"/>
-      </w:pPr>
-      <w:r>
-        <w:rPr>
-          <w:rFonts w:ascii="Archivo" w:cs="Archivo" w:eastAsia="Archivo" w:hAnsi="Archivo"/>
-          <w:b/>
-          <w:bCs/>
-          <w:color w:val="141414"/>
-          <w:sz w:val="18"/>
-          <w:szCs w:val="18"/>
-          <w:shd w:fill="F6D649" w:val="clear"/>
-        </w:rPr>
-        <w:t xml:space="preserve">  PUNTO DE CONTROL 1  </w:t>
-      </w:r>
-    </w:p>
-    <w:p>
-      <w:pPr>
-        <w:pStyle w:val="Heading1"/>
-        <w:pBdr>
-          <w:bottom w:val="single" w:color="F6D649" w:sz="16" w:space="4"/>
-        </w:pBdr>
-        <w:spacing w:after="200" w:before="420"/>
-      </w:pPr>
-      <w:r>
-        <w:rPr>
           <w:rFonts w:ascii="Archivo" w:cs="Archivo" w:eastAsia="Archivo" w:hAnsi="Archivo"/>
           <w:b/>
           <w:bCs/>
           <w:color w:val="1D2B8F"/>
-          <w:sz w:val="30"/>
-          <w:szCs w:val="30"/>
+          <w:sz w:val="48"/>
+          <w:szCs w:val="48"/>
+        </w:rPr>
+        <w:t xml:space="preserve">LARDER</w:t>
+      </w:r>
+    </w:p>
+    <w:p>
+      <w:pPr>
+        <w:spacing w:after="60"/>
+      </w:pPr>
+      <w:r>
+        <w:rPr>
+          <w:rFonts w:ascii="Archivo" w:cs="Archivo" w:eastAsia="Archivo" w:hAnsi="Archivo"/>
+          <w:color w:val="141414"/>
+          <w:sz w:val="26"/>
+          <w:szCs w:val="26"/>
+        </w:rPr>
+        <w:t xml:space="preserve">Especificación técnica — Proyecto 1</w:t>
+      </w:r>
+    </w:p>
+    <w:p>
+      <w:pPr>
+        <w:spacing w:after="400"/>
+      </w:pPr>
+      <w:r>
+        <w:rPr>
+          <w:rFonts w:ascii="Archivo" w:cs="Archivo" w:eastAsia="Archivo" w:hAnsi="Archivo"/>
+          <w:i/>
+          <w:iCs/>
+          <w:color w:val="6B6259"/>
+          <w:sz w:val="19"/>
+          <w:szCs w:val="19"/>
+        </w:rPr>
+        <w:t xml:space="preserve">Punto de Control 1</w:t>
+      </w:r>
+    </w:p>
+    <w:p>
+      <w:pPr>
+        <w:pStyle w:val="Heading1"/>
+        <w:pBdr>
+          <w:bottom w:val="single" w:color="F6D649" w:sz="8" w:space="4"/>
+        </w:pBdr>
+        <w:spacing w:after="200" w:before="420"/>
+      </w:pPr>
+      <w:r>
+        <w:rPr>
+          <w:rFonts w:ascii="Archivo" w:cs="Archivo" w:eastAsia="Archivo" w:hAnsi="Archivo"/>
+          <w:b/>
+          <w:bCs/>
+          <w:color w:val="1D2B8F"/>
+          <w:sz w:val="28"/>
+          <w:szCs w:val="28"/>
         </w:rPr>
         <w:t xml:space="preserve">1 · El plan de una página</w:t>
       </w:r>
@@ -90,21 +89,24 @@
         <w:tc>
           <w:tcPr>
             <w:tcW w:type="dxa" w:w="2400"/>
-            <w:shd w:fill="1D2B8F" w:val="clear"/>
-            <w:tcMar>
-              <w:top w:type="dxa" w:w="100"/>
-              <w:left w:type="dxa" w:w="120"/>
-              <w:bottom w:type="dxa" w:w="100"/>
-              <w:right w:type="dxa" w:w="120"/>
-            </w:tcMar>
-            <w:vAlign w:val="top"/>
-          </w:tcPr>
-          <w:p>
-            <w:r>
-              <w:rPr>
-                <w:b/>
-                <w:bCs/>
-                <w:color w:val="FFFFFF"/>
+            <w:tcBorders>
+              <w:bottom w:val="single" w:color="1D2B8F" w:sz="10"/>
+            </w:tcBorders>
+            <w:shd w:fill="E4DFD3" w:val="clear"/>
+            <w:tcMar>
+              <w:top w:type="dxa" w:w="100"/>
+              <w:left w:type="dxa" w:w="120"/>
+              <w:bottom w:type="dxa" w:w="100"/>
+              <w:right w:type="dxa" w:w="120"/>
+            </w:tcMar>
+            <w:vAlign w:val="top"/>
+          </w:tcPr>
+          <w:p>
+            <w:r>
+              <w:rPr>
+                <w:b/>
+                <w:bCs/>
+                <w:color w:val="141414"/>
                 <w:sz w:val="20"/>
                 <w:szCs w:val="20"/>
               </w:rPr>
@@ -115,21 +117,24 @@
         <w:tc>
           <w:tcPr>
             <w:tcW w:type="dxa" w:w="6620"/>
-            <w:shd w:fill="1D2B8F" w:val="clear"/>
-            <w:tcMar>
-              <w:top w:type="dxa" w:w="100"/>
-              <w:left w:type="dxa" w:w="120"/>
-              <w:bottom w:type="dxa" w:w="100"/>
-              <w:right w:type="dxa" w:w="120"/>
-            </w:tcMar>
-            <w:vAlign w:val="top"/>
-          </w:tcPr>
-          <w:p>
-            <w:r>
-              <w:rPr>
-                <w:b/>
-                <w:bCs/>
-                <w:color w:val="FFFFFF"/>
+            <w:tcBorders>
+              <w:bottom w:val="single" w:color="1D2B8F" w:sz="10"/>
+            </w:tcBorders>
+            <w:shd w:fill="E4DFD3" w:val="clear"/>
+            <w:tcMar>
+              <w:top w:type="dxa" w:w="100"/>
+              <w:left w:type="dxa" w:w="120"/>
+              <w:bottom w:type="dxa" w:w="100"/>
+              <w:right w:type="dxa" w:w="120"/>
+            </w:tcMar>
+            <w:vAlign w:val="top"/>
+          </w:tcPr>
+          <w:p>
+            <w:r>
+              <w:rPr>
+                <w:b/>
+                <w:bCs/>
+                <w:color w:val="141414"/>
                 <w:sz w:val="20"/>
                 <w:szCs w:val="20"/>
               </w:rPr>
@@ -259,16 +264,16 @@
     <w:p>
       <w:pPr>
         <w:pStyle w:val="Heading2"/>
-        <w:spacing w:after="150" w:before="300"/>
+        <w:spacing w:after="140" w:before="280"/>
       </w:pPr>
       <w:r>
         <w:rPr>
           <w:rFonts w:ascii="Archivo" w:cs="Archivo" w:eastAsia="Archivo" w:hAnsi="Archivo"/>
           <w:b/>
           <w:bCs/>
-          <w:color w:val="B8322A"/>
-          <w:sz w:val="24"/>
-          <w:szCs w:val="24"/>
+          <w:color w:val="1D2B8F"/>
+          <w:sz w:val="22"/>
+          <w:szCs w:val="22"/>
         </w:rPr>
         <w:t xml:space="preserve">Hoja de ruta</w:t>
       </w:r>
@@ -295,21 +300,24 @@
         <w:tc>
           <w:tcPr>
             <w:tcW w:type="dxa" w:w="2000"/>
-            <w:shd w:fill="1D2B8F" w:val="clear"/>
-            <w:tcMar>
-              <w:top w:type="dxa" w:w="100"/>
-              <w:left w:type="dxa" w:w="120"/>
-              <w:bottom w:type="dxa" w:w="100"/>
-              <w:right w:type="dxa" w:w="120"/>
-            </w:tcMar>
-            <w:vAlign w:val="top"/>
-          </w:tcPr>
-          <w:p>
-            <w:r>
-              <w:rPr>
-                <w:b/>
-                <w:bCs/>
-                <w:color w:val="FFFFFF"/>
+            <w:tcBorders>
+              <w:bottom w:val="single" w:color="1D2B8F" w:sz="10"/>
+            </w:tcBorders>
+            <w:shd w:fill="E4DFD3" w:val="clear"/>
+            <w:tcMar>
+              <w:top w:type="dxa" w:w="100"/>
+              <w:left w:type="dxa" w:w="120"/>
+              <w:bottom w:type="dxa" w:w="100"/>
+              <w:right w:type="dxa" w:w="120"/>
+            </w:tcMar>
+            <w:vAlign w:val="top"/>
+          </w:tcPr>
+          <w:p>
+            <w:r>
+              <w:rPr>
+                <w:b/>
+                <w:bCs/>
+                <w:color w:val="141414"/>
                 <w:sz w:val="20"/>
                 <w:szCs w:val="20"/>
               </w:rPr>
@@ -320,21 +328,34 @@
         <w:tc>
           <w:tcPr>
             <w:tcW w:type="dxa" w:w="2340"/>
-            <w:shd w:fill="1D2B8F" w:val="clear"/>
-            <w:tcMar>
-              <w:top w:type="dxa" w:w="100"/>
-              <w:left w:type="dxa" w:w="120"/>
-              <w:bottom w:type="dxa" w:w="100"/>
-              <w:right w:type="dxa" w:w="120"/>
-            </w:tcMar>
-            <w:vAlign w:val="top"/>
-          </w:tcPr>
-          <w:p>
-            <w:r>
-              <w:rPr>
-                <w:b/>
-                <w:bCs/>
-                <w:color w:val="FFFFFF"/>
+            <w:tcBorders>
+              <w:bottom w:val="single" w:color="1D2B8F" w:sz="10"/>
+            </w:tcBorders>
+            <w:shd w:fill="E4DFD3" w:val="clear"/>
+            <w:tcMar>
+              <w:top w:type="dxa" w:w="100"/>
+              <w:left w:type="dxa" w:w="120"/>
+              <w:bottom w:type="dxa" w:w="100"/>
+              <w:right w:type="dxa" w:w="120"/>
+            </w:tcMar>
+            <w:vAlign w:val="top"/>
+          </w:tcPr>
+          <w:p>
+            <w:r>
+              <w:rPr>
+                <w:b/>
+                <w:bCs/>
+                <w:color w:val="1D2B8F"/>
+                <w:sz w:val="20"/>
+                <w:szCs w:val="20"/>
+              </w:rPr>
+              <w:t xml:space="preserve">● </w:t>
+            </w:r>
+            <w:r>
+              <w:rPr>
+                <w:b/>
+                <w:bCs/>
+                <w:color w:val="141414"/>
                 <w:sz w:val="20"/>
                 <w:szCs w:val="20"/>
               </w:rPr>
@@ -345,16 +366,29 @@
         <w:tc>
           <w:tcPr>
             <w:tcW w:type="dxa" w:w="2340"/>
-            <w:shd w:fill="D9A21C" w:val="clear"/>
-            <w:tcMar>
-              <w:top w:type="dxa" w:w="100"/>
-              <w:left w:type="dxa" w:w="120"/>
-              <w:bottom w:type="dxa" w:w="100"/>
-              <w:right w:type="dxa" w:w="120"/>
-            </w:tcMar>
-            <w:vAlign w:val="top"/>
-          </w:tcPr>
-          <w:p>
+            <w:tcBorders>
+              <w:bottom w:val="single" w:color="1D2B8F" w:sz="10"/>
+            </w:tcBorders>
+            <w:shd w:fill="E4DFD3" w:val="clear"/>
+            <w:tcMar>
+              <w:top w:type="dxa" w:w="100"/>
+              <w:left w:type="dxa" w:w="120"/>
+              <w:bottom w:type="dxa" w:w="100"/>
+              <w:right w:type="dxa" w:w="120"/>
+            </w:tcMar>
+            <w:vAlign w:val="top"/>
+          </w:tcPr>
+          <w:p>
+            <w:r>
+              <w:rPr>
+                <w:b/>
+                <w:bCs/>
+                <w:color w:val="D9A21C"/>
+                <w:sz w:val="20"/>
+                <w:szCs w:val="20"/>
+              </w:rPr>
+              <w:t xml:space="preserve">● </w:t>
+            </w:r>
             <w:r>
               <w:rPr>
                 <w:b/>
@@ -370,21 +404,34 @@
         <w:tc>
           <w:tcPr>
             <w:tcW w:type="dxa" w:w="2340"/>
-            <w:shd w:fill="B8322A" w:val="clear"/>
-            <w:tcMar>
-              <w:top w:type="dxa" w:w="100"/>
-              <w:left w:type="dxa" w:w="120"/>
-              <w:bottom w:type="dxa" w:w="100"/>
-              <w:right w:type="dxa" w:w="120"/>
-            </w:tcMar>
-            <w:vAlign w:val="top"/>
-          </w:tcPr>
-          <w:p>
-            <w:r>
-              <w:rPr>
-                <w:b/>
-                <w:bCs/>
-                <w:color w:val="FFFFFF"/>
+            <w:tcBorders>
+              <w:bottom w:val="single" w:color="1D2B8F" w:sz="10"/>
+            </w:tcBorders>
+            <w:shd w:fill="E4DFD3" w:val="clear"/>
+            <w:tcMar>
+              <w:top w:type="dxa" w:w="100"/>
+              <w:left w:type="dxa" w:w="120"/>
+              <w:bottom w:type="dxa" w:w="100"/>
+              <w:right w:type="dxa" w:w="120"/>
+            </w:tcMar>
+            <w:vAlign w:val="top"/>
+          </w:tcPr>
+          <w:p>
+            <w:r>
+              <w:rPr>
+                <w:b/>
+                <w:bCs/>
+                <w:color w:val="B8322A"/>
+                <w:sz w:val="20"/>
+                <w:szCs w:val="20"/>
+              </w:rPr>
+              <w:t xml:space="preserve">● </w:t>
+            </w:r>
+            <w:r>
+              <w:rPr>
+                <w:b/>
+                <w:bCs/>
+                <w:color w:val="141414"/>
                 <w:sz w:val="20"/>
                 <w:szCs w:val="20"/>
               </w:rPr>
@@ -836,16 +883,16 @@
     <w:p>
       <w:pPr>
         <w:pStyle w:val="Heading2"/>
-        <w:spacing w:after="150" w:before="300"/>
+        <w:spacing w:after="140" w:before="280"/>
       </w:pPr>
       <w:r>
         <w:rPr>
           <w:rFonts w:ascii="Archivo" w:cs="Archivo" w:eastAsia="Archivo" w:hAnsi="Archivo"/>
           <w:b/>
           <w:bCs/>
-          <w:color w:val="B8322A"/>
-          <w:sz w:val="24"/>
-          <w:szCs w:val="24"/>
+          <w:color w:val="1D2B8F"/>
+          <w:sz w:val="22"/>
+          <w:szCs w:val="22"/>
         </w:rPr>
         <w:t xml:space="preserve">Inversión</w:t>
       </w:r>
@@ -870,21 +917,24 @@
         <w:tc>
           <w:tcPr>
             <w:tcW w:type="dxa" w:w="2400"/>
-            <w:shd w:fill="1D2B8F" w:val="clear"/>
-            <w:tcMar>
-              <w:top w:type="dxa" w:w="100"/>
-              <w:left w:type="dxa" w:w="120"/>
-              <w:bottom w:type="dxa" w:w="100"/>
-              <w:right w:type="dxa" w:w="120"/>
-            </w:tcMar>
-            <w:vAlign w:val="top"/>
-          </w:tcPr>
-          <w:p>
-            <w:r>
-              <w:rPr>
-                <w:b/>
-                <w:bCs/>
-                <w:color w:val="FFFFFF"/>
+            <w:tcBorders>
+              <w:bottom w:val="single" w:color="1D2B8F" w:sz="10"/>
+            </w:tcBorders>
+            <w:shd w:fill="E4DFD3" w:val="clear"/>
+            <w:tcMar>
+              <w:top w:type="dxa" w:w="100"/>
+              <w:left w:type="dxa" w:w="120"/>
+              <w:bottom w:type="dxa" w:w="100"/>
+              <w:right w:type="dxa" w:w="120"/>
+            </w:tcMar>
+            <w:vAlign w:val="top"/>
+          </w:tcPr>
+          <w:p>
+            <w:r>
+              <w:rPr>
+                <w:b/>
+                <w:bCs/>
+                <w:color w:val="141414"/>
                 <w:sz w:val="20"/>
                 <w:szCs w:val="20"/>
               </w:rPr>
@@ -895,21 +945,24 @@
         <w:tc>
           <w:tcPr>
             <w:tcW w:type="dxa" w:w="6620"/>
-            <w:shd w:fill="1D2B8F" w:val="clear"/>
-            <w:tcMar>
-              <w:top w:type="dxa" w:w="100"/>
-              <w:left w:type="dxa" w:w="120"/>
-              <w:bottom w:type="dxa" w:w="100"/>
-              <w:right w:type="dxa" w:w="120"/>
-            </w:tcMar>
-            <w:vAlign w:val="top"/>
-          </w:tcPr>
-          <w:p>
-            <w:r>
-              <w:rPr>
-                <w:b/>
-                <w:bCs/>
-                <w:color w:val="FFFFFF"/>
+            <w:tcBorders>
+              <w:bottom w:val="single" w:color="1D2B8F" w:sz="10"/>
+            </w:tcBorders>
+            <w:shd w:fill="E4DFD3" w:val="clear"/>
+            <w:tcMar>
+              <w:top w:type="dxa" w:w="100"/>
+              <w:left w:type="dxa" w:w="120"/>
+              <w:bottom w:type="dxa" w:w="100"/>
+              <w:right w:type="dxa" w:w="120"/>
+            </w:tcMar>
+            <w:vAlign w:val="top"/>
+          </w:tcPr>
+          <w:p>
+            <w:r>
+              <w:rPr>
+                <w:b/>
+                <w:bCs/>
+                <w:color w:val="141414"/>
                 <w:sz w:val="20"/>
                 <w:szCs w:val="20"/>
               </w:rPr>
@@ -1039,16 +1092,16 @@
     <w:p>
       <w:pPr>
         <w:pStyle w:val="Heading2"/>
-        <w:spacing w:after="150" w:before="300"/>
+        <w:spacing w:after="140" w:before="280"/>
       </w:pPr>
       <w:r>
         <w:rPr>
           <w:rFonts w:ascii="Archivo" w:cs="Archivo" w:eastAsia="Archivo" w:hAnsi="Archivo"/>
           <w:b/>
           <w:bCs/>
-          <w:color w:val="B8322A"/>
-          <w:sz w:val="24"/>
-          <w:szCs w:val="24"/>
+          <w:color w:val="1D2B8F"/>
+          <w:sz w:val="22"/>
+          <w:szCs w:val="22"/>
         </w:rPr>
         <w:t xml:space="preserve">Riesgos</w:t>
       </w:r>
@@ -1066,28 +1119,31 @@
         </w:tblBorders>
       </w:tblPr>
       <w:tblGrid>
-        <w:gridCol w:w="4510"/>
-        <w:gridCol w:w="4510"/>
+        <w:gridCol w:w="3500"/>
+        <w:gridCol w:w="5520"/>
       </w:tblGrid>
       <w:tr>
         <w:tc>
           <w:tcPr>
-            <w:tcW w:type="dxa" w:w="4510"/>
-            <w:shd w:fill="B8322A" w:val="clear"/>
-            <w:tcMar>
-              <w:top w:type="dxa" w:w="100"/>
-              <w:left w:type="dxa" w:w="120"/>
-              <w:bottom w:type="dxa" w:w="100"/>
-              <w:right w:type="dxa" w:w="120"/>
-            </w:tcMar>
-            <w:vAlign w:val="top"/>
-          </w:tcPr>
-          <w:p>
-            <w:r>
-              <w:rPr>
-                <w:b/>
-                <w:bCs/>
-                <w:color w:val="FFFFFF"/>
+            <w:tcW w:type="dxa" w:w="3500"/>
+            <w:tcBorders>
+              <w:bottom w:val="single" w:color="1D2B8F" w:sz="10"/>
+            </w:tcBorders>
+            <w:shd w:fill="E4DFD3" w:val="clear"/>
+            <w:tcMar>
+              <w:top w:type="dxa" w:w="100"/>
+              <w:left w:type="dxa" w:w="120"/>
+              <w:bottom w:type="dxa" w:w="100"/>
+              <w:right w:type="dxa" w:w="120"/>
+            </w:tcMar>
+            <w:vAlign w:val="top"/>
+          </w:tcPr>
+          <w:p>
+            <w:r>
+              <w:rPr>
+                <w:b/>
+                <w:bCs/>
+                <w:color w:val="141414"/>
                 <w:sz w:val="20"/>
                 <w:szCs w:val="20"/>
               </w:rPr>
@@ -1097,22 +1153,25 @@
         </w:tc>
         <w:tc>
           <w:tcPr>
-            <w:tcW w:type="dxa" w:w="4510"/>
-            <w:shd w:fill="B8322A" w:val="clear"/>
-            <w:tcMar>
-              <w:top w:type="dxa" w:w="100"/>
-              <w:left w:type="dxa" w:w="120"/>
-              <w:bottom w:type="dxa" w:w="100"/>
-              <w:right w:type="dxa" w:w="120"/>
-            </w:tcMar>
-            <w:vAlign w:val="top"/>
-          </w:tcPr>
-          <w:p>
-            <w:r>
-              <w:rPr>
-                <w:b/>
-                <w:bCs/>
-                <w:color w:val="FFFFFF"/>
+            <w:tcW w:type="dxa" w:w="5520"/>
+            <w:tcBorders>
+              <w:bottom w:val="single" w:color="1D2B8F" w:sz="10"/>
+            </w:tcBorders>
+            <w:shd w:fill="E4DFD3" w:val="clear"/>
+            <w:tcMar>
+              <w:top w:type="dxa" w:w="100"/>
+              <w:left w:type="dxa" w:w="120"/>
+              <w:bottom w:type="dxa" w:w="100"/>
+              <w:right w:type="dxa" w:w="120"/>
+            </w:tcMar>
+            <w:vAlign w:val="top"/>
+          </w:tcPr>
+          <w:p>
+            <w:r>
+              <w:rPr>
+                <w:b/>
+                <w:bCs/>
+                <w:color w:val="141414"/>
                 <w:sz w:val="20"/>
                 <w:szCs w:val="20"/>
               </w:rPr>
@@ -1124,21 +1183,21 @@
       <w:tr>
         <w:tc>
           <w:tcPr>
-            <w:tcW w:type="dxa" w:w="4510"/>
-            <w:shd w:fill="FBFAF6" w:val="clear"/>
-            <w:tcMar>
-              <w:top w:type="dxa" w:w="100"/>
-              <w:left w:type="dxa" w:w="120"/>
-              <w:bottom w:type="dxa" w:w="100"/>
-              <w:right w:type="dxa" w:w="120"/>
-            </w:tcMar>
-            <w:vAlign w:val="top"/>
-          </w:tcPr>
-          <w:p>
-            <w:r>
-              <w:rPr>
-                <w:b w:val="false"/>
-                <w:bCs w:val="false"/>
+            <w:tcW w:type="dxa" w:w="3500"/>
+            <w:shd w:fill="FBFAF6" w:val="clear"/>
+            <w:tcMar>
+              <w:top w:type="dxa" w:w="100"/>
+              <w:left w:type="dxa" w:w="120"/>
+              <w:bottom w:type="dxa" w:w="100"/>
+              <w:right w:type="dxa" w:w="120"/>
+            </w:tcMar>
+            <w:vAlign w:val="top"/>
+          </w:tcPr>
+          <w:p>
+            <w:r>
+              <w:rPr>
+                <w:b/>
+                <w:bCs/>
                 <w:color w:val="141414"/>
                 <w:sz w:val="20"/>
                 <w:szCs w:val="20"/>
@@ -1149,7 +1208,7 @@
         </w:tc>
         <w:tc>
           <w:tcPr>
-            <w:tcW w:type="dxa" w:w="4510"/>
+            <w:tcW w:type="dxa" w:w="5520"/>
             <w:shd w:fill="FBFAF6" w:val="clear"/>
             <w:tcMar>
               <w:top w:type="dxa" w:w="100"/>
@@ -1176,21 +1235,21 @@
       <w:tr>
         <w:tc>
           <w:tcPr>
-            <w:tcW w:type="dxa" w:w="4510"/>
-            <w:shd w:fill="FBFAF6" w:val="clear"/>
-            <w:tcMar>
-              <w:top w:type="dxa" w:w="100"/>
-              <w:left w:type="dxa" w:w="120"/>
-              <w:bottom w:type="dxa" w:w="100"/>
-              <w:right w:type="dxa" w:w="120"/>
-            </w:tcMar>
-            <w:vAlign w:val="top"/>
-          </w:tcPr>
-          <w:p>
-            <w:r>
-              <w:rPr>
-                <w:b w:val="false"/>
-                <w:bCs w:val="false"/>
+            <w:tcW w:type="dxa" w:w="3500"/>
+            <w:shd w:fill="FBFAF6" w:val="clear"/>
+            <w:tcMar>
+              <w:top w:type="dxa" w:w="100"/>
+              <w:left w:type="dxa" w:w="120"/>
+              <w:bottom w:type="dxa" w:w="100"/>
+              <w:right w:type="dxa" w:w="120"/>
+            </w:tcMar>
+            <w:vAlign w:val="top"/>
+          </w:tcPr>
+          <w:p>
+            <w:r>
+              <w:rPr>
+                <w:b/>
+                <w:bCs/>
                 <w:color w:val="141414"/>
                 <w:sz w:val="20"/>
                 <w:szCs w:val="20"/>
@@ -1201,7 +1260,7 @@
         </w:tc>
         <w:tc>
           <w:tcPr>
-            <w:tcW w:type="dxa" w:w="4510"/>
+            <w:tcW w:type="dxa" w:w="5520"/>
             <w:shd w:fill="FBFAF6" w:val="clear"/>
             <w:tcMar>
               <w:top w:type="dxa" w:w="100"/>
@@ -1228,21 +1287,21 @@
       <w:tr>
         <w:tc>
           <w:tcPr>
-            <w:tcW w:type="dxa" w:w="4510"/>
-            <w:shd w:fill="FBFAF6" w:val="clear"/>
-            <w:tcMar>
-              <w:top w:type="dxa" w:w="100"/>
-              <w:left w:type="dxa" w:w="120"/>
-              <w:bottom w:type="dxa" w:w="100"/>
-              <w:right w:type="dxa" w:w="120"/>
-            </w:tcMar>
-            <w:vAlign w:val="top"/>
-          </w:tcPr>
-          <w:p>
-            <w:r>
-              <w:rPr>
-                <w:b w:val="false"/>
-                <w:bCs w:val="false"/>
+            <w:tcW w:type="dxa" w:w="3500"/>
+            <w:shd w:fill="FBFAF6" w:val="clear"/>
+            <w:tcMar>
+              <w:top w:type="dxa" w:w="100"/>
+              <w:left w:type="dxa" w:w="120"/>
+              <w:bottom w:type="dxa" w:w="100"/>
+              <w:right w:type="dxa" w:w="120"/>
+            </w:tcMar>
+            <w:vAlign w:val="top"/>
+          </w:tcPr>
+          <w:p>
+            <w:r>
+              <w:rPr>
+                <w:b/>
+                <w:bCs/>
                 <w:color w:val="141414"/>
                 <w:sz w:val="20"/>
                 <w:szCs w:val="20"/>
@@ -1253,7 +1312,7 @@
         </w:tc>
         <w:tc>
           <w:tcPr>
-            <w:tcW w:type="dxa" w:w="4510"/>
+            <w:tcW w:type="dxa" w:w="5520"/>
             <w:shd w:fill="FBFAF6" w:val="clear"/>
             <w:tcMar>
               <w:top w:type="dxa" w:w="100"/>
@@ -1282,7 +1341,7 @@
       <w:pPr>
         <w:pStyle w:val="Heading1"/>
         <w:pBdr>
-          <w:bottom w:val="single" w:color="F6D649" w:sz="16" w:space="4"/>
+          <w:bottom w:val="single" w:color="F6D649" w:sz="8" w:space="4"/>
         </w:pBdr>
         <w:spacing w:after="200" w:before="420"/>
       </w:pPr>
@@ -1292,8 +1351,8 @@
           <w:b/>
           <w:bCs/>
           <w:color w:val="1D2B8F"/>
-          <w:sz w:val="30"/>
-          <w:szCs w:val="30"/>
+          <w:sz w:val="28"/>
+          <w:szCs w:val="28"/>
         </w:rPr>
         <w:t xml:space="preserve">2 · Los dos casos de uso</w:t>
       </w:r>
@@ -1301,16 +1360,16 @@
     <w:p>
       <w:pPr>
         <w:pStyle w:val="Heading2"/>
-        <w:spacing w:after="150" w:before="300"/>
+        <w:spacing w:after="140" w:before="280"/>
       </w:pPr>
       <w:r>
         <w:rPr>
           <w:rFonts w:ascii="Archivo" w:cs="Archivo" w:eastAsia="Archivo" w:hAnsi="Archivo"/>
           <w:b/>
           <w:bCs/>
-          <w:color w:val="B8322A"/>
-          <w:sz w:val="24"/>
-          <w:szCs w:val="24"/>
+          <w:color w:val="1D2B8F"/>
+          <w:sz w:val="22"/>
+          <w:szCs w:val="22"/>
         </w:rPr>
         <w:t xml:space="preserve">Caso de uso 1 — Marcar un item como "out" en Larder</w:t>
       </w:r>
@@ -1335,21 +1394,24 @@
         <w:tc>
           <w:tcPr>
             <w:tcW w:type="dxa" w:w="2000"/>
-            <w:shd w:fill="1D2B8F" w:val="clear"/>
-            <w:tcMar>
-              <w:top w:type="dxa" w:w="100"/>
-              <w:left w:type="dxa" w:w="120"/>
-              <w:bottom w:type="dxa" w:w="100"/>
-              <w:right w:type="dxa" w:w="120"/>
-            </w:tcMar>
-            <w:vAlign w:val="top"/>
-          </w:tcPr>
-          <w:p>
-            <w:r>
-              <w:rPr>
-                <w:b/>
-                <w:bCs/>
-                <w:color w:val="FFFFFF"/>
+            <w:tcBorders>
+              <w:bottom w:val="single" w:color="1D2B8F" w:sz="10"/>
+            </w:tcBorders>
+            <w:shd w:fill="E4DFD3" w:val="clear"/>
+            <w:tcMar>
+              <w:top w:type="dxa" w:w="100"/>
+              <w:left w:type="dxa" w:w="120"/>
+              <w:bottom w:type="dxa" w:w="100"/>
+              <w:right w:type="dxa" w:w="120"/>
+            </w:tcMar>
+            <w:vAlign w:val="top"/>
+          </w:tcPr>
+          <w:p>
+            <w:r>
+              <w:rPr>
+                <w:b/>
+                <w:bCs/>
+                <w:color w:val="141414"/>
                 <w:sz w:val="20"/>
                 <w:szCs w:val="20"/>
               </w:rPr>
@@ -1360,21 +1422,24 @@
         <w:tc>
           <w:tcPr>
             <w:tcW w:type="dxa" w:w="7020"/>
-            <w:shd w:fill="1D2B8F" w:val="clear"/>
-            <w:tcMar>
-              <w:top w:type="dxa" w:w="100"/>
-              <w:left w:type="dxa" w:w="120"/>
-              <w:bottom w:type="dxa" w:w="100"/>
-              <w:right w:type="dxa" w:w="120"/>
-            </w:tcMar>
-            <w:vAlign w:val="top"/>
-          </w:tcPr>
-          <w:p>
-            <w:r>
-              <w:rPr>
-                <w:b/>
-                <w:bCs/>
-                <w:color w:val="FFFFFF"/>
+            <w:tcBorders>
+              <w:bottom w:val="single" w:color="1D2B8F" w:sz="10"/>
+            </w:tcBorders>
+            <w:shd w:fill="E4DFD3" w:val="clear"/>
+            <w:tcMar>
+              <w:top w:type="dxa" w:w="100"/>
+              <w:left w:type="dxa" w:w="120"/>
+              <w:bottom w:type="dxa" w:w="100"/>
+              <w:right w:type="dxa" w:w="120"/>
+            </w:tcMar>
+            <w:vAlign w:val="top"/>
+          </w:tcPr>
+          <w:p>
+            <w:r>
+              <w:rPr>
+                <w:b/>
+                <w:bCs/>
+                <w:color w:val="141414"/>
                 <w:sz w:val="20"/>
                 <w:szCs w:val="20"/>
               </w:rPr>
@@ -1643,16 +1708,16 @@
     <w:p>
       <w:pPr>
         <w:pStyle w:val="Heading2"/>
-        <w:spacing w:after="150" w:before="300"/>
+        <w:spacing w:after="140" w:before="280"/>
       </w:pPr>
       <w:r>
         <w:rPr>
           <w:rFonts w:ascii="Archivo" w:cs="Archivo" w:eastAsia="Archivo" w:hAnsi="Archivo"/>
           <w:b/>
           <w:bCs/>
-          <w:color w:val="B8322A"/>
-          <w:sz w:val="24"/>
-          <w:szCs w:val="24"/>
+          <w:color w:val="1D2B8F"/>
+          <w:sz w:val="22"/>
+          <w:szCs w:val="22"/>
         </w:rPr>
         <w:t xml:space="preserve">Caso de uso 2 — Marcar como comprado un item dentro de List</w:t>
       </w:r>
@@ -1677,21 +1742,24 @@
         <w:tc>
           <w:tcPr>
             <w:tcW w:type="dxa" w:w="2000"/>
-            <w:shd w:fill="1D2B8F" w:val="clear"/>
-            <w:tcMar>
-              <w:top w:type="dxa" w:w="100"/>
-              <w:left w:type="dxa" w:w="120"/>
-              <w:bottom w:type="dxa" w:w="100"/>
-              <w:right w:type="dxa" w:w="120"/>
-            </w:tcMar>
-            <w:vAlign w:val="top"/>
-          </w:tcPr>
-          <w:p>
-            <w:r>
-              <w:rPr>
-                <w:b/>
-                <w:bCs/>
-                <w:color w:val="FFFFFF"/>
+            <w:tcBorders>
+              <w:bottom w:val="single" w:color="1D2B8F" w:sz="10"/>
+            </w:tcBorders>
+            <w:shd w:fill="E4DFD3" w:val="clear"/>
+            <w:tcMar>
+              <w:top w:type="dxa" w:w="100"/>
+              <w:left w:type="dxa" w:w="120"/>
+              <w:bottom w:type="dxa" w:w="100"/>
+              <w:right w:type="dxa" w:w="120"/>
+            </w:tcMar>
+            <w:vAlign w:val="top"/>
+          </w:tcPr>
+          <w:p>
+            <w:r>
+              <w:rPr>
+                <w:b/>
+                <w:bCs/>
+                <w:color w:val="141414"/>
                 <w:sz w:val="20"/>
                 <w:szCs w:val="20"/>
               </w:rPr>
@@ -1702,21 +1770,24 @@
         <w:tc>
           <w:tcPr>
             <w:tcW w:type="dxa" w:w="7020"/>
-            <w:shd w:fill="1D2B8F" w:val="clear"/>
-            <w:tcMar>
-              <w:top w:type="dxa" w:w="100"/>
-              <w:left w:type="dxa" w:w="120"/>
-              <w:bottom w:type="dxa" w:w="100"/>
-              <w:right w:type="dxa" w:w="120"/>
-            </w:tcMar>
-            <w:vAlign w:val="top"/>
-          </w:tcPr>
-          <w:p>
-            <w:r>
-              <w:rPr>
-                <w:b/>
-                <w:bCs/>
-                <w:color w:val="FFFFFF"/>
+            <w:tcBorders>
+              <w:bottom w:val="single" w:color="1D2B8F" w:sz="10"/>
+            </w:tcBorders>
+            <w:shd w:fill="E4DFD3" w:val="clear"/>
+            <w:tcMar>
+              <w:top w:type="dxa" w:w="100"/>
+              <w:left w:type="dxa" w:w="120"/>
+              <w:bottom w:type="dxa" w:w="100"/>
+              <w:right w:type="dxa" w:w="120"/>
+            </w:tcMar>
+            <w:vAlign w:val="top"/>
+          </w:tcPr>
+          <w:p>
+            <w:r>
+              <w:rPr>
+                <w:b/>
+                <w:bCs/>
+                <w:color w:val="141414"/>
                 <w:sz w:val="20"/>
                 <w:szCs w:val="20"/>
               </w:rPr>
@@ -1950,7 +2021,7 @@
       <w:pPr>
         <w:pStyle w:val="Heading1"/>
         <w:pBdr>
-          <w:bottom w:val="single" w:color="F6D649" w:sz="16" w:space="4"/>
+          <w:bottom w:val="single" w:color="F6D649" w:sz="8" w:space="4"/>
         </w:pBdr>
         <w:spacing w:after="200" w:before="420"/>
       </w:pPr>
@@ -1960,8 +2031,8 @@
           <w:b/>
           <w:bCs/>
           <w:color w:val="1D2B8F"/>
-          <w:sz w:val="30"/>
-          <w:szCs w:val="30"/>
+          <w:sz w:val="28"/>
+          <w:szCs w:val="28"/>
         </w:rPr>
         <w:t xml:space="preserve">3 · Delimitación con el ERP  (Sistemas de Xestión Empresarial)</w:t>
       </w:r>
@@ -1989,16 +2060,16 @@
     <w:p>
       <w:pPr>
         <w:pStyle w:val="Heading2"/>
-        <w:spacing w:after="150" w:before="300"/>
+        <w:spacing w:after="140" w:before="280"/>
       </w:pPr>
       <w:r>
         <w:rPr>
           <w:rFonts w:ascii="Archivo" w:cs="Archivo" w:eastAsia="Archivo" w:hAnsi="Archivo"/>
           <w:b/>
           <w:bCs/>
-          <w:color w:val="B8322A"/>
-          <w:sz w:val="24"/>
-          <w:szCs w:val="24"/>
+          <w:color w:val="1D2B8F"/>
+          <w:sz w:val="22"/>
+          <w:szCs w:val="22"/>
         </w:rPr>
         <w:t xml:space="preserve">Con Odoo</w:t>
       </w:r>
@@ -2023,21 +2094,24 @@
         <w:tc>
           <w:tcPr>
             <w:tcW w:type="dxa" w:w="3000"/>
-            <w:shd w:fill="1D2B8F" w:val="clear"/>
-            <w:tcMar>
-              <w:top w:type="dxa" w:w="100"/>
-              <w:left w:type="dxa" w:w="120"/>
-              <w:bottom w:type="dxa" w:w="100"/>
-              <w:right w:type="dxa" w:w="120"/>
-            </w:tcMar>
-            <w:vAlign w:val="top"/>
-          </w:tcPr>
-          <w:p>
-            <w:r>
-              <w:rPr>
-                <w:b/>
-                <w:bCs/>
-                <w:color w:val="FFFFFF"/>
+            <w:tcBorders>
+              <w:bottom w:val="single" w:color="1D2B8F" w:sz="10"/>
+            </w:tcBorders>
+            <w:shd w:fill="E4DFD3" w:val="clear"/>
+            <w:tcMar>
+              <w:top w:type="dxa" w:w="100"/>
+              <w:left w:type="dxa" w:w="120"/>
+              <w:bottom w:type="dxa" w:w="100"/>
+              <w:right w:type="dxa" w:w="120"/>
+            </w:tcMar>
+            <w:vAlign w:val="top"/>
+          </w:tcPr>
+          <w:p>
+            <w:r>
+              <w:rPr>
+                <w:b/>
+                <w:bCs/>
+                <w:color w:val="141414"/>
                 <w:sz w:val="20"/>
                 <w:szCs w:val="20"/>
               </w:rPr>
@@ -2048,21 +2122,24 @@
         <w:tc>
           <w:tcPr>
             <w:tcW w:type="dxa" w:w="6020"/>
-            <w:shd w:fill="1D2B8F" w:val="clear"/>
-            <w:tcMar>
-              <w:top w:type="dxa" w:w="100"/>
-              <w:left w:type="dxa" w:w="120"/>
-              <w:bottom w:type="dxa" w:w="100"/>
-              <w:right w:type="dxa" w:w="120"/>
-            </w:tcMar>
-            <w:vAlign w:val="top"/>
-          </w:tcPr>
-          <w:p>
-            <w:r>
-              <w:rPr>
-                <w:b/>
-                <w:bCs/>
-                <w:color w:val="FFFFFF"/>
+            <w:tcBorders>
+              <w:bottom w:val="single" w:color="1D2B8F" w:sz="10"/>
+            </w:tcBorders>
+            <w:shd w:fill="E4DFD3" w:val="clear"/>
+            <w:tcMar>
+              <w:top w:type="dxa" w:w="100"/>
+              <w:left w:type="dxa" w:w="120"/>
+              <w:bottom w:type="dxa" w:w="100"/>
+              <w:right w:type="dxa" w:w="120"/>
+            </w:tcMar>
+            <w:vAlign w:val="top"/>
+          </w:tcPr>
+          <w:p>
+            <w:r>
+              <w:rPr>
+                <w:b/>
+                <w:bCs/>
+                <w:color w:val="141414"/>
                 <w:sz w:val="20"/>
                 <w:szCs w:val="20"/>
               </w:rPr>
@@ -2227,7 +2304,7 @@
       <w:pPr>
         <w:pStyle w:val="Heading1"/>
         <w:pBdr>
-          <w:bottom w:val="single" w:color="F6D649" w:sz="16" w:space="4"/>
+          <w:bottom w:val="single" w:color="F6D649" w:sz="8" w:space="4"/>
         </w:pBdr>
         <w:spacing w:after="200" w:before="420"/>
       </w:pPr>
@@ -2237,8 +2314,8 @@
           <w:b/>
           <w:bCs/>
           <w:color w:val="1D2B8F"/>
-          <w:sz w:val="30"/>
-          <w:szCs w:val="30"/>
+          <w:sz w:val="28"/>
+          <w:szCs w:val="28"/>
         </w:rPr>
         <w:t xml:space="preserve">4 · La sección crítica  (Servicios y Procesos)</w:t>
       </w:r>
@@ -2263,21 +2340,24 @@
         <w:tc>
           <w:tcPr>
             <w:tcW w:type="dxa" w:w="2400"/>
-            <w:shd w:fill="1D2B8F" w:val="clear"/>
-            <w:tcMar>
-              <w:top w:type="dxa" w:w="100"/>
-              <w:left w:type="dxa" w:w="120"/>
-              <w:bottom w:type="dxa" w:w="100"/>
-              <w:right w:type="dxa" w:w="120"/>
-            </w:tcMar>
-            <w:vAlign w:val="top"/>
-          </w:tcPr>
-          <w:p>
-            <w:r>
-              <w:rPr>
-                <w:b/>
-                <w:bCs/>
-                <w:color w:val="FFFFFF"/>
+            <w:tcBorders>
+              <w:bottom w:val="single" w:color="1D2B8F" w:sz="10"/>
+            </w:tcBorders>
+            <w:shd w:fill="E4DFD3" w:val="clear"/>
+            <w:tcMar>
+              <w:top w:type="dxa" w:w="100"/>
+              <w:left w:type="dxa" w:w="120"/>
+              <w:bottom w:type="dxa" w:w="100"/>
+              <w:right w:type="dxa" w:w="120"/>
+            </w:tcMar>
+            <w:vAlign w:val="top"/>
+          </w:tcPr>
+          <w:p>
+            <w:r>
+              <w:rPr>
+                <w:b/>
+                <w:bCs/>
+                <w:color w:val="141414"/>
                 <w:sz w:val="20"/>
                 <w:szCs w:val="20"/>
               </w:rPr>
@@ -2288,21 +2368,24 @@
         <w:tc>
           <w:tcPr>
             <w:tcW w:type="dxa" w:w="6620"/>
-            <w:shd w:fill="1D2B8F" w:val="clear"/>
-            <w:tcMar>
-              <w:top w:type="dxa" w:w="100"/>
-              <w:left w:type="dxa" w:w="120"/>
-              <w:bottom w:type="dxa" w:w="100"/>
-              <w:right w:type="dxa" w:w="120"/>
-            </w:tcMar>
-            <w:vAlign w:val="top"/>
-          </w:tcPr>
-          <w:p>
-            <w:r>
-              <w:rPr>
-                <w:b/>
-                <w:bCs/>
-                <w:color w:val="FFFFFF"/>
+            <w:tcBorders>
+              <w:bottom w:val="single" w:color="1D2B8F" w:sz="10"/>
+            </w:tcBorders>
+            <w:shd w:fill="E4DFD3" w:val="clear"/>
+            <w:tcMar>
+              <w:top w:type="dxa" w:w="100"/>
+              <w:left w:type="dxa" w:w="120"/>
+              <w:bottom w:type="dxa" w:w="100"/>
+              <w:right w:type="dxa" w:w="120"/>
+            </w:tcMar>
+            <w:vAlign w:val="top"/>
+          </w:tcPr>
+          <w:p>
+            <w:r>
+              <w:rPr>
+                <w:b/>
+                <w:bCs/>
+                <w:color w:val="141414"/>
                 <w:sz w:val="20"/>
                 <w:szCs w:val="20"/>
               </w:rPr>
@@ -2535,16 +2618,16 @@
     <w:p>
       <w:pPr>
         <w:pStyle w:val="Heading2"/>
-        <w:spacing w:after="150" w:before="300"/>
+        <w:spacing w:after="140" w:before="280"/>
       </w:pPr>
       <w:r>
         <w:rPr>
           <w:rFonts w:ascii="Archivo" w:cs="Archivo" w:eastAsia="Archivo" w:hAnsi="Archivo"/>
           <w:b/>
           <w:bCs/>
-          <w:color w:val="B8322A"/>
-          <w:sz w:val="24"/>
-          <w:szCs w:val="24"/>
+          <w:color w:val="1D2B8F"/>
+          <w:sz w:val="22"/>
+          <w:szCs w:val="22"/>
         </w:rPr>
         <w:t xml:space="preserve">La tarea en segundo plano</w:t>
       </w:r>
@@ -2624,7 +2707,7 @@
       <w:pPr>
         <w:pStyle w:val="Heading1"/>
         <w:pBdr>
-          <w:bottom w:val="single" w:color="F6D649" w:sz="16" w:space="4"/>
+          <w:bottom w:val="single" w:color="F6D649" w:sz="8" w:space="4"/>
         </w:pBdr>
         <w:spacing w:after="200" w:before="420"/>
       </w:pPr>
@@ -2634,8 +2717,8 @@
           <w:b/>
           <w:bCs/>
           <w:color w:val="1D2B8F"/>
-          <w:sz w:val="30"/>
-          <w:szCs w:val="30"/>
+          <w:sz w:val="28"/>
+          <w:szCs w:val="28"/>
         </w:rPr>
         <w:t xml:space="preserve">5 · Modelo de datos e integraciones  (Acceso a Datos)</w:t>
       </w:r>
@@ -2643,16 +2726,16 @@
     <w:p>
       <w:pPr>
         <w:pStyle w:val="Heading2"/>
-        <w:spacing w:after="150" w:before="300"/>
+        <w:spacing w:after="140" w:before="280"/>
       </w:pPr>
       <w:r>
         <w:rPr>
           <w:rFonts w:ascii="Archivo" w:cs="Archivo" w:eastAsia="Archivo" w:hAnsi="Archivo"/>
           <w:b/>
           <w:bCs/>
-          <w:color w:val="B8322A"/>
-          <w:sz w:val="24"/>
-          <w:szCs w:val="24"/>
+          <w:color w:val="1D2B8F"/>
+          <w:sz w:val="22"/>
+          <w:szCs w:val="22"/>
         </w:rPr>
         <w:t xml:space="preserve">Entidades</w:t>
       </w:r>
@@ -2744,16 +2827,16 @@
     <w:p>
       <w:pPr>
         <w:pStyle w:val="Heading2"/>
-        <w:spacing w:after="150" w:before="300"/>
+        <w:spacing w:after="140" w:before="280"/>
       </w:pPr>
       <w:r>
         <w:rPr>
           <w:rFonts w:ascii="Archivo" w:cs="Archivo" w:eastAsia="Archivo" w:hAnsi="Archivo"/>
           <w:b/>
           <w:bCs/>
-          <w:color w:val="B8322A"/>
-          <w:sz w:val="24"/>
-          <w:szCs w:val="24"/>
+          <w:color w:val="1D2B8F"/>
+          <w:sz w:val="22"/>
+          <w:szCs w:val="22"/>
         </w:rPr>
         <w:t xml:space="preserve">Relaciones</w:t>
       </w:r>
@@ -2817,16 +2900,16 @@
     <w:p>
       <w:pPr>
         <w:pStyle w:val="Heading2"/>
-        <w:spacing w:after="150" w:before="300"/>
+        <w:spacing w:after="140" w:before="280"/>
       </w:pPr>
       <w:r>
         <w:rPr>
           <w:rFonts w:ascii="Archivo" w:cs="Archivo" w:eastAsia="Archivo" w:hAnsi="Archivo"/>
           <w:b/>
           <w:bCs/>
-          <w:color w:val="B8322A"/>
-          <w:sz w:val="24"/>
-          <w:szCs w:val="24"/>
+          <w:color w:val="1D2B8F"/>
+          <w:sz w:val="22"/>
+          <w:szCs w:val="22"/>
         </w:rPr>
         <w:t xml:space="preserve">Claves</w:t>
       </w:r>
@@ -2862,16 +2945,16 @@
     <w:p>
       <w:pPr>
         <w:pStyle w:val="Heading2"/>
-        <w:spacing w:after="150" w:before="300"/>
+        <w:spacing w:after="140" w:before="280"/>
       </w:pPr>
       <w:r>
         <w:rPr>
           <w:rFonts w:ascii="Archivo" w:cs="Archivo" w:eastAsia="Archivo" w:hAnsi="Archivo"/>
           <w:b/>
           <w:bCs/>
-          <w:color w:val="B8322A"/>
-          <w:sz w:val="24"/>
-          <w:szCs w:val="24"/>
+          <w:color w:val="1D2B8F"/>
+          <w:sz w:val="22"/>
+          <w:szCs w:val="22"/>
         </w:rPr>
         <w:t xml:space="preserve">Operaciones por caso de uso</w:t>
       </w:r>
@@ -2896,21 +2979,24 @@
         <w:tc>
           <w:tcPr>
             <w:tcW w:type="dxa" w:w="2400"/>
-            <w:shd w:fill="1D2B8F" w:val="clear"/>
-            <w:tcMar>
-              <w:top w:type="dxa" w:w="100"/>
-              <w:left w:type="dxa" w:w="120"/>
-              <w:bottom w:type="dxa" w:w="100"/>
-              <w:right w:type="dxa" w:w="120"/>
-            </w:tcMar>
-            <w:vAlign w:val="top"/>
-          </w:tcPr>
-          <w:p>
-            <w:r>
-              <w:rPr>
-                <w:b/>
-                <w:bCs/>
-                <w:color w:val="FFFFFF"/>
+            <w:tcBorders>
+              <w:bottom w:val="single" w:color="1D2B8F" w:sz="10"/>
+            </w:tcBorders>
+            <w:shd w:fill="E4DFD3" w:val="clear"/>
+            <w:tcMar>
+              <w:top w:type="dxa" w:w="100"/>
+              <w:left w:type="dxa" w:w="120"/>
+              <w:bottom w:type="dxa" w:w="100"/>
+              <w:right w:type="dxa" w:w="120"/>
+            </w:tcMar>
+            <w:vAlign w:val="top"/>
+          </w:tcPr>
+          <w:p>
+            <w:r>
+              <w:rPr>
+                <w:b/>
+                <w:bCs/>
+                <w:color w:val="141414"/>
                 <w:sz w:val="20"/>
                 <w:szCs w:val="20"/>
               </w:rPr>
@@ -2921,21 +3007,24 @@
         <w:tc>
           <w:tcPr>
             <w:tcW w:type="dxa" w:w="6620"/>
-            <w:shd w:fill="1D2B8F" w:val="clear"/>
-            <w:tcMar>
-              <w:top w:type="dxa" w:w="100"/>
-              <w:left w:type="dxa" w:w="120"/>
-              <w:bottom w:type="dxa" w:w="100"/>
-              <w:right w:type="dxa" w:w="120"/>
-            </w:tcMar>
-            <w:vAlign w:val="top"/>
-          </w:tcPr>
-          <w:p>
-            <w:r>
-              <w:rPr>
-                <w:b/>
-                <w:bCs/>
-                <w:color w:val="FFFFFF"/>
+            <w:tcBorders>
+              <w:bottom w:val="single" w:color="1D2B8F" w:sz="10"/>
+            </w:tcBorders>
+            <w:shd w:fill="E4DFD3" w:val="clear"/>
+            <w:tcMar>
+              <w:top w:type="dxa" w:w="100"/>
+              <w:left w:type="dxa" w:w="120"/>
+              <w:bottom w:type="dxa" w:w="100"/>
+              <w:right w:type="dxa" w:w="120"/>
+            </w:tcMar>
+            <w:vAlign w:val="top"/>
+          </w:tcPr>
+          <w:p>
+            <w:r>
+              <w:rPr>
+                <w:b/>
+                <w:bCs/>
+                <w:color w:val="141414"/>
                 <w:sz w:val="20"/>
                 <w:szCs w:val="20"/>
               </w:rPr>
@@ -3052,16 +3141,16 @@
     <w:p>
       <w:pPr>
         <w:pStyle w:val="Heading2"/>
-        <w:spacing w:after="150" w:before="300"/>
+        <w:spacing w:after="140" w:before="280"/>
       </w:pPr>
       <w:r>
         <w:rPr>
           <w:rFonts w:ascii="Archivo" w:cs="Archivo" w:eastAsia="Archivo" w:hAnsi="Archivo"/>
           <w:b/>
           <w:bCs/>
-          <w:color w:val="B8322A"/>
-          <w:sz w:val="24"/>
-          <w:szCs w:val="24"/>
+          <w:color w:val="1D2B8F"/>
+          <w:sz w:val="22"/>
+          <w:szCs w:val="22"/>
         </w:rPr>
         <w:t xml:space="preserve">Las integraciones</w:t>
       </w:r>
@@ -3088,21 +3177,24 @@
         <w:tc>
           <w:tcPr>
             <w:tcW w:type="dxa" w:w="2000"/>
-            <w:shd w:fill="1D2B8F" w:val="clear"/>
-            <w:tcMar>
-              <w:top w:type="dxa" w:w="100"/>
-              <w:left w:type="dxa" w:w="120"/>
-              <w:bottom w:type="dxa" w:w="100"/>
-              <w:right w:type="dxa" w:w="120"/>
-            </w:tcMar>
-            <w:vAlign w:val="top"/>
-          </w:tcPr>
-          <w:p>
-            <w:r>
-              <w:rPr>
-                <w:b/>
-                <w:bCs/>
-                <w:color w:val="FFFFFF"/>
+            <w:tcBorders>
+              <w:bottom w:val="single" w:color="1D2B8F" w:sz="10"/>
+            </w:tcBorders>
+            <w:shd w:fill="E4DFD3" w:val="clear"/>
+            <w:tcMar>
+              <w:top w:type="dxa" w:w="100"/>
+              <w:left w:type="dxa" w:w="120"/>
+              <w:bottom w:type="dxa" w:w="100"/>
+              <w:right w:type="dxa" w:w="120"/>
+            </w:tcMar>
+            <w:vAlign w:val="top"/>
+          </w:tcPr>
+          <w:p>
+            <w:r>
+              <w:rPr>
+                <w:b/>
+                <w:bCs/>
+                <w:color w:val="141414"/>
                 <w:sz w:val="20"/>
                 <w:szCs w:val="20"/>
               </w:rPr>
@@ -3113,21 +3205,24 @@
         <w:tc>
           <w:tcPr>
             <w:tcW w:type="dxa" w:w="2000"/>
-            <w:shd w:fill="1D2B8F" w:val="clear"/>
-            <w:tcMar>
-              <w:top w:type="dxa" w:w="100"/>
-              <w:left w:type="dxa" w:w="120"/>
-              <w:bottom w:type="dxa" w:w="100"/>
-              <w:right w:type="dxa" w:w="120"/>
-            </w:tcMar>
-            <w:vAlign w:val="top"/>
-          </w:tcPr>
-          <w:p>
-            <w:r>
-              <w:rPr>
-                <w:b/>
-                <w:bCs/>
-                <w:color w:val="FFFFFF"/>
+            <w:tcBorders>
+              <w:bottom w:val="single" w:color="1D2B8F" w:sz="10"/>
+            </w:tcBorders>
+            <w:shd w:fill="E4DFD3" w:val="clear"/>
+            <w:tcMar>
+              <w:top w:type="dxa" w:w="100"/>
+              <w:left w:type="dxa" w:w="120"/>
+              <w:bottom w:type="dxa" w:w="100"/>
+              <w:right w:type="dxa" w:w="120"/>
+            </w:tcMar>
+            <w:vAlign w:val="top"/>
+          </w:tcPr>
+          <w:p>
+            <w:r>
+              <w:rPr>
+                <w:b/>
+                <w:bCs/>
+                <w:color w:val="141414"/>
                 <w:sz w:val="20"/>
                 <w:szCs w:val="20"/>
               </w:rPr>
@@ -3138,21 +3233,24 @@
         <w:tc>
           <w:tcPr>
             <w:tcW w:type="dxa" w:w="3120"/>
-            <w:shd w:fill="1D2B8F" w:val="clear"/>
-            <w:tcMar>
-              <w:top w:type="dxa" w:w="100"/>
-              <w:left w:type="dxa" w:w="120"/>
-              <w:bottom w:type="dxa" w:w="100"/>
-              <w:right w:type="dxa" w:w="120"/>
-            </w:tcMar>
-            <w:vAlign w:val="top"/>
-          </w:tcPr>
-          <w:p>
-            <w:r>
-              <w:rPr>
-                <w:b/>
-                <w:bCs/>
-                <w:color w:val="FFFFFF"/>
+            <w:tcBorders>
+              <w:bottom w:val="single" w:color="1D2B8F" w:sz="10"/>
+            </w:tcBorders>
+            <w:shd w:fill="E4DFD3" w:val="clear"/>
+            <w:tcMar>
+              <w:top w:type="dxa" w:w="100"/>
+              <w:left w:type="dxa" w:w="120"/>
+              <w:bottom w:type="dxa" w:w="100"/>
+              <w:right w:type="dxa" w:w="120"/>
+            </w:tcMar>
+            <w:vAlign w:val="top"/>
+          </w:tcPr>
+          <w:p>
+            <w:r>
+              <w:rPr>
+                <w:b/>
+                <w:bCs/>
+                <w:color w:val="141414"/>
                 <w:sz w:val="20"/>
                 <w:szCs w:val="20"/>
               </w:rPr>
@@ -3163,21 +3261,24 @@
         <w:tc>
           <w:tcPr>
             <w:tcW w:type="dxa" w:w="1900"/>
-            <w:shd w:fill="1D2B8F" w:val="clear"/>
-            <w:tcMar>
-              <w:top w:type="dxa" w:w="100"/>
-              <w:left w:type="dxa" w:w="120"/>
-              <w:bottom w:type="dxa" w:w="100"/>
-              <w:right w:type="dxa" w:w="120"/>
-            </w:tcMar>
-            <w:vAlign w:val="top"/>
-          </w:tcPr>
-          <w:p>
-            <w:r>
-              <w:rPr>
-                <w:b/>
-                <w:bCs/>
-                <w:color w:val="FFFFFF"/>
+            <w:tcBorders>
+              <w:bottom w:val="single" w:color="1D2B8F" w:sz="10"/>
+            </w:tcBorders>
+            <w:shd w:fill="E4DFD3" w:val="clear"/>
+            <w:tcMar>
+              <w:top w:type="dxa" w:w="100"/>
+              <w:left w:type="dxa" w:w="120"/>
+              <w:bottom w:type="dxa" w:w="100"/>
+              <w:right w:type="dxa" w:w="120"/>
+            </w:tcMar>
+            <w:vAlign w:val="top"/>
+          </w:tcPr>
+          <w:p>
+            <w:r>
+              <w:rPr>
+                <w:b/>
+                <w:bCs/>
+                <w:color w:val="141414"/>
                 <w:sz w:val="20"/>
                 <w:szCs w:val="20"/>
               </w:rPr>
@@ -3844,7 +3945,7 @@
       <w:pPr>
         <w:pStyle w:val="Heading1"/>
         <w:pBdr>
-          <w:bottom w:val="single" w:color="F6D649" w:sz="16" w:space="4"/>
+          <w:bottom w:val="single" w:color="F6D649" w:sz="8" w:space="4"/>
         </w:pBdr>
         <w:spacing w:after="200" w:before="420"/>
       </w:pPr>
@@ -3854,8 +3955,8 @@
           <w:b/>
           <w:bCs/>
           <w:color w:val="1D2B8F"/>
-          <w:sz w:val="30"/>
-          <w:szCs w:val="30"/>
+          <w:sz w:val="28"/>
+          <w:szCs w:val="28"/>
         </w:rPr>
         <w:t xml:space="preserve">6 · Las pantallas  (Multimedia y Dispositivos Móviles)</w:t>
       </w:r>
@@ -3863,16 +3964,16 @@
     <w:p>
       <w:pPr>
         <w:pStyle w:val="Heading2"/>
-        <w:spacing w:after="150" w:before="300"/>
+        <w:spacing w:after="140" w:before="280"/>
       </w:pPr>
       <w:r>
         <w:rPr>
           <w:rFonts w:ascii="Archivo" w:cs="Archivo" w:eastAsia="Archivo" w:hAnsi="Archivo"/>
           <w:b/>
           <w:bCs/>
-          <w:color w:val="B8322A"/>
-          <w:sz w:val="24"/>
-          <w:szCs w:val="24"/>
+          <w:color w:val="1D2B8F"/>
+          <w:sz w:val="22"/>
+          <w:szCs w:val="22"/>
         </w:rPr>
         <w:t xml:space="preserve">Mapa de navegación</w:t>
       </w:r>
@@ -3893,16 +3994,16 @@
     <w:p>
       <w:pPr>
         <w:pStyle w:val="Heading2"/>
-        <w:spacing w:after="150" w:before="300"/>
+        <w:spacing w:after="140" w:before="280"/>
       </w:pPr>
       <w:r>
         <w:rPr>
           <w:rFonts w:ascii="Archivo" w:cs="Archivo" w:eastAsia="Archivo" w:hAnsi="Archivo"/>
           <w:b/>
           <w:bCs/>
-          <w:color w:val="B8322A"/>
-          <w:sz w:val="24"/>
-          <w:szCs w:val="24"/>
+          <w:color w:val="1D2B8F"/>
+          <w:sz w:val="22"/>
+          <w:szCs w:val="22"/>
         </w:rPr>
         <w:t xml:space="preserve">Wireframe de la pantalla clave (Larder)</w:t>
       </w:r>
@@ -3923,16 +4024,16 @@
     <w:p>
       <w:pPr>
         <w:pStyle w:val="Heading2"/>
-        <w:spacing w:after="150" w:before="300"/>
+        <w:spacing w:after="140" w:before="280"/>
       </w:pPr>
       <w:r>
         <w:rPr>
           <w:rFonts w:ascii="Archivo" w:cs="Archivo" w:eastAsia="Archivo" w:hAnsi="Archivo"/>
           <w:b/>
           <w:bCs/>
-          <w:color w:val="B8322A"/>
-          <w:sz w:val="24"/>
-          <w:szCs w:val="24"/>
+          <w:color w:val="1D2B8F"/>
+          <w:sz w:val="22"/>
+          <w:szCs w:val="22"/>
         </w:rPr>
         <w:t xml:space="preserve">Los tres estados de cada pantalla</w:t>
       </w:r>
@@ -3957,21 +4058,24 @@
         <w:tc>
           <w:tcPr>
             <w:tcW w:type="dxa" w:w="2400"/>
-            <w:shd w:fill="1D2B8F" w:val="clear"/>
-            <w:tcMar>
-              <w:top w:type="dxa" w:w="100"/>
-              <w:left w:type="dxa" w:w="120"/>
-              <w:bottom w:type="dxa" w:w="100"/>
-              <w:right w:type="dxa" w:w="120"/>
-            </w:tcMar>
-            <w:vAlign w:val="top"/>
-          </w:tcPr>
-          <w:p>
-            <w:r>
-              <w:rPr>
-                <w:b/>
-                <w:bCs/>
-                <w:color w:val="FFFFFF"/>
+            <w:tcBorders>
+              <w:bottom w:val="single" w:color="1D2B8F" w:sz="10"/>
+            </w:tcBorders>
+            <w:shd w:fill="E4DFD3" w:val="clear"/>
+            <w:tcMar>
+              <w:top w:type="dxa" w:w="100"/>
+              <w:left w:type="dxa" w:w="120"/>
+              <w:bottom w:type="dxa" w:w="100"/>
+              <w:right w:type="dxa" w:w="120"/>
+            </w:tcMar>
+            <w:vAlign w:val="top"/>
+          </w:tcPr>
+          <w:p>
+            <w:r>
+              <w:rPr>
+                <w:b/>
+                <w:bCs/>
+                <w:color w:val="141414"/>
                 <w:sz w:val="20"/>
                 <w:szCs w:val="20"/>
               </w:rPr>
@@ -3982,21 +4086,24 @@
         <w:tc>
           <w:tcPr>
             <w:tcW w:type="dxa" w:w="6620"/>
-            <w:shd w:fill="1D2B8F" w:val="clear"/>
-            <w:tcMar>
-              <w:top w:type="dxa" w:w="100"/>
-              <w:left w:type="dxa" w:w="120"/>
-              <w:bottom w:type="dxa" w:w="100"/>
-              <w:right w:type="dxa" w:w="120"/>
-            </w:tcMar>
-            <w:vAlign w:val="top"/>
-          </w:tcPr>
-          <w:p>
-            <w:r>
-              <w:rPr>
-                <w:b/>
-                <w:bCs/>
-                <w:color w:val="FFFFFF"/>
+            <w:tcBorders>
+              <w:bottom w:val="single" w:color="1D2B8F" w:sz="10"/>
+            </w:tcBorders>
+            <w:shd w:fill="E4DFD3" w:val="clear"/>
+            <w:tcMar>
+              <w:top w:type="dxa" w:w="100"/>
+              <w:left w:type="dxa" w:w="120"/>
+              <w:bottom w:type="dxa" w:w="100"/>
+              <w:right w:type="dxa" w:w="120"/>
+            </w:tcMar>
+            <w:vAlign w:val="top"/>
+          </w:tcPr>
+          <w:p>
+            <w:r>
+              <w:rPr>
+                <w:b/>
+                <w:bCs/>
+                <w:color w:val="141414"/>
                 <w:sz w:val="20"/>
                 <w:szCs w:val="20"/>
               </w:rPr>
@@ -4165,16 +4272,16 @@
     <w:p>
       <w:pPr>
         <w:pStyle w:val="Heading2"/>
-        <w:spacing w:after="150" w:before="300"/>
+        <w:spacing w:after="140" w:before="280"/>
       </w:pPr>
       <w:r>
         <w:rPr>
           <w:rFonts w:ascii="Archivo" w:cs="Archivo" w:eastAsia="Archivo" w:hAnsi="Archivo"/>
           <w:b/>
           <w:bCs/>
-          <w:color w:val="B8322A"/>
-          <w:sz w:val="24"/>
-          <w:szCs w:val="24"/>
+          <w:color w:val="1D2B8F"/>
+          <w:sz w:val="22"/>
+          <w:szCs w:val="22"/>
         </w:rPr>
         <w:t xml:space="preserve">Componentes repetidos (mínimo 3)</w:t>
       </w:r>
@@ -4238,16 +4345,16 @@
     <w:p>
       <w:pPr>
         <w:pStyle w:val="Heading2"/>
-        <w:spacing w:after="150" w:before="300"/>
+        <w:spacing w:after="140" w:before="280"/>
       </w:pPr>
       <w:r>
         <w:rPr>
           <w:rFonts w:ascii="Archivo" w:cs="Archivo" w:eastAsia="Archivo" w:hAnsi="Archivo"/>
           <w:b/>
           <w:bCs/>
-          <w:color w:val="B8322A"/>
-          <w:sz w:val="24"/>
-          <w:szCs w:val="24"/>
+          <w:color w:val="1D2B8F"/>
+          <w:sz w:val="22"/>
+          <w:szCs w:val="22"/>
         </w:rPr>
         <w:t xml:space="preserve">La pantalla que va a React Native</w:t>
       </w:r>
@@ -4272,21 +4379,24 @@
         <w:tc>
           <w:tcPr>
             <w:tcW w:type="dxa" w:w="2400"/>
-            <w:shd w:fill="1D2B8F" w:val="clear"/>
-            <w:tcMar>
-              <w:top w:type="dxa" w:w="100"/>
-              <w:left w:type="dxa" w:w="120"/>
-              <w:bottom w:type="dxa" w:w="100"/>
-              <w:right w:type="dxa" w:w="120"/>
-            </w:tcMar>
-            <w:vAlign w:val="top"/>
-          </w:tcPr>
-          <w:p>
-            <w:r>
-              <w:rPr>
-                <w:b/>
-                <w:bCs/>
-                <w:color w:val="FFFFFF"/>
+            <w:tcBorders>
+              <w:bottom w:val="single" w:color="1D2B8F" w:sz="10"/>
+            </w:tcBorders>
+            <w:shd w:fill="E4DFD3" w:val="clear"/>
+            <w:tcMar>
+              <w:top w:type="dxa" w:w="100"/>
+              <w:left w:type="dxa" w:w="120"/>
+              <w:bottom w:type="dxa" w:w="100"/>
+              <w:right w:type="dxa" w:w="120"/>
+            </w:tcMar>
+            <w:vAlign w:val="top"/>
+          </w:tcPr>
+          <w:p>
+            <w:r>
+              <w:rPr>
+                <w:b/>
+                <w:bCs/>
+                <w:color w:val="141414"/>
                 <w:sz w:val="20"/>
                 <w:szCs w:val="20"/>
               </w:rPr>
@@ -4297,21 +4407,24 @@
         <w:tc>
           <w:tcPr>
             <w:tcW w:type="dxa" w:w="6620"/>
-            <w:shd w:fill="1D2B8F" w:val="clear"/>
-            <w:tcMar>
-              <w:top w:type="dxa" w:w="100"/>
-              <w:left w:type="dxa" w:w="120"/>
-              <w:bottom w:type="dxa" w:w="100"/>
-              <w:right w:type="dxa" w:w="120"/>
-            </w:tcMar>
-            <w:vAlign w:val="top"/>
-          </w:tcPr>
-          <w:p>
-            <w:r>
-              <w:rPr>
-                <w:b/>
-                <w:bCs/>
-                <w:color w:val="FFFFFF"/>
+            <w:tcBorders>
+              <w:bottom w:val="single" w:color="1D2B8F" w:sz="10"/>
+            </w:tcBorders>
+            <w:shd w:fill="E4DFD3" w:val="clear"/>
+            <w:tcMar>
+              <w:top w:type="dxa" w:w="100"/>
+              <w:left w:type="dxa" w:w="120"/>
+              <w:bottom w:type="dxa" w:w="100"/>
+              <w:right w:type="dxa" w:w="120"/>
+            </w:tcMar>
+            <w:vAlign w:val="top"/>
+          </w:tcPr>
+          <w:p>
+            <w:r>
+              <w:rPr>
+                <w:b/>
+                <w:bCs/>
+                <w:color w:val="141414"/>
                 <w:sz w:val="20"/>
                 <w:szCs w:val="20"/>
               </w:rPr>

</xml_diff>